<commit_message>
update: imagens da aplicação e sumário
</commit_message>
<xml_diff>
--- a/DayPlannio.docx
+++ b/DayPlannio.docx
@@ -948,6 +948,8 @@
         </w:rPr>
       </w:pPr>
     </w:p>
+    <w:bookmarkStart w:id="0" w:name="_GoBack"/>
+    <w:bookmarkEnd w:id="0"/>
     <w:p>
       <w:pPr>
         <w:pStyle w:val="ndicedeilustraes"/>
@@ -988,7 +990,7 @@
         </w:rPr>
         <w:fldChar w:fldCharType="separate"/>
       </w:r>
-      <w:hyperlink w:anchor="_Toc230777428" w:history="1">
+      <w:hyperlink w:anchor="_Toc230777801" w:history="1">
         <w:r>
           <w:rPr>
             <w:rStyle w:val="Hyperlink"/>
@@ -1015,7 +1017,7 @@
             <w:noProof/>
             <w:webHidden/>
           </w:rPr>
-          <w:instrText xml:space="preserve"> PAGEREF _Toc230777428 \h </w:instrText>
+          <w:instrText xml:space="preserve"> PAGEREF _Toc230777801 \h </w:instrText>
         </w:r>
         <w:r>
           <w:rPr>
@@ -1059,7 +1061,7 @@
           <w:szCs w:val="22"/>
         </w:rPr>
       </w:pPr>
-      <w:hyperlink w:anchor="_Toc230777429" w:history="1">
+      <w:hyperlink w:anchor="_Toc230777802" w:history="1">
         <w:r>
           <w:rPr>
             <w:rStyle w:val="Hyperlink"/>
@@ -1086,7 +1088,7 @@
             <w:noProof/>
             <w:webHidden/>
           </w:rPr>
-          <w:instrText xml:space="preserve"> PAGEREF _Toc230777429 \h </w:instrText>
+          <w:instrText xml:space="preserve"> PAGEREF _Toc230777802 \h </w:instrText>
         </w:r>
         <w:r>
           <w:rPr>
@@ -1130,7 +1132,7 @@
           <w:szCs w:val="22"/>
         </w:rPr>
       </w:pPr>
-      <w:hyperlink w:anchor="_Toc230777430" w:history="1">
+      <w:hyperlink w:anchor="_Toc230777803" w:history="1">
         <w:r>
           <w:rPr>
             <w:rStyle w:val="Hyperlink"/>
@@ -1157,7 +1159,7 @@
             <w:noProof/>
             <w:webHidden/>
           </w:rPr>
-          <w:instrText xml:space="preserve"> PAGEREF _Toc230777430 \h </w:instrText>
+          <w:instrText xml:space="preserve"> PAGEREF _Toc230777803 \h </w:instrText>
         </w:r>
         <w:r>
           <w:rPr>
@@ -1201,7 +1203,7 @@
           <w:szCs w:val="22"/>
         </w:rPr>
       </w:pPr>
-      <w:hyperlink w:anchor="_Toc230777431" w:history="1">
+      <w:hyperlink w:anchor="_Toc230777804" w:history="1">
         <w:r>
           <w:rPr>
             <w:rStyle w:val="Hyperlink"/>
@@ -1228,7 +1230,7 @@
             <w:noProof/>
             <w:webHidden/>
           </w:rPr>
-          <w:instrText xml:space="preserve"> PAGEREF _Toc230777431 \h </w:instrText>
+          <w:instrText xml:space="preserve"> PAGEREF _Toc230777804 \h </w:instrText>
         </w:r>
         <w:r>
           <w:rPr>
@@ -1272,7 +1274,7 @@
           <w:szCs w:val="22"/>
         </w:rPr>
       </w:pPr>
-      <w:hyperlink w:anchor="_Toc230777432" w:history="1">
+      <w:hyperlink w:anchor="_Toc230777805" w:history="1">
         <w:r>
           <w:rPr>
             <w:rStyle w:val="Hyperlink"/>
@@ -1300,7 +1302,7 @@
             <w:noProof/>
             <w:webHidden/>
           </w:rPr>
-          <w:instrText xml:space="preserve"> PAGEREF _Toc230777432 \h </w:instrText>
+          <w:instrText xml:space="preserve"> PAGEREF _Toc230777805 \h </w:instrText>
         </w:r>
         <w:r>
           <w:rPr>
@@ -1344,7 +1346,7 @@
           <w:szCs w:val="22"/>
         </w:rPr>
       </w:pPr>
-      <w:hyperlink w:anchor="_Toc230777433" w:history="1">
+      <w:hyperlink w:anchor="_Toc230777806" w:history="1">
         <w:r>
           <w:rPr>
             <w:rStyle w:val="Hyperlink"/>
@@ -1371,7 +1373,7 @@
             <w:noProof/>
             <w:webHidden/>
           </w:rPr>
-          <w:instrText xml:space="preserve"> PAGEREF _Toc230777433 \h </w:instrText>
+          <w:instrText xml:space="preserve"> PAGEREF _Toc230777806 \h </w:instrText>
         </w:r>
         <w:r>
           <w:rPr>
@@ -1415,7 +1417,7 @@
           <w:szCs w:val="22"/>
         </w:rPr>
       </w:pPr>
-      <w:hyperlink w:anchor="_Toc230777434" w:history="1">
+      <w:hyperlink w:anchor="_Toc230777807" w:history="1">
         <w:r>
           <w:rPr>
             <w:rStyle w:val="Hyperlink"/>
@@ -1442,7 +1444,7 @@
             <w:noProof/>
             <w:webHidden/>
           </w:rPr>
-          <w:instrText xml:space="preserve"> PAGEREF _Toc230777434 \h </w:instrText>
+          <w:instrText xml:space="preserve"> PAGEREF _Toc230777807 \h </w:instrText>
         </w:r>
         <w:r>
           <w:rPr>
@@ -1486,7 +1488,7 @@
           <w:szCs w:val="22"/>
         </w:rPr>
       </w:pPr>
-      <w:hyperlink w:anchor="_Toc230777435" w:history="1">
+      <w:hyperlink w:anchor="_Toc230777808" w:history="1">
         <w:r>
           <w:rPr>
             <w:rStyle w:val="Hyperlink"/>
@@ -1513,7 +1515,7 @@
             <w:noProof/>
             <w:webHidden/>
           </w:rPr>
-          <w:instrText xml:space="preserve"> PAGEREF _Toc230777435 \h </w:instrText>
+          <w:instrText xml:space="preserve"> PAGEREF _Toc230777808 \h </w:instrText>
         </w:r>
         <w:r>
           <w:rPr>
@@ -1557,7 +1559,7 @@
           <w:szCs w:val="22"/>
         </w:rPr>
       </w:pPr>
-      <w:hyperlink w:anchor="_Toc230777436" w:history="1">
+      <w:hyperlink w:anchor="_Toc230777809" w:history="1">
         <w:r>
           <w:rPr>
             <w:rStyle w:val="Hyperlink"/>
@@ -1584,7 +1586,7 @@
             <w:noProof/>
             <w:webHidden/>
           </w:rPr>
-          <w:instrText xml:space="preserve"> PAGEREF _Toc230777436 \h </w:instrText>
+          <w:instrText xml:space="preserve"> PAGEREF _Toc230777809 \h </w:instrText>
         </w:r>
         <w:r>
           <w:rPr>
@@ -1628,7 +1630,7 @@
           <w:szCs w:val="22"/>
         </w:rPr>
       </w:pPr>
-      <w:hyperlink w:anchor="_Toc230777437" w:history="1">
+      <w:hyperlink w:anchor="_Toc230777810" w:history="1">
         <w:r>
           <w:rPr>
             <w:rStyle w:val="Hyperlink"/>
@@ -1655,7 +1657,7 @@
             <w:noProof/>
             <w:webHidden/>
           </w:rPr>
-          <w:instrText xml:space="preserve"> PAGEREF _Toc230777437 \h </w:instrText>
+          <w:instrText xml:space="preserve"> PAGEREF _Toc230777810 \h </w:instrText>
         </w:r>
         <w:r>
           <w:rPr>
@@ -1699,7 +1701,7 @@
           <w:szCs w:val="22"/>
         </w:rPr>
       </w:pPr>
-      <w:hyperlink w:anchor="_Toc230777438" w:history="1">
+      <w:hyperlink w:anchor="_Toc230777811" w:history="1">
         <w:r>
           <w:rPr>
             <w:rStyle w:val="Hyperlink"/>
@@ -1726,7 +1728,7 @@
             <w:noProof/>
             <w:webHidden/>
           </w:rPr>
-          <w:instrText xml:space="preserve"> PAGEREF _Toc230777438 \h </w:instrText>
+          <w:instrText xml:space="preserve"> PAGEREF _Toc230777811 \h </w:instrText>
         </w:r>
         <w:r>
           <w:rPr>
@@ -1770,7 +1772,7 @@
           <w:szCs w:val="22"/>
         </w:rPr>
       </w:pPr>
-      <w:hyperlink w:anchor="_Toc230777439" w:history="1">
+      <w:hyperlink w:anchor="_Toc230777812" w:history="1">
         <w:r>
           <w:rPr>
             <w:rStyle w:val="Hyperlink"/>
@@ -1797,7 +1799,7 @@
             <w:noProof/>
             <w:webHidden/>
           </w:rPr>
-          <w:instrText xml:space="preserve"> PAGEREF _Toc230777439 \h </w:instrText>
+          <w:instrText xml:space="preserve"> PAGEREF _Toc230777812 \h </w:instrText>
         </w:r>
         <w:r>
           <w:rPr>
@@ -1841,7 +1843,7 @@
           <w:szCs w:val="22"/>
         </w:rPr>
       </w:pPr>
-      <w:hyperlink w:anchor="_Toc230777440" w:history="1">
+      <w:hyperlink w:anchor="_Toc230777813" w:history="1">
         <w:r>
           <w:rPr>
             <w:rStyle w:val="Hyperlink"/>
@@ -1868,7 +1870,7 @@
             <w:noProof/>
             <w:webHidden/>
           </w:rPr>
-          <w:instrText xml:space="preserve"> PAGEREF _Toc230777440 \h </w:instrText>
+          <w:instrText xml:space="preserve"> PAGEREF _Toc230777813 \h </w:instrText>
         </w:r>
         <w:r>
           <w:rPr>
@@ -1912,7 +1914,7 @@
           <w:szCs w:val="22"/>
         </w:rPr>
       </w:pPr>
-      <w:hyperlink w:anchor="_Toc230777441" w:history="1">
+      <w:hyperlink w:anchor="_Toc230777814" w:history="1">
         <w:r>
           <w:rPr>
             <w:rStyle w:val="Hyperlink"/>
@@ -1939,7 +1941,7 @@
             <w:noProof/>
             <w:webHidden/>
           </w:rPr>
-          <w:instrText xml:space="preserve"> PAGEREF _Toc230777441 \h </w:instrText>
+          <w:instrText xml:space="preserve"> PAGEREF _Toc230777814 \h </w:instrText>
         </w:r>
         <w:r>
           <w:rPr>
@@ -1983,7 +1985,7 @@
           <w:szCs w:val="22"/>
         </w:rPr>
       </w:pPr>
-      <w:hyperlink w:anchor="_Toc230777442" w:history="1">
+      <w:hyperlink w:anchor="_Toc230777815" w:history="1">
         <w:r>
           <w:rPr>
             <w:rStyle w:val="Hyperlink"/>
@@ -2010,7 +2012,7 @@
             <w:noProof/>
             <w:webHidden/>
           </w:rPr>
-          <w:instrText xml:space="preserve"> PAGEREF _Toc230777442 \h </w:instrText>
+          <w:instrText xml:space="preserve"> PAGEREF _Toc230777815 \h </w:instrText>
         </w:r>
         <w:r>
           <w:rPr>
@@ -2054,7 +2056,7 @@
           <w:szCs w:val="22"/>
         </w:rPr>
       </w:pPr>
-      <w:hyperlink w:anchor="_Toc230777443" w:history="1">
+      <w:hyperlink w:anchor="_Toc230777816" w:history="1">
         <w:r>
           <w:rPr>
             <w:rStyle w:val="Hyperlink"/>
@@ -2081,7 +2083,7 @@
             <w:noProof/>
             <w:webHidden/>
           </w:rPr>
-          <w:instrText xml:space="preserve"> PAGEREF _Toc230777443 \h </w:instrText>
+          <w:instrText xml:space="preserve"> PAGEREF _Toc230777816 \h </w:instrText>
         </w:r>
         <w:r>
           <w:rPr>
@@ -2125,7 +2127,7 @@
           <w:szCs w:val="22"/>
         </w:rPr>
       </w:pPr>
-      <w:hyperlink w:anchor="_Toc230777444" w:history="1">
+      <w:hyperlink w:anchor="_Toc230777817" w:history="1">
         <w:r>
           <w:rPr>
             <w:rStyle w:val="Hyperlink"/>
@@ -2152,7 +2154,7 @@
             <w:noProof/>
             <w:webHidden/>
           </w:rPr>
-          <w:instrText xml:space="preserve"> PAGEREF _Toc230777444 \h </w:instrText>
+          <w:instrText xml:space="preserve"> PAGEREF _Toc230777817 \h </w:instrText>
         </w:r>
         <w:r>
           <w:rPr>
@@ -2196,7 +2198,7 @@
           <w:szCs w:val="22"/>
         </w:rPr>
       </w:pPr>
-      <w:hyperlink w:anchor="_Toc230777445" w:history="1">
+      <w:hyperlink w:anchor="_Toc230777818" w:history="1">
         <w:r>
           <w:rPr>
             <w:rStyle w:val="Hyperlink"/>
@@ -2223,7 +2225,7 @@
             <w:noProof/>
             <w:webHidden/>
           </w:rPr>
-          <w:instrText xml:space="preserve"> PAGEREF _Toc230777445 \h </w:instrText>
+          <w:instrText xml:space="preserve"> PAGEREF _Toc230777818 \h </w:instrText>
         </w:r>
         <w:r>
           <w:rPr>
@@ -2267,7 +2269,7 @@
           <w:szCs w:val="22"/>
         </w:rPr>
       </w:pPr>
-      <w:hyperlink w:anchor="_Toc230777446" w:history="1">
+      <w:hyperlink w:anchor="_Toc230777819" w:history="1">
         <w:r>
           <w:rPr>
             <w:rStyle w:val="Hyperlink"/>
@@ -2294,7 +2296,7 @@
             <w:noProof/>
             <w:webHidden/>
           </w:rPr>
-          <w:instrText xml:space="preserve"> PAGEREF _Toc230777446 \h </w:instrText>
+          <w:instrText xml:space="preserve"> PAGEREF _Toc230777819 \h </w:instrText>
         </w:r>
         <w:r>
           <w:rPr>
@@ -2338,7 +2340,7 @@
           <w:szCs w:val="22"/>
         </w:rPr>
       </w:pPr>
-      <w:hyperlink w:anchor="_Toc230777447" w:history="1">
+      <w:hyperlink w:anchor="_Toc230777820" w:history="1">
         <w:r>
           <w:rPr>
             <w:rStyle w:val="Hyperlink"/>
@@ -2365,7 +2367,7 @@
             <w:noProof/>
             <w:webHidden/>
           </w:rPr>
-          <w:instrText xml:space="preserve"> PAGEREF _Toc230777447 \h </w:instrText>
+          <w:instrText xml:space="preserve"> PAGEREF _Toc230777820 \h </w:instrText>
         </w:r>
         <w:r>
           <w:rPr>
@@ -2409,7 +2411,7 @@
           <w:szCs w:val="22"/>
         </w:rPr>
       </w:pPr>
-      <w:hyperlink w:anchor="_Toc230777448" w:history="1">
+      <w:hyperlink w:anchor="_Toc230777821" w:history="1">
         <w:r>
           <w:rPr>
             <w:rStyle w:val="Hyperlink"/>
@@ -2436,7 +2438,7 @@
             <w:noProof/>
             <w:webHidden/>
           </w:rPr>
-          <w:instrText xml:space="preserve"> PAGEREF _Toc230777448 \h </w:instrText>
+          <w:instrText xml:space="preserve"> PAGEREF _Toc230777821 \h </w:instrText>
         </w:r>
         <w:r>
           <w:rPr>
@@ -2480,7 +2482,7 @@
           <w:szCs w:val="22"/>
         </w:rPr>
       </w:pPr>
-      <w:hyperlink w:anchor="_Toc230777449" w:history="1">
+      <w:hyperlink w:anchor="_Toc230777822" w:history="1">
         <w:r>
           <w:rPr>
             <w:rStyle w:val="Hyperlink"/>
@@ -2507,7 +2509,7 @@
             <w:noProof/>
             <w:webHidden/>
           </w:rPr>
-          <w:instrText xml:space="preserve"> PAGEREF _Toc230777449 \h </w:instrText>
+          <w:instrText xml:space="preserve"> PAGEREF _Toc230777822 \h </w:instrText>
         </w:r>
         <w:r>
           <w:rPr>
@@ -2551,7 +2553,7 @@
           <w:szCs w:val="22"/>
         </w:rPr>
       </w:pPr>
-      <w:hyperlink w:anchor="_Toc230777450" w:history="1">
+      <w:hyperlink w:anchor="_Toc230777823" w:history="1">
         <w:r>
           <w:rPr>
             <w:rStyle w:val="Hyperlink"/>
@@ -2578,7 +2580,7 @@
             <w:noProof/>
             <w:webHidden/>
           </w:rPr>
-          <w:instrText xml:space="preserve"> PAGEREF _Toc230777450 \h </w:instrText>
+          <w:instrText xml:space="preserve"> PAGEREF _Toc230777823 \h </w:instrText>
         </w:r>
         <w:r>
           <w:rPr>
@@ -2622,7 +2624,7 @@
           <w:szCs w:val="22"/>
         </w:rPr>
       </w:pPr>
-      <w:hyperlink w:anchor="_Toc230777451" w:history="1">
+      <w:hyperlink w:anchor="_Toc230777824" w:history="1">
         <w:r>
           <w:rPr>
             <w:rStyle w:val="Hyperlink"/>
@@ -2649,7 +2651,7 @@
             <w:noProof/>
             <w:webHidden/>
           </w:rPr>
-          <w:instrText xml:space="preserve"> PAGEREF _Toc230777451 \h </w:instrText>
+          <w:instrText xml:space="preserve"> PAGEREF _Toc230777824 \h </w:instrText>
         </w:r>
         <w:r>
           <w:rPr>
@@ -2693,7 +2695,7 @@
           <w:szCs w:val="22"/>
         </w:rPr>
       </w:pPr>
-      <w:hyperlink w:anchor="_Toc230777452" w:history="1">
+      <w:hyperlink w:anchor="_Toc230777825" w:history="1">
         <w:r>
           <w:rPr>
             <w:rStyle w:val="Hyperlink"/>
@@ -2720,7 +2722,7 @@
             <w:noProof/>
             <w:webHidden/>
           </w:rPr>
-          <w:instrText xml:space="preserve"> PAGEREF _Toc230777452 \h </w:instrText>
+          <w:instrText xml:space="preserve"> PAGEREF _Toc230777825 \h </w:instrText>
         </w:r>
         <w:r>
           <w:rPr>
@@ -2764,7 +2766,7 @@
           <w:szCs w:val="22"/>
         </w:rPr>
       </w:pPr>
-      <w:hyperlink w:anchor="_Toc230777453" w:history="1">
+      <w:hyperlink w:anchor="_Toc230777826" w:history="1">
         <w:r>
           <w:rPr>
             <w:rStyle w:val="Hyperlink"/>
@@ -2791,7 +2793,7 @@
             <w:noProof/>
             <w:webHidden/>
           </w:rPr>
-          <w:instrText xml:space="preserve"> PAGEREF _Toc230777453 \h </w:instrText>
+          <w:instrText xml:space="preserve"> PAGEREF _Toc230777826 \h </w:instrText>
         </w:r>
         <w:r>
           <w:rPr>
@@ -2835,7 +2837,7 @@
           <w:szCs w:val="22"/>
         </w:rPr>
       </w:pPr>
-      <w:hyperlink w:anchor="_Toc230777454" w:history="1">
+      <w:hyperlink w:anchor="_Toc230777827" w:history="1">
         <w:r>
           <w:rPr>
             <w:rStyle w:val="Hyperlink"/>
@@ -2862,7 +2864,7 @@
             <w:noProof/>
             <w:webHidden/>
           </w:rPr>
-          <w:instrText xml:space="preserve"> PAGEREF _Toc230777454 \h </w:instrText>
+          <w:instrText xml:space="preserve"> PAGEREF _Toc230777827 \h </w:instrText>
         </w:r>
         <w:r>
           <w:rPr>
@@ -2906,7 +2908,7 @@
           <w:szCs w:val="22"/>
         </w:rPr>
       </w:pPr>
-      <w:hyperlink w:anchor="_Toc230777455" w:history="1">
+      <w:hyperlink w:anchor="_Toc230777828" w:history="1">
         <w:r>
           <w:rPr>
             <w:rStyle w:val="Hyperlink"/>
@@ -2933,7 +2935,7 @@
             <w:noProof/>
             <w:webHidden/>
           </w:rPr>
-          <w:instrText xml:space="preserve"> PAGEREF _Toc230777455 \h </w:instrText>
+          <w:instrText xml:space="preserve"> PAGEREF _Toc230777828 \h </w:instrText>
         </w:r>
         <w:r>
           <w:rPr>
@@ -2977,7 +2979,7 @@
           <w:szCs w:val="22"/>
         </w:rPr>
       </w:pPr>
-      <w:hyperlink w:anchor="_Toc230777456" w:history="1">
+      <w:hyperlink w:anchor="_Toc230777829" w:history="1">
         <w:r>
           <w:rPr>
             <w:rStyle w:val="Hyperlink"/>
@@ -3004,7 +3006,7 @@
             <w:noProof/>
             <w:webHidden/>
           </w:rPr>
-          <w:instrText xml:space="preserve"> PAGEREF _Toc230777456 \h </w:instrText>
+          <w:instrText xml:space="preserve"> PAGEREF _Toc230777829 \h </w:instrText>
         </w:r>
         <w:r>
           <w:rPr>
@@ -3048,7 +3050,7 @@
           <w:szCs w:val="22"/>
         </w:rPr>
       </w:pPr>
-      <w:hyperlink w:anchor="_Toc230777457" w:history="1">
+      <w:hyperlink w:anchor="_Toc230777830" w:history="1">
         <w:r>
           <w:rPr>
             <w:rStyle w:val="Hyperlink"/>
@@ -3075,7 +3077,7 @@
             <w:noProof/>
             <w:webHidden/>
           </w:rPr>
-          <w:instrText xml:space="preserve"> PAGEREF _Toc230777457 \h </w:instrText>
+          <w:instrText xml:space="preserve"> PAGEREF _Toc230777830 \h </w:instrText>
         </w:r>
         <w:r>
           <w:rPr>
@@ -3119,7 +3121,7 @@
           <w:szCs w:val="22"/>
         </w:rPr>
       </w:pPr>
-      <w:hyperlink w:anchor="_Toc230777458" w:history="1">
+      <w:hyperlink w:anchor="_Toc230777831" w:history="1">
         <w:r>
           <w:rPr>
             <w:rStyle w:val="Hyperlink"/>
@@ -3146,7 +3148,7 @@
             <w:noProof/>
             <w:webHidden/>
           </w:rPr>
-          <w:instrText xml:space="preserve"> PAGEREF _Toc230777458 \h </w:instrText>
+          <w:instrText xml:space="preserve"> PAGEREF _Toc230777831 \h </w:instrText>
         </w:r>
         <w:r>
           <w:rPr>
@@ -3190,7 +3192,7 @@
           <w:szCs w:val="22"/>
         </w:rPr>
       </w:pPr>
-      <w:hyperlink w:anchor="_Toc230777459" w:history="1">
+      <w:hyperlink w:anchor="_Toc230777832" w:history="1">
         <w:r>
           <w:rPr>
             <w:rStyle w:val="Hyperlink"/>
@@ -3217,7 +3219,7 @@
             <w:noProof/>
             <w:webHidden/>
           </w:rPr>
-          <w:instrText xml:space="preserve"> PAGEREF _Toc230777459 \h </w:instrText>
+          <w:instrText xml:space="preserve"> PAGEREF _Toc230777832 \h </w:instrText>
         </w:r>
         <w:r>
           <w:rPr>
@@ -3261,7 +3263,7 @@
           <w:szCs w:val="22"/>
         </w:rPr>
       </w:pPr>
-      <w:hyperlink w:anchor="_Toc230777460" w:history="1">
+      <w:hyperlink w:anchor="_Toc230777833" w:history="1">
         <w:r>
           <w:rPr>
             <w:rStyle w:val="Hyperlink"/>
@@ -3288,7 +3290,7 @@
             <w:noProof/>
             <w:webHidden/>
           </w:rPr>
-          <w:instrText xml:space="preserve"> PAGEREF _Toc230777460 \h </w:instrText>
+          <w:instrText xml:space="preserve"> PAGEREF _Toc230777833 \h </w:instrText>
         </w:r>
         <w:r>
           <w:rPr>
@@ -3332,7 +3334,7 @@
           <w:szCs w:val="22"/>
         </w:rPr>
       </w:pPr>
-      <w:hyperlink w:anchor="_Toc230777461" w:history="1">
+      <w:hyperlink w:anchor="_Toc230777834" w:history="1">
         <w:r>
           <w:rPr>
             <w:rStyle w:val="Hyperlink"/>
@@ -3359,7 +3361,7 @@
             <w:noProof/>
             <w:webHidden/>
           </w:rPr>
-          <w:instrText xml:space="preserve"> PAGEREF _Toc230777461 \h </w:instrText>
+          <w:instrText xml:space="preserve"> PAGEREF _Toc230777834 \h </w:instrText>
         </w:r>
         <w:r>
           <w:rPr>
@@ -3403,7 +3405,7 @@
           <w:szCs w:val="22"/>
         </w:rPr>
       </w:pPr>
-      <w:hyperlink w:anchor="_Toc230777462" w:history="1">
+      <w:hyperlink w:anchor="_Toc230777835" w:history="1">
         <w:r>
           <w:rPr>
             <w:rStyle w:val="Hyperlink"/>
@@ -3430,7 +3432,7 @@
             <w:noProof/>
             <w:webHidden/>
           </w:rPr>
-          <w:instrText xml:space="preserve"> PAGEREF _Toc230777462 \h </w:instrText>
+          <w:instrText xml:space="preserve"> PAGEREF _Toc230777835 \h </w:instrText>
         </w:r>
         <w:r>
           <w:rPr>
@@ -3474,7 +3476,7 @@
           <w:szCs w:val="22"/>
         </w:rPr>
       </w:pPr>
-      <w:hyperlink w:anchor="_Toc230777463" w:history="1">
+      <w:hyperlink w:anchor="_Toc230777836" w:history="1">
         <w:r>
           <w:rPr>
             <w:rStyle w:val="Hyperlink"/>
@@ -3501,7 +3503,7 @@
             <w:noProof/>
             <w:webHidden/>
           </w:rPr>
-          <w:instrText xml:space="preserve"> PAGEREF _Toc230777463 \h </w:instrText>
+          <w:instrText xml:space="preserve"> PAGEREF _Toc230777836 \h </w:instrText>
         </w:r>
         <w:r>
           <w:rPr>
@@ -3545,7 +3547,7 @@
           <w:szCs w:val="22"/>
         </w:rPr>
       </w:pPr>
-      <w:hyperlink w:anchor="_Toc230777464" w:history="1">
+      <w:hyperlink w:anchor="_Toc230777837" w:history="1">
         <w:r>
           <w:rPr>
             <w:rStyle w:val="Hyperlink"/>
@@ -3572,7 +3574,7 @@
             <w:noProof/>
             <w:webHidden/>
           </w:rPr>
-          <w:instrText xml:space="preserve"> PAGEREF _Toc230777464 \h </w:instrText>
+          <w:instrText xml:space="preserve"> PAGEREF _Toc230777837 \h </w:instrText>
         </w:r>
         <w:r>
           <w:rPr>
@@ -3616,7 +3618,7 @@
           <w:szCs w:val="22"/>
         </w:rPr>
       </w:pPr>
-      <w:hyperlink w:anchor="_Toc230777465" w:history="1">
+      <w:hyperlink w:anchor="_Toc230777838" w:history="1">
         <w:r>
           <w:rPr>
             <w:rStyle w:val="Hyperlink"/>
@@ -3643,7 +3645,7 @@
             <w:noProof/>
             <w:webHidden/>
           </w:rPr>
-          <w:instrText xml:space="preserve"> PAGEREF _Toc230777465 \h </w:instrText>
+          <w:instrText xml:space="preserve"> PAGEREF _Toc230777838 \h </w:instrText>
         </w:r>
         <w:r>
           <w:rPr>
@@ -3687,7 +3689,7 @@
           <w:szCs w:val="22"/>
         </w:rPr>
       </w:pPr>
-      <w:hyperlink w:anchor="_Toc230777466" w:history="1">
+      <w:hyperlink w:anchor="_Toc230777839" w:history="1">
         <w:r>
           <w:rPr>
             <w:rStyle w:val="Hyperlink"/>
@@ -3714,7 +3716,7 @@
             <w:noProof/>
             <w:webHidden/>
           </w:rPr>
-          <w:instrText xml:space="preserve"> PAGEREF _Toc230777466 \h </w:instrText>
+          <w:instrText xml:space="preserve"> PAGEREF _Toc230777839 \h </w:instrText>
         </w:r>
         <w:r>
           <w:rPr>
@@ -3758,7 +3760,7 @@
           <w:szCs w:val="22"/>
         </w:rPr>
       </w:pPr>
-      <w:hyperlink w:anchor="_Toc230777467" w:history="1">
+      <w:hyperlink w:anchor="_Toc230777840" w:history="1">
         <w:r>
           <w:rPr>
             <w:rStyle w:val="Hyperlink"/>
@@ -3785,7 +3787,7 @@
             <w:noProof/>
             <w:webHidden/>
           </w:rPr>
-          <w:instrText xml:space="preserve"> PAGEREF _Toc230777467 \h </w:instrText>
+          <w:instrText xml:space="preserve"> PAGEREF _Toc230777840 \h </w:instrText>
         </w:r>
         <w:r>
           <w:rPr>
@@ -3829,7 +3831,7 @@
           <w:szCs w:val="22"/>
         </w:rPr>
       </w:pPr>
-      <w:hyperlink w:anchor="_Toc230777468" w:history="1">
+      <w:hyperlink w:anchor="_Toc230777841" w:history="1">
         <w:r>
           <w:rPr>
             <w:rStyle w:val="Hyperlink"/>
@@ -3856,7 +3858,7 @@
             <w:noProof/>
             <w:webHidden/>
           </w:rPr>
-          <w:instrText xml:space="preserve"> PAGEREF _Toc230777468 \h </w:instrText>
+          <w:instrText xml:space="preserve"> PAGEREF _Toc230777841 \h </w:instrText>
         </w:r>
         <w:r>
           <w:rPr>
@@ -3900,7 +3902,7 @@
           <w:szCs w:val="22"/>
         </w:rPr>
       </w:pPr>
-      <w:hyperlink w:anchor="_Toc230777469" w:history="1">
+      <w:hyperlink w:anchor="_Toc230777842" w:history="1">
         <w:r>
           <w:rPr>
             <w:rStyle w:val="Hyperlink"/>
@@ -3927,7 +3929,7 @@
             <w:noProof/>
             <w:webHidden/>
           </w:rPr>
-          <w:instrText xml:space="preserve"> PAGEREF _Toc230777469 \h </w:instrText>
+          <w:instrText xml:space="preserve"> PAGEREF _Toc230777842 \h </w:instrText>
         </w:r>
         <w:r>
           <w:rPr>
@@ -4082,8 +4084,6 @@
             <w:pStyle w:val="CabealhodoSumrio"/>
           </w:pPr>
         </w:p>
-        <w:bookmarkStart w:id="0" w:name="_GoBack"/>
-        <w:bookmarkEnd w:id="0"/>
         <w:p>
           <w:pPr>
             <w:pStyle w:val="Sumrio1"/>
@@ -4110,7 +4110,7 @@
           <w:r>
             <w:fldChar w:fldCharType="separate"/>
           </w:r>
-          <w:hyperlink w:anchor="_Toc230777470" w:history="1">
+          <w:hyperlink w:anchor="_Toc230777735" w:history="1">
             <w:r>
               <w:rPr>
                 <w:rStyle w:val="Hyperlink"/>
@@ -4156,7 +4156,7 @@
                 <w:noProof/>
                 <w:webHidden/>
               </w:rPr>
-              <w:instrText xml:space="preserve"> PAGEREF _Toc230777470 \h </w:instrText>
+              <w:instrText xml:space="preserve"> PAGEREF _Toc230777735 \h </w:instrText>
             </w:r>
             <w:r>
               <w:rPr>
@@ -4202,7 +4202,7 @@
               <w:szCs w:val="22"/>
             </w:rPr>
           </w:pPr>
-          <w:hyperlink w:anchor="_Toc230777471" w:history="1">
+          <w:hyperlink w:anchor="_Toc230777736" w:history="1">
             <w:r>
               <w:rPr>
                 <w:rStyle w:val="Hyperlink"/>
@@ -4246,7 +4246,7 @@
                 <w:noProof/>
                 <w:webHidden/>
               </w:rPr>
-              <w:instrText xml:space="preserve"> PAGEREF _Toc230777471 \h </w:instrText>
+              <w:instrText xml:space="preserve"> PAGEREF _Toc230777736 \h </w:instrText>
             </w:r>
             <w:r>
               <w:rPr>
@@ -4292,7 +4292,7 @@
               <w:szCs w:val="22"/>
             </w:rPr>
           </w:pPr>
-          <w:hyperlink w:anchor="_Toc230777472" w:history="1">
+          <w:hyperlink w:anchor="_Toc230777737" w:history="1">
             <w:r>
               <w:rPr>
                 <w:rStyle w:val="Hyperlink"/>
@@ -4336,7 +4336,7 @@
                 <w:noProof/>
                 <w:webHidden/>
               </w:rPr>
-              <w:instrText xml:space="preserve"> PAGEREF _Toc230777472 \h </w:instrText>
+              <w:instrText xml:space="preserve"> PAGEREF _Toc230777737 \h </w:instrText>
             </w:r>
             <w:r>
               <w:rPr>
@@ -4382,7 +4382,7 @@
               <w:szCs w:val="22"/>
             </w:rPr>
           </w:pPr>
-          <w:hyperlink w:anchor="_Toc230777473" w:history="1">
+          <w:hyperlink w:anchor="_Toc230777738" w:history="1">
             <w:r>
               <w:rPr>
                 <w:rStyle w:val="Hyperlink"/>
@@ -4426,7 +4426,7 @@
                 <w:noProof/>
                 <w:webHidden/>
               </w:rPr>
-              <w:instrText xml:space="preserve"> PAGEREF _Toc230777473 \h </w:instrText>
+              <w:instrText xml:space="preserve"> PAGEREF _Toc230777738 \h </w:instrText>
             </w:r>
             <w:r>
               <w:rPr>
@@ -4474,7 +4474,7 @@
               <w:szCs w:val="22"/>
             </w:rPr>
           </w:pPr>
-          <w:hyperlink w:anchor="_Toc230777474" w:history="1">
+          <w:hyperlink w:anchor="_Toc230777739" w:history="1">
             <w:r>
               <w:rPr>
                 <w:rStyle w:val="Hyperlink"/>
@@ -4520,7 +4520,7 @@
                 <w:noProof/>
                 <w:webHidden/>
               </w:rPr>
-              <w:instrText xml:space="preserve"> PAGEREF _Toc230777474 \h </w:instrText>
+              <w:instrText xml:space="preserve"> PAGEREF _Toc230777739 \h </w:instrText>
             </w:r>
             <w:r>
               <w:rPr>
@@ -4566,7 +4566,7 @@
               <w:szCs w:val="22"/>
             </w:rPr>
           </w:pPr>
-          <w:hyperlink w:anchor="_Toc230777475" w:history="1">
+          <w:hyperlink w:anchor="_Toc230777740" w:history="1">
             <w:r>
               <w:rPr>
                 <w:rStyle w:val="Hyperlink"/>
@@ -4610,7 +4610,7 @@
                 <w:noProof/>
                 <w:webHidden/>
               </w:rPr>
-              <w:instrText xml:space="preserve"> PAGEREF _Toc230777475 \h </w:instrText>
+              <w:instrText xml:space="preserve"> PAGEREF _Toc230777740 \h </w:instrText>
             </w:r>
             <w:r>
               <w:rPr>
@@ -4656,7 +4656,7 @@
               <w:szCs w:val="22"/>
             </w:rPr>
           </w:pPr>
-          <w:hyperlink w:anchor="_Toc230777476" w:history="1">
+          <w:hyperlink w:anchor="_Toc230777741" w:history="1">
             <w:r>
               <w:rPr>
                 <w:rStyle w:val="Hyperlink"/>
@@ -4700,7 +4700,7 @@
                 <w:noProof/>
                 <w:webHidden/>
               </w:rPr>
-              <w:instrText xml:space="preserve"> PAGEREF _Toc230777476 \h </w:instrText>
+              <w:instrText xml:space="preserve"> PAGEREF _Toc230777741 \h </w:instrText>
             </w:r>
             <w:r>
               <w:rPr>
@@ -4748,7 +4748,7 @@
               <w:szCs w:val="22"/>
             </w:rPr>
           </w:pPr>
-          <w:hyperlink w:anchor="_Toc230777477" w:history="1">
+          <w:hyperlink w:anchor="_Toc230777742" w:history="1">
             <w:r>
               <w:rPr>
                 <w:rStyle w:val="Hyperlink"/>
@@ -4794,7 +4794,7 @@
                 <w:noProof/>
                 <w:webHidden/>
               </w:rPr>
-              <w:instrText xml:space="preserve"> PAGEREF _Toc230777477 \h </w:instrText>
+              <w:instrText xml:space="preserve"> PAGEREF _Toc230777742 \h </w:instrText>
             </w:r>
             <w:r>
               <w:rPr>
@@ -4840,7 +4840,7 @@
               <w:szCs w:val="22"/>
             </w:rPr>
           </w:pPr>
-          <w:hyperlink w:anchor="_Toc230777478" w:history="1">
+          <w:hyperlink w:anchor="_Toc230777743" w:history="1">
             <w:r>
               <w:rPr>
                 <w:rStyle w:val="Hyperlink"/>
@@ -4884,7 +4884,7 @@
                 <w:noProof/>
                 <w:webHidden/>
               </w:rPr>
-              <w:instrText xml:space="preserve"> PAGEREF _Toc230777478 \h </w:instrText>
+              <w:instrText xml:space="preserve"> PAGEREF _Toc230777743 \h </w:instrText>
             </w:r>
             <w:r>
               <w:rPr>
@@ -4930,7 +4930,7 @@
               <w:szCs w:val="22"/>
             </w:rPr>
           </w:pPr>
-          <w:hyperlink w:anchor="_Toc230777479" w:history="1">
+          <w:hyperlink w:anchor="_Toc230777744" w:history="1">
             <w:r>
               <w:rPr>
                 <w:rStyle w:val="Hyperlink"/>
@@ -4974,7 +4974,7 @@
                 <w:noProof/>
                 <w:webHidden/>
               </w:rPr>
-              <w:instrText xml:space="preserve"> PAGEREF _Toc230777479 \h </w:instrText>
+              <w:instrText xml:space="preserve"> PAGEREF _Toc230777744 \h </w:instrText>
             </w:r>
             <w:r>
               <w:rPr>
@@ -5020,7 +5020,7 @@
               <w:szCs w:val="22"/>
             </w:rPr>
           </w:pPr>
-          <w:hyperlink w:anchor="_Toc230777480" w:history="1">
+          <w:hyperlink w:anchor="_Toc230777745" w:history="1">
             <w:r>
               <w:rPr>
                 <w:rStyle w:val="Hyperlink"/>
@@ -5070,7 +5070,7 @@
                 <w:noProof/>
                 <w:webHidden/>
               </w:rPr>
-              <w:instrText xml:space="preserve"> PAGEREF _Toc230777480 \h </w:instrText>
+              <w:instrText xml:space="preserve"> PAGEREF _Toc230777745 \h </w:instrText>
             </w:r>
             <w:r>
               <w:rPr>
@@ -5116,7 +5116,7 @@
               <w:szCs w:val="22"/>
             </w:rPr>
           </w:pPr>
-          <w:hyperlink w:anchor="_Toc230777481" w:history="1">
+          <w:hyperlink w:anchor="_Toc230777746" w:history="1">
             <w:r>
               <w:rPr>
                 <w:rStyle w:val="Hyperlink"/>
@@ -5174,7 +5174,7 @@
                 <w:noProof/>
                 <w:webHidden/>
               </w:rPr>
-              <w:instrText xml:space="preserve"> PAGEREF _Toc230777481 \h </w:instrText>
+              <w:instrText xml:space="preserve"> PAGEREF _Toc230777746 \h </w:instrText>
             </w:r>
             <w:r>
               <w:rPr>
@@ -5220,7 +5220,7 @@
               <w:szCs w:val="22"/>
             </w:rPr>
           </w:pPr>
-          <w:hyperlink w:anchor="_Toc230777482" w:history="1">
+          <w:hyperlink w:anchor="_Toc230777747" w:history="1">
             <w:r>
               <w:rPr>
                 <w:rStyle w:val="Hyperlink"/>
@@ -5270,7 +5270,7 @@
                 <w:noProof/>
                 <w:webHidden/>
               </w:rPr>
-              <w:instrText xml:space="preserve"> PAGEREF _Toc230777482 \h </w:instrText>
+              <w:instrText xml:space="preserve"> PAGEREF _Toc230777747 \h </w:instrText>
             </w:r>
             <w:r>
               <w:rPr>
@@ -5316,7 +5316,7 @@
               <w:szCs w:val="22"/>
             </w:rPr>
           </w:pPr>
-          <w:hyperlink w:anchor="_Toc230777483" w:history="1">
+          <w:hyperlink w:anchor="_Toc230777748" w:history="1">
             <w:r>
               <w:rPr>
                 <w:rStyle w:val="Hyperlink"/>
@@ -5366,7 +5366,7 @@
                 <w:noProof/>
                 <w:webHidden/>
               </w:rPr>
-              <w:instrText xml:space="preserve"> PAGEREF _Toc230777483 \h </w:instrText>
+              <w:instrText xml:space="preserve"> PAGEREF _Toc230777748 \h </w:instrText>
             </w:r>
             <w:r>
               <w:rPr>
@@ -5412,7 +5412,7 @@
               <w:szCs w:val="22"/>
             </w:rPr>
           </w:pPr>
-          <w:hyperlink w:anchor="_Toc230777484" w:history="1">
+          <w:hyperlink w:anchor="_Toc230777749" w:history="1">
             <w:r>
               <w:rPr>
                 <w:rStyle w:val="Hyperlink"/>
@@ -5462,7 +5462,7 @@
                 <w:noProof/>
                 <w:webHidden/>
               </w:rPr>
-              <w:instrText xml:space="preserve"> PAGEREF _Toc230777484 \h </w:instrText>
+              <w:instrText xml:space="preserve"> PAGEREF _Toc230777749 \h </w:instrText>
             </w:r>
             <w:r>
               <w:rPr>
@@ -5508,7 +5508,7 @@
               <w:szCs w:val="22"/>
             </w:rPr>
           </w:pPr>
-          <w:hyperlink w:anchor="_Toc230777485" w:history="1">
+          <w:hyperlink w:anchor="_Toc230777750" w:history="1">
             <w:r>
               <w:rPr>
                 <w:rStyle w:val="Hyperlink"/>
@@ -5558,7 +5558,7 @@
                 <w:noProof/>
                 <w:webHidden/>
               </w:rPr>
-              <w:instrText xml:space="preserve"> PAGEREF _Toc230777485 \h </w:instrText>
+              <w:instrText xml:space="preserve"> PAGEREF _Toc230777750 \h </w:instrText>
             </w:r>
             <w:r>
               <w:rPr>
@@ -5604,7 +5604,7 @@
               <w:szCs w:val="22"/>
             </w:rPr>
           </w:pPr>
-          <w:hyperlink w:anchor="_Toc230777486" w:history="1">
+          <w:hyperlink w:anchor="_Toc230777751" w:history="1">
             <w:r>
               <w:rPr>
                 <w:rStyle w:val="Hyperlink"/>
@@ -5654,7 +5654,7 @@
                 <w:noProof/>
                 <w:webHidden/>
               </w:rPr>
-              <w:instrText xml:space="preserve"> PAGEREF _Toc230777486 \h </w:instrText>
+              <w:instrText xml:space="preserve"> PAGEREF _Toc230777751 \h </w:instrText>
             </w:r>
             <w:r>
               <w:rPr>
@@ -5700,7 +5700,7 @@
               <w:szCs w:val="22"/>
             </w:rPr>
           </w:pPr>
-          <w:hyperlink w:anchor="_Toc230777487" w:history="1">
+          <w:hyperlink w:anchor="_Toc230777752" w:history="1">
             <w:r>
               <w:rPr>
                 <w:rStyle w:val="Hyperlink"/>
@@ -5750,7 +5750,7 @@
                 <w:noProof/>
                 <w:webHidden/>
               </w:rPr>
-              <w:instrText xml:space="preserve"> PAGEREF _Toc230777487 \h </w:instrText>
+              <w:instrText xml:space="preserve"> PAGEREF _Toc230777752 \h </w:instrText>
             </w:r>
             <w:r>
               <w:rPr>
@@ -5796,7 +5796,7 @@
               <w:szCs w:val="22"/>
             </w:rPr>
           </w:pPr>
-          <w:hyperlink w:anchor="_Toc230777488" w:history="1">
+          <w:hyperlink w:anchor="_Toc230777753" w:history="1">
             <w:r>
               <w:rPr>
                 <w:rStyle w:val="Hyperlink"/>
@@ -5854,7 +5854,7 @@
                 <w:noProof/>
                 <w:webHidden/>
               </w:rPr>
-              <w:instrText xml:space="preserve"> PAGEREF _Toc230777488 \h </w:instrText>
+              <w:instrText xml:space="preserve"> PAGEREF _Toc230777753 \h </w:instrText>
             </w:r>
             <w:r>
               <w:rPr>
@@ -5900,7 +5900,7 @@
               <w:szCs w:val="22"/>
             </w:rPr>
           </w:pPr>
-          <w:hyperlink w:anchor="_Toc230777489" w:history="1">
+          <w:hyperlink w:anchor="_Toc230777754" w:history="1">
             <w:r>
               <w:rPr>
                 <w:rStyle w:val="Hyperlink"/>
@@ -5958,7 +5958,7 @@
                 <w:noProof/>
                 <w:webHidden/>
               </w:rPr>
-              <w:instrText xml:space="preserve"> PAGEREF _Toc230777489 \h </w:instrText>
+              <w:instrText xml:space="preserve"> PAGEREF _Toc230777754 \h </w:instrText>
             </w:r>
             <w:r>
               <w:rPr>
@@ -6004,7 +6004,7 @@
               <w:szCs w:val="22"/>
             </w:rPr>
           </w:pPr>
-          <w:hyperlink w:anchor="_Toc230777490" w:history="1">
+          <w:hyperlink w:anchor="_Toc230777755" w:history="1">
             <w:r>
               <w:rPr>
                 <w:rStyle w:val="Hyperlink"/>
@@ -6054,7 +6054,7 @@
                 <w:noProof/>
                 <w:webHidden/>
               </w:rPr>
-              <w:instrText xml:space="preserve"> PAGEREF _Toc230777490 \h </w:instrText>
+              <w:instrText xml:space="preserve"> PAGEREF _Toc230777755 \h </w:instrText>
             </w:r>
             <w:r>
               <w:rPr>
@@ -6100,7 +6100,7 @@
               <w:szCs w:val="22"/>
             </w:rPr>
           </w:pPr>
-          <w:hyperlink w:anchor="_Toc230777491" w:history="1">
+          <w:hyperlink w:anchor="_Toc230777756" w:history="1">
             <w:r>
               <w:rPr>
                 <w:rStyle w:val="Hyperlink"/>
@@ -6150,7 +6150,7 @@
                 <w:noProof/>
                 <w:webHidden/>
               </w:rPr>
-              <w:instrText xml:space="preserve"> PAGEREF _Toc230777491 \h </w:instrText>
+              <w:instrText xml:space="preserve"> PAGEREF _Toc230777756 \h </w:instrText>
             </w:r>
             <w:r>
               <w:rPr>
@@ -6196,7 +6196,7 @@
               <w:szCs w:val="22"/>
             </w:rPr>
           </w:pPr>
-          <w:hyperlink w:anchor="_Toc230777492" w:history="1">
+          <w:hyperlink w:anchor="_Toc230777757" w:history="1">
             <w:r>
               <w:rPr>
                 <w:rStyle w:val="Hyperlink"/>
@@ -6246,7 +6246,7 @@
                 <w:noProof/>
                 <w:webHidden/>
               </w:rPr>
-              <w:instrText xml:space="preserve"> PAGEREF _Toc230777492 \h </w:instrText>
+              <w:instrText xml:space="preserve"> PAGEREF _Toc230777757 \h </w:instrText>
             </w:r>
             <w:r>
               <w:rPr>
@@ -6292,7 +6292,7 @@
               <w:szCs w:val="22"/>
             </w:rPr>
           </w:pPr>
-          <w:hyperlink w:anchor="_Toc230777493" w:history="1">
+          <w:hyperlink w:anchor="_Toc230777758" w:history="1">
             <w:r>
               <w:rPr>
                 <w:rStyle w:val="Hyperlink"/>
@@ -6342,7 +6342,7 @@
                 <w:noProof/>
                 <w:webHidden/>
               </w:rPr>
-              <w:instrText xml:space="preserve"> PAGEREF _Toc230777493 \h </w:instrText>
+              <w:instrText xml:space="preserve"> PAGEREF _Toc230777758 \h </w:instrText>
             </w:r>
             <w:r>
               <w:rPr>
@@ -6388,7 +6388,7 @@
               <w:szCs w:val="22"/>
             </w:rPr>
           </w:pPr>
-          <w:hyperlink w:anchor="_Toc230777494" w:history="1">
+          <w:hyperlink w:anchor="_Toc230777759" w:history="1">
             <w:r>
               <w:rPr>
                 <w:rStyle w:val="Hyperlink"/>
@@ -6446,7 +6446,7 @@
                 <w:noProof/>
                 <w:webHidden/>
               </w:rPr>
-              <w:instrText xml:space="preserve"> PAGEREF _Toc230777494 \h </w:instrText>
+              <w:instrText xml:space="preserve"> PAGEREF _Toc230777759 \h </w:instrText>
             </w:r>
             <w:r>
               <w:rPr>
@@ -6492,7 +6492,7 @@
               <w:szCs w:val="22"/>
             </w:rPr>
           </w:pPr>
-          <w:hyperlink w:anchor="_Toc230777495" w:history="1">
+          <w:hyperlink w:anchor="_Toc230777760" w:history="1">
             <w:r>
               <w:rPr>
                 <w:rStyle w:val="Hyperlink"/>
@@ -6542,7 +6542,7 @@
                 <w:noProof/>
                 <w:webHidden/>
               </w:rPr>
-              <w:instrText xml:space="preserve"> PAGEREF _Toc230777495 \h </w:instrText>
+              <w:instrText xml:space="preserve"> PAGEREF _Toc230777760 \h </w:instrText>
             </w:r>
             <w:r>
               <w:rPr>
@@ -6588,7 +6588,7 @@
               <w:szCs w:val="22"/>
             </w:rPr>
           </w:pPr>
-          <w:hyperlink w:anchor="_Toc230777496" w:history="1">
+          <w:hyperlink w:anchor="_Toc230777761" w:history="1">
             <w:r>
               <w:rPr>
                 <w:rStyle w:val="Hyperlink"/>
@@ -6638,7 +6638,7 @@
                 <w:noProof/>
                 <w:webHidden/>
               </w:rPr>
-              <w:instrText xml:space="preserve"> PAGEREF _Toc230777496 \h </w:instrText>
+              <w:instrText xml:space="preserve"> PAGEREF _Toc230777761 \h </w:instrText>
             </w:r>
             <w:r>
               <w:rPr>
@@ -6684,7 +6684,7 @@
               <w:szCs w:val="22"/>
             </w:rPr>
           </w:pPr>
-          <w:hyperlink w:anchor="_Toc230777497" w:history="1">
+          <w:hyperlink w:anchor="_Toc230777762" w:history="1">
             <w:r>
               <w:rPr>
                 <w:rStyle w:val="Hyperlink"/>
@@ -6734,7 +6734,7 @@
                 <w:noProof/>
                 <w:webHidden/>
               </w:rPr>
-              <w:instrText xml:space="preserve"> PAGEREF _Toc230777497 \h </w:instrText>
+              <w:instrText xml:space="preserve"> PAGEREF _Toc230777762 \h </w:instrText>
             </w:r>
             <w:r>
               <w:rPr>
@@ -6780,7 +6780,7 @@
               <w:szCs w:val="22"/>
             </w:rPr>
           </w:pPr>
-          <w:hyperlink w:anchor="_Toc230777498" w:history="1">
+          <w:hyperlink w:anchor="_Toc230777763" w:history="1">
             <w:r>
               <w:rPr>
                 <w:rStyle w:val="Hyperlink"/>
@@ -6838,7 +6838,7 @@
                 <w:noProof/>
                 <w:webHidden/>
               </w:rPr>
-              <w:instrText xml:space="preserve"> PAGEREF _Toc230777498 \h </w:instrText>
+              <w:instrText xml:space="preserve"> PAGEREF _Toc230777763 \h </w:instrText>
             </w:r>
             <w:r>
               <w:rPr>
@@ -6884,7 +6884,7 @@
               <w:szCs w:val="22"/>
             </w:rPr>
           </w:pPr>
-          <w:hyperlink w:anchor="_Toc230777499" w:history="1">
+          <w:hyperlink w:anchor="_Toc230777764" w:history="1">
             <w:r>
               <w:rPr>
                 <w:rStyle w:val="Hyperlink"/>
@@ -6934,7 +6934,7 @@
                 <w:noProof/>
                 <w:webHidden/>
               </w:rPr>
-              <w:instrText xml:space="preserve"> PAGEREF _Toc230777499 \h </w:instrText>
+              <w:instrText xml:space="preserve"> PAGEREF _Toc230777764 \h </w:instrText>
             </w:r>
             <w:r>
               <w:rPr>
@@ -6980,7 +6980,7 @@
               <w:szCs w:val="22"/>
             </w:rPr>
           </w:pPr>
-          <w:hyperlink w:anchor="_Toc230777500" w:history="1">
+          <w:hyperlink w:anchor="_Toc230777765" w:history="1">
             <w:r>
               <w:rPr>
                 <w:rStyle w:val="Hyperlink"/>
@@ -7030,7 +7030,7 @@
                 <w:noProof/>
                 <w:webHidden/>
               </w:rPr>
-              <w:instrText xml:space="preserve"> PAGEREF _Toc230777500 \h </w:instrText>
+              <w:instrText xml:space="preserve"> PAGEREF _Toc230777765 \h </w:instrText>
             </w:r>
             <w:r>
               <w:rPr>
@@ -7076,7 +7076,7 @@
               <w:szCs w:val="22"/>
             </w:rPr>
           </w:pPr>
-          <w:hyperlink w:anchor="_Toc230777501" w:history="1">
+          <w:hyperlink w:anchor="_Toc230777766" w:history="1">
             <w:r>
               <w:rPr>
                 <w:rStyle w:val="Hyperlink"/>
@@ -7134,7 +7134,7 @@
                 <w:noProof/>
                 <w:webHidden/>
               </w:rPr>
-              <w:instrText xml:space="preserve"> PAGEREF _Toc230777501 \h </w:instrText>
+              <w:instrText xml:space="preserve"> PAGEREF _Toc230777766 \h </w:instrText>
             </w:r>
             <w:r>
               <w:rPr>
@@ -7180,7 +7180,7 @@
               <w:szCs w:val="22"/>
             </w:rPr>
           </w:pPr>
-          <w:hyperlink w:anchor="_Toc230777502" w:history="1">
+          <w:hyperlink w:anchor="_Toc230777767" w:history="1">
             <w:r>
               <w:rPr>
                 <w:rStyle w:val="Hyperlink"/>
@@ -7238,7 +7238,7 @@
                 <w:noProof/>
                 <w:webHidden/>
               </w:rPr>
-              <w:instrText xml:space="preserve"> PAGEREF _Toc230777502 \h </w:instrText>
+              <w:instrText xml:space="preserve"> PAGEREF _Toc230777767 \h </w:instrText>
             </w:r>
             <w:r>
               <w:rPr>
@@ -7284,7 +7284,7 @@
               <w:szCs w:val="22"/>
             </w:rPr>
           </w:pPr>
-          <w:hyperlink w:anchor="_Toc230777503" w:history="1">
+          <w:hyperlink w:anchor="_Toc230777768" w:history="1">
             <w:r>
               <w:rPr>
                 <w:rStyle w:val="Hyperlink"/>
@@ -7342,7 +7342,7 @@
                 <w:noProof/>
                 <w:webHidden/>
               </w:rPr>
-              <w:instrText xml:space="preserve"> PAGEREF _Toc230777503 \h </w:instrText>
+              <w:instrText xml:space="preserve"> PAGEREF _Toc230777768 \h </w:instrText>
             </w:r>
             <w:r>
               <w:rPr>
@@ -7388,7 +7388,7 @@
               <w:szCs w:val="22"/>
             </w:rPr>
           </w:pPr>
-          <w:hyperlink w:anchor="_Toc230777504" w:history="1">
+          <w:hyperlink w:anchor="_Toc230777769" w:history="1">
             <w:r>
               <w:rPr>
                 <w:rStyle w:val="Hyperlink"/>
@@ -7432,7 +7432,7 @@
                 <w:noProof/>
                 <w:webHidden/>
               </w:rPr>
-              <w:instrText xml:space="preserve"> PAGEREF _Toc230777504 \h </w:instrText>
+              <w:instrText xml:space="preserve"> PAGEREF _Toc230777769 \h </w:instrText>
             </w:r>
             <w:r>
               <w:rPr>
@@ -7480,7 +7480,7 @@
               <w:szCs w:val="22"/>
             </w:rPr>
           </w:pPr>
-          <w:hyperlink w:anchor="_Toc230777505" w:history="1">
+          <w:hyperlink w:anchor="_Toc230777770" w:history="1">
             <w:r>
               <w:rPr>
                 <w:rStyle w:val="Hyperlink"/>
@@ -7526,7 +7526,7 @@
                 <w:noProof/>
                 <w:webHidden/>
               </w:rPr>
-              <w:instrText xml:space="preserve"> PAGEREF _Toc230777505 \h </w:instrText>
+              <w:instrText xml:space="preserve"> PAGEREF _Toc230777770 \h </w:instrText>
             </w:r>
             <w:r>
               <w:rPr>
@@ -7572,7 +7572,7 @@
               <w:szCs w:val="22"/>
             </w:rPr>
           </w:pPr>
-          <w:hyperlink w:anchor="_Toc230777506" w:history="1">
+          <w:hyperlink w:anchor="_Toc230777771" w:history="1">
             <w:r>
               <w:rPr>
                 <w:rStyle w:val="Hyperlink"/>
@@ -7622,7 +7622,7 @@
                 <w:noProof/>
                 <w:webHidden/>
               </w:rPr>
-              <w:instrText xml:space="preserve"> PAGEREF _Toc230777506 \h </w:instrText>
+              <w:instrText xml:space="preserve"> PAGEREF _Toc230777771 \h </w:instrText>
             </w:r>
             <w:r>
               <w:rPr>
@@ -7668,7 +7668,7 @@
               <w:szCs w:val="22"/>
             </w:rPr>
           </w:pPr>
-          <w:hyperlink w:anchor="_Toc230777507" w:history="1">
+          <w:hyperlink w:anchor="_Toc230777772" w:history="1">
             <w:r>
               <w:rPr>
                 <w:rStyle w:val="Hyperlink"/>
@@ -7718,7 +7718,7 @@
                 <w:noProof/>
                 <w:webHidden/>
               </w:rPr>
-              <w:instrText xml:space="preserve"> PAGEREF _Toc230777507 \h </w:instrText>
+              <w:instrText xml:space="preserve"> PAGEREF _Toc230777772 \h </w:instrText>
             </w:r>
             <w:r>
               <w:rPr>
@@ -7766,7 +7766,7 @@
               <w:szCs w:val="22"/>
             </w:rPr>
           </w:pPr>
-          <w:hyperlink w:anchor="_Toc230777508" w:history="1">
+          <w:hyperlink w:anchor="_Toc230777773" w:history="1">
             <w:r>
               <w:rPr>
                 <w:rStyle w:val="Hyperlink"/>
@@ -7812,7 +7812,7 @@
                 <w:noProof/>
                 <w:webHidden/>
               </w:rPr>
-              <w:instrText xml:space="preserve"> PAGEREF _Toc230777508 \h </w:instrText>
+              <w:instrText xml:space="preserve"> PAGEREF _Toc230777773 \h </w:instrText>
             </w:r>
             <w:r>
               <w:rPr>
@@ -7860,7 +7860,7 @@
               <w:szCs w:val="22"/>
             </w:rPr>
           </w:pPr>
-          <w:hyperlink w:anchor="_Toc230777509" w:history="1">
+          <w:hyperlink w:anchor="_Toc230777774" w:history="1">
             <w:r>
               <w:rPr>
                 <w:rStyle w:val="Hyperlink"/>
@@ -7906,7 +7906,7 @@
                 <w:noProof/>
                 <w:webHidden/>
               </w:rPr>
-              <w:instrText xml:space="preserve"> PAGEREF _Toc230777509 \h </w:instrText>
+              <w:instrText xml:space="preserve"> PAGEREF _Toc230777774 \h </w:instrText>
             </w:r>
             <w:r>
               <w:rPr>
@@ -7954,7 +7954,7 @@
               <w:szCs w:val="22"/>
             </w:rPr>
           </w:pPr>
-          <w:hyperlink w:anchor="_Toc230777510" w:history="1">
+          <w:hyperlink w:anchor="_Toc230777775" w:history="1">
             <w:r>
               <w:rPr>
                 <w:rStyle w:val="Hyperlink"/>
@@ -8000,7 +8000,7 @@
                 <w:noProof/>
                 <w:webHidden/>
               </w:rPr>
-              <w:instrText xml:space="preserve"> PAGEREF _Toc230777510 \h </w:instrText>
+              <w:instrText xml:space="preserve"> PAGEREF _Toc230777775 \h </w:instrText>
             </w:r>
             <w:r>
               <w:rPr>
@@ -8046,7 +8046,7 @@
               <w:szCs w:val="22"/>
             </w:rPr>
           </w:pPr>
-          <w:hyperlink w:anchor="_Toc230777511" w:history="1">
+          <w:hyperlink w:anchor="_Toc230777776" w:history="1">
             <w:r>
               <w:rPr>
                 <w:rStyle w:val="Hyperlink"/>
@@ -8090,7 +8090,7 @@
                 <w:noProof/>
                 <w:webHidden/>
               </w:rPr>
-              <w:instrText xml:space="preserve"> PAGEREF _Toc230777511 \h </w:instrText>
+              <w:instrText xml:space="preserve"> PAGEREF _Toc230777776 \h </w:instrText>
             </w:r>
             <w:r>
               <w:rPr>
@@ -8136,7 +8136,7 @@
               <w:szCs w:val="22"/>
             </w:rPr>
           </w:pPr>
-          <w:hyperlink w:anchor="_Toc230777512" w:history="1">
+          <w:hyperlink w:anchor="_Toc230777777" w:history="1">
             <w:r>
               <w:rPr>
                 <w:rStyle w:val="Hyperlink"/>
@@ -8186,7 +8186,7 @@
                 <w:noProof/>
                 <w:webHidden/>
               </w:rPr>
-              <w:instrText xml:space="preserve"> PAGEREF _Toc230777512 \h </w:instrText>
+              <w:instrText xml:space="preserve"> PAGEREF _Toc230777777 \h </w:instrText>
             </w:r>
             <w:r>
               <w:rPr>
@@ -8232,7 +8232,7 @@
               <w:szCs w:val="22"/>
             </w:rPr>
           </w:pPr>
-          <w:hyperlink w:anchor="_Toc230777513" w:history="1">
+          <w:hyperlink w:anchor="_Toc230777778" w:history="1">
             <w:r>
               <w:rPr>
                 <w:rStyle w:val="Hyperlink"/>
@@ -8282,7 +8282,7 @@
                 <w:noProof/>
                 <w:webHidden/>
               </w:rPr>
-              <w:instrText xml:space="preserve"> PAGEREF _Toc230777513 \h </w:instrText>
+              <w:instrText xml:space="preserve"> PAGEREF _Toc230777778 \h </w:instrText>
             </w:r>
             <w:r>
               <w:rPr>
@@ -8328,7 +8328,7 @@
               <w:szCs w:val="22"/>
             </w:rPr>
           </w:pPr>
-          <w:hyperlink w:anchor="_Toc230777514" w:history="1">
+          <w:hyperlink w:anchor="_Toc230777779" w:history="1">
             <w:r>
               <w:rPr>
                 <w:rStyle w:val="Hyperlink"/>
@@ -8378,7 +8378,7 @@
                 <w:noProof/>
                 <w:webHidden/>
               </w:rPr>
-              <w:instrText xml:space="preserve"> PAGEREF _Toc230777514 \h </w:instrText>
+              <w:instrText xml:space="preserve"> PAGEREF _Toc230777779 \h </w:instrText>
             </w:r>
             <w:r>
               <w:rPr>
@@ -8424,7 +8424,7 @@
               <w:szCs w:val="22"/>
             </w:rPr>
           </w:pPr>
-          <w:hyperlink w:anchor="_Toc230777515" w:history="1">
+          <w:hyperlink w:anchor="_Toc230777780" w:history="1">
             <w:r>
               <w:rPr>
                 <w:rStyle w:val="Hyperlink"/>
@@ -8474,7 +8474,7 @@
                 <w:noProof/>
                 <w:webHidden/>
               </w:rPr>
-              <w:instrText xml:space="preserve"> PAGEREF _Toc230777515 \h </w:instrText>
+              <w:instrText xml:space="preserve"> PAGEREF _Toc230777780 \h </w:instrText>
             </w:r>
             <w:r>
               <w:rPr>
@@ -8522,7 +8522,7 @@
               <w:szCs w:val="22"/>
             </w:rPr>
           </w:pPr>
-          <w:hyperlink w:anchor="_Toc230777516" w:history="1">
+          <w:hyperlink w:anchor="_Toc230777781" w:history="1">
             <w:r>
               <w:rPr>
                 <w:rStyle w:val="Hyperlink"/>
@@ -8568,7 +8568,7 @@
                 <w:noProof/>
                 <w:webHidden/>
               </w:rPr>
-              <w:instrText xml:space="preserve"> PAGEREF _Toc230777516 \h </w:instrText>
+              <w:instrText xml:space="preserve"> PAGEREF _Toc230777781 \h </w:instrText>
             </w:r>
             <w:r>
               <w:rPr>
@@ -8616,7 +8616,7 @@
               <w:szCs w:val="22"/>
             </w:rPr>
           </w:pPr>
-          <w:hyperlink w:anchor="_Toc230777517" w:history="1">
+          <w:hyperlink w:anchor="_Toc230777782" w:history="1">
             <w:r>
               <w:rPr>
                 <w:rStyle w:val="Hyperlink"/>
@@ -8662,7 +8662,7 @@
                 <w:noProof/>
                 <w:webHidden/>
               </w:rPr>
-              <w:instrText xml:space="preserve"> PAGEREF _Toc230777517 \h </w:instrText>
+              <w:instrText xml:space="preserve"> PAGEREF _Toc230777782 \h </w:instrText>
             </w:r>
             <w:r>
               <w:rPr>
@@ -8708,7 +8708,7 @@
               <w:szCs w:val="22"/>
             </w:rPr>
           </w:pPr>
-          <w:hyperlink w:anchor="_Toc230777518" w:history="1">
+          <w:hyperlink w:anchor="_Toc230777783" w:history="1">
             <w:r>
               <w:rPr>
                 <w:rStyle w:val="Hyperlink"/>
@@ -8752,7 +8752,7 @@
                 <w:noProof/>
                 <w:webHidden/>
               </w:rPr>
-              <w:instrText xml:space="preserve"> PAGEREF _Toc230777518 \h </w:instrText>
+              <w:instrText xml:space="preserve"> PAGEREF _Toc230777783 \h </w:instrText>
             </w:r>
             <w:r>
               <w:rPr>
@@ -8798,7 +8798,7 @@
               <w:szCs w:val="22"/>
             </w:rPr>
           </w:pPr>
-          <w:hyperlink w:anchor="_Toc230777519" w:history="1">
+          <w:hyperlink w:anchor="_Toc230777784" w:history="1">
             <w:r>
               <w:rPr>
                 <w:rStyle w:val="Hyperlink"/>
@@ -8842,7 +8842,7 @@
                 <w:noProof/>
                 <w:webHidden/>
               </w:rPr>
-              <w:instrText xml:space="preserve"> PAGEREF _Toc230777519 \h </w:instrText>
+              <w:instrText xml:space="preserve"> PAGEREF _Toc230777784 \h </w:instrText>
             </w:r>
             <w:r>
               <w:rPr>
@@ -8888,7 +8888,7 @@
               <w:szCs w:val="22"/>
             </w:rPr>
           </w:pPr>
-          <w:hyperlink w:anchor="_Toc230777520" w:history="1">
+          <w:hyperlink w:anchor="_Toc230777785" w:history="1">
             <w:r>
               <w:rPr>
                 <w:rStyle w:val="Hyperlink"/>
@@ -8932,7 +8932,7 @@
                 <w:noProof/>
                 <w:webHidden/>
               </w:rPr>
-              <w:instrText xml:space="preserve"> PAGEREF _Toc230777520 \h </w:instrText>
+              <w:instrText xml:space="preserve"> PAGEREF _Toc230777785 \h </w:instrText>
             </w:r>
             <w:r>
               <w:rPr>
@@ -8978,7 +8978,7 @@
               <w:szCs w:val="22"/>
             </w:rPr>
           </w:pPr>
-          <w:hyperlink w:anchor="_Toc230777521" w:history="1">
+          <w:hyperlink w:anchor="_Toc230777786" w:history="1">
             <w:r>
               <w:rPr>
                 <w:rStyle w:val="Hyperlink"/>
@@ -9022,7 +9022,7 @@
                 <w:noProof/>
                 <w:webHidden/>
               </w:rPr>
-              <w:instrText xml:space="preserve"> PAGEREF _Toc230777521 \h </w:instrText>
+              <w:instrText xml:space="preserve"> PAGEREF _Toc230777786 \h </w:instrText>
             </w:r>
             <w:r>
               <w:rPr>
@@ -9068,7 +9068,7 @@
               <w:szCs w:val="22"/>
             </w:rPr>
           </w:pPr>
-          <w:hyperlink w:anchor="_Toc230777522" w:history="1">
+          <w:hyperlink w:anchor="_Toc230777787" w:history="1">
             <w:r>
               <w:rPr>
                 <w:rStyle w:val="Hyperlink"/>
@@ -9112,7 +9112,7 @@
                 <w:noProof/>
                 <w:webHidden/>
               </w:rPr>
-              <w:instrText xml:space="preserve"> PAGEREF _Toc230777522 \h </w:instrText>
+              <w:instrText xml:space="preserve"> PAGEREF _Toc230777787 \h </w:instrText>
             </w:r>
             <w:r>
               <w:rPr>
@@ -9160,7 +9160,7 @@
               <w:szCs w:val="22"/>
             </w:rPr>
           </w:pPr>
-          <w:hyperlink w:anchor="_Toc230777523" w:history="1">
+          <w:hyperlink w:anchor="_Toc230777788" w:history="1">
             <w:r>
               <w:rPr>
                 <w:rStyle w:val="Hyperlink"/>
@@ -9206,7 +9206,7 @@
                 <w:noProof/>
                 <w:webHidden/>
               </w:rPr>
-              <w:instrText xml:space="preserve"> PAGEREF _Toc230777523 \h </w:instrText>
+              <w:instrText xml:space="preserve"> PAGEREF _Toc230777788 \h </w:instrText>
             </w:r>
             <w:r>
               <w:rPr>
@@ -9252,7 +9252,7 @@
               <w:szCs w:val="22"/>
             </w:rPr>
           </w:pPr>
-          <w:hyperlink w:anchor="_Toc230777524" w:history="1">
+          <w:hyperlink w:anchor="_Toc230777789" w:history="1">
             <w:r>
               <w:rPr>
                 <w:rStyle w:val="Hyperlink"/>
@@ -9296,7 +9296,7 @@
                 <w:noProof/>
                 <w:webHidden/>
               </w:rPr>
-              <w:instrText xml:space="preserve"> PAGEREF _Toc230777524 \h </w:instrText>
+              <w:instrText xml:space="preserve"> PAGEREF _Toc230777789 \h </w:instrText>
             </w:r>
             <w:r>
               <w:rPr>
@@ -9342,7 +9342,7 @@
               <w:szCs w:val="22"/>
             </w:rPr>
           </w:pPr>
-          <w:hyperlink w:anchor="_Toc230777525" w:history="1">
+          <w:hyperlink w:anchor="_Toc230777790" w:history="1">
             <w:r>
               <w:rPr>
                 <w:rStyle w:val="Hyperlink"/>
@@ -9386,7 +9386,7 @@
                 <w:noProof/>
                 <w:webHidden/>
               </w:rPr>
-              <w:instrText xml:space="preserve"> PAGEREF _Toc230777525 \h </w:instrText>
+              <w:instrText xml:space="preserve"> PAGEREF _Toc230777790 \h </w:instrText>
             </w:r>
             <w:r>
               <w:rPr>
@@ -9432,7 +9432,7 @@
               <w:szCs w:val="22"/>
             </w:rPr>
           </w:pPr>
-          <w:hyperlink w:anchor="_Toc230777526" w:history="1">
+          <w:hyperlink w:anchor="_Toc230777791" w:history="1">
             <w:r>
               <w:rPr>
                 <w:rStyle w:val="Hyperlink"/>
@@ -9476,7 +9476,7 @@
                 <w:noProof/>
                 <w:webHidden/>
               </w:rPr>
-              <w:instrText xml:space="preserve"> PAGEREF _Toc230777526 \h </w:instrText>
+              <w:instrText xml:space="preserve"> PAGEREF _Toc230777791 \h </w:instrText>
             </w:r>
             <w:r>
               <w:rPr>
@@ -9522,7 +9522,7 @@
               <w:szCs w:val="22"/>
             </w:rPr>
           </w:pPr>
-          <w:hyperlink w:anchor="_Toc230777527" w:history="1">
+          <w:hyperlink w:anchor="_Toc230777792" w:history="1">
             <w:r>
               <w:rPr>
                 <w:rStyle w:val="Hyperlink"/>
@@ -9566,7 +9566,7 @@
                 <w:noProof/>
                 <w:webHidden/>
               </w:rPr>
-              <w:instrText xml:space="preserve"> PAGEREF _Toc230777527 \h </w:instrText>
+              <w:instrText xml:space="preserve"> PAGEREF _Toc230777792 \h </w:instrText>
             </w:r>
             <w:r>
               <w:rPr>
@@ -9614,7 +9614,7 @@
               <w:szCs w:val="22"/>
             </w:rPr>
           </w:pPr>
-          <w:hyperlink w:anchor="_Toc230777528" w:history="1">
+          <w:hyperlink w:anchor="_Toc230777793" w:history="1">
             <w:r>
               <w:rPr>
                 <w:rStyle w:val="Hyperlink"/>
@@ -9660,7 +9660,7 @@
                 <w:noProof/>
                 <w:webHidden/>
               </w:rPr>
-              <w:instrText xml:space="preserve"> PAGEREF _Toc230777528 \h </w:instrText>
+              <w:instrText xml:space="preserve"> PAGEREF _Toc230777793 \h </w:instrText>
             </w:r>
             <w:r>
               <w:rPr>
@@ -9706,7 +9706,7 @@
               <w:szCs w:val="22"/>
             </w:rPr>
           </w:pPr>
-          <w:hyperlink w:anchor="_Toc230777529" w:history="1">
+          <w:hyperlink w:anchor="_Toc230777794" w:history="1">
             <w:r>
               <w:rPr>
                 <w:rStyle w:val="Hyperlink"/>
@@ -9751,7 +9751,7 @@
                 <w:noProof/>
                 <w:webHidden/>
               </w:rPr>
-              <w:instrText xml:space="preserve"> PAGEREF _Toc230777529 \h </w:instrText>
+              <w:instrText xml:space="preserve"> PAGEREF _Toc230777794 \h </w:instrText>
             </w:r>
             <w:r>
               <w:rPr>
@@ -9797,7 +9797,7 @@
               <w:szCs w:val="22"/>
             </w:rPr>
           </w:pPr>
-          <w:hyperlink w:anchor="_Toc230777530" w:history="1">
+          <w:hyperlink w:anchor="_Toc230777795" w:history="1">
             <w:r>
               <w:rPr>
                 <w:rStyle w:val="Hyperlink"/>
@@ -9842,7 +9842,7 @@
                 <w:noProof/>
                 <w:webHidden/>
               </w:rPr>
-              <w:instrText xml:space="preserve"> PAGEREF _Toc230777530 \h </w:instrText>
+              <w:instrText xml:space="preserve"> PAGEREF _Toc230777795 \h </w:instrText>
             </w:r>
             <w:r>
               <w:rPr>
@@ -9888,7 +9888,7 @@
               <w:szCs w:val="22"/>
             </w:rPr>
           </w:pPr>
-          <w:hyperlink w:anchor="_Toc230777531" w:history="1">
+          <w:hyperlink w:anchor="_Toc230777796" w:history="1">
             <w:r>
               <w:rPr>
                 <w:rStyle w:val="Hyperlink"/>
@@ -9933,7 +9933,7 @@
                 <w:noProof/>
                 <w:webHidden/>
               </w:rPr>
-              <w:instrText xml:space="preserve"> PAGEREF _Toc230777531 \h </w:instrText>
+              <w:instrText xml:space="preserve"> PAGEREF _Toc230777796 \h </w:instrText>
             </w:r>
             <w:r>
               <w:rPr>
@@ -9981,7 +9981,7 @@
               <w:szCs w:val="22"/>
             </w:rPr>
           </w:pPr>
-          <w:hyperlink w:anchor="_Toc230777532" w:history="1">
+          <w:hyperlink w:anchor="_Toc230777797" w:history="1">
             <w:r>
               <w:rPr>
                 <w:rStyle w:val="Hyperlink"/>
@@ -10027,7 +10027,7 @@
                 <w:noProof/>
                 <w:webHidden/>
               </w:rPr>
-              <w:instrText xml:space="preserve"> PAGEREF _Toc230777532 \h </w:instrText>
+              <w:instrText xml:space="preserve"> PAGEREF _Toc230777797 \h </w:instrText>
             </w:r>
             <w:r>
               <w:rPr>
@@ -10075,7 +10075,7 @@
               <w:szCs w:val="22"/>
             </w:rPr>
           </w:pPr>
-          <w:hyperlink w:anchor="_Toc230777533" w:history="1">
+          <w:hyperlink w:anchor="_Toc230777798" w:history="1">
             <w:r>
               <w:rPr>
                 <w:rStyle w:val="Hyperlink"/>
@@ -10122,7 +10122,7 @@
                 <w:noProof/>
                 <w:webHidden/>
               </w:rPr>
-              <w:instrText xml:space="preserve"> PAGEREF _Toc230777533 \h </w:instrText>
+              <w:instrText xml:space="preserve"> PAGEREF _Toc230777798 \h </w:instrText>
             </w:r>
             <w:r>
               <w:rPr>
@@ -10170,7 +10170,7 @@
               <w:szCs w:val="22"/>
             </w:rPr>
           </w:pPr>
-          <w:hyperlink w:anchor="_Toc230777534" w:history="1">
+          <w:hyperlink w:anchor="_Toc230777799" w:history="1">
             <w:r>
               <w:rPr>
                 <w:rStyle w:val="Hyperlink"/>
@@ -10216,7 +10216,7 @@
                 <w:noProof/>
                 <w:webHidden/>
               </w:rPr>
-              <w:instrText xml:space="preserve"> PAGEREF _Toc230777534 \h </w:instrText>
+              <w:instrText xml:space="preserve"> PAGEREF _Toc230777799 \h </w:instrText>
             </w:r>
             <w:r>
               <w:rPr>
@@ -10236,7 +10236,7 @@
                 <w:noProof/>
                 <w:webHidden/>
               </w:rPr>
-              <w:t>55</w:t>
+              <w:t>54</w:t>
             </w:r>
             <w:r>
               <w:rPr>
@@ -10263,7 +10263,7 @@
               <w:szCs w:val="22"/>
             </w:rPr>
           </w:pPr>
-          <w:hyperlink w:anchor="_Toc230777535" w:history="1">
+          <w:hyperlink w:anchor="_Toc230777800" w:history="1">
             <w:r>
               <w:rPr>
                 <w:rStyle w:val="Hyperlink"/>
@@ -10290,7 +10290,7 @@
                 <w:noProof/>
                 <w:webHidden/>
               </w:rPr>
-              <w:instrText xml:space="preserve"> PAGEREF _Toc230777535 \h </w:instrText>
+              <w:instrText xml:space="preserve"> PAGEREF _Toc230777800 \h </w:instrText>
             </w:r>
             <w:r>
               <w:rPr>
@@ -10310,7 +10310,7 @@
                 <w:noProof/>
                 <w:webHidden/>
               </w:rPr>
-              <w:t>56</w:t>
+              <w:t>55</w:t>
             </w:r>
             <w:r>
               <w:rPr>
@@ -10366,7 +10366,7 @@
           <w:lang w:val="pt-BR"/>
         </w:rPr>
       </w:pPr>
-      <w:bookmarkStart w:id="1" w:name="_Toc230777470"/>
+      <w:bookmarkStart w:id="1" w:name="_Toc230777735"/>
       <w:r>
         <w:rPr>
           <w:lang w:val="pt-BR"/>
@@ -10380,7 +10380,7 @@
       <w:pPr>
         <w:pStyle w:val="Ttulo2"/>
       </w:pPr>
-      <w:bookmarkStart w:id="2" w:name="_Toc230777471"/>
+      <w:bookmarkStart w:id="2" w:name="_Toc230777736"/>
       <w:r>
         <w:t>Introdução</w:t>
       </w:r>
@@ -10413,7 +10413,7 @@
       <w:bookmarkStart w:id="3" w:name="_Toc165310847"/>
       <w:bookmarkStart w:id="4" w:name="_Toc182927330"/>
       <w:bookmarkStart w:id="5" w:name="_Toc275318808"/>
-      <w:bookmarkStart w:id="6" w:name="_Toc230777472"/>
+      <w:bookmarkStart w:id="6" w:name="_Toc230777737"/>
       <w:r>
         <w:t>Métodos</w:t>
       </w:r>
@@ -11034,7 +11034,7 @@
       <w:pPr>
         <w:pStyle w:val="Ttulo2"/>
       </w:pPr>
-      <w:bookmarkStart w:id="13" w:name="_Toc230777473"/>
+      <w:bookmarkStart w:id="13" w:name="_Toc230777738"/>
       <w:r>
         <w:t>Cronograma do projeto</w:t>
       </w:r>
@@ -11108,7 +11108,7 @@
       <w:bookmarkStart w:id="16" w:name="_Toc165310856"/>
       <w:bookmarkStart w:id="17" w:name="_Toc182927332"/>
       <w:bookmarkStart w:id="18" w:name="_Toc1365652471"/>
-      <w:bookmarkStart w:id="19" w:name="_Toc230777474"/>
+      <w:bookmarkStart w:id="19" w:name="_Toc230777739"/>
       <w:r>
         <w:rPr>
           <w:lang w:val="pt-BR"/>
@@ -11130,7 +11130,7 @@
       <w:bookmarkStart w:id="20" w:name="_Toc165310857"/>
       <w:bookmarkStart w:id="21" w:name="_Toc182927333"/>
       <w:bookmarkStart w:id="22" w:name="_Toc1600256300"/>
-      <w:bookmarkStart w:id="23" w:name="_Toc230777475"/>
+      <w:bookmarkStart w:id="23" w:name="_Toc230777740"/>
       <w:r>
         <w:t>Geral</w:t>
       </w:r>
@@ -11219,7 +11219,7 @@
       </w:pPr>
       <w:bookmarkStart w:id="24" w:name="_Toc182927334"/>
       <w:bookmarkStart w:id="25" w:name="_Toc997807490"/>
-      <w:bookmarkStart w:id="26" w:name="_Toc230777476"/>
+      <w:bookmarkStart w:id="26" w:name="_Toc230777741"/>
       <w:r>
         <w:t>Especí</w:t>
       </w:r>
@@ -11456,7 +11456,7 @@
           <w:lang w:val="pt-BR"/>
         </w:rPr>
       </w:pPr>
-      <w:bookmarkStart w:id="29" w:name="_Toc230777477"/>
+      <w:bookmarkStart w:id="29" w:name="_Toc230777742"/>
       <w:r>
         <w:rPr>
           <w:lang w:val="pt-BR"/>
@@ -11484,7 +11484,7 @@
       <w:pPr>
         <w:pStyle w:val="Ttulo2"/>
       </w:pPr>
-      <w:bookmarkStart w:id="30" w:name="_Toc230777478"/>
+      <w:bookmarkStart w:id="30" w:name="_Toc230777743"/>
       <w:r>
         <w:t>Histórias do Usuário</w:t>
       </w:r>
@@ -11807,7 +11807,7 @@
       <w:pPr>
         <w:pStyle w:val="Ttulo2"/>
       </w:pPr>
-      <w:bookmarkStart w:id="31" w:name="_Toc230777479"/>
+      <w:bookmarkStart w:id="31" w:name="_Toc230777744"/>
       <w:r>
         <w:t>Requisitos Funcionais</w:t>
       </w:r>
@@ -11827,7 +11827,7 @@
       <w:pPr>
         <w:pStyle w:val="Ttulo3"/>
       </w:pPr>
-      <w:bookmarkStart w:id="32" w:name="_Toc230777480"/>
+      <w:bookmarkStart w:id="32" w:name="_Toc230777745"/>
       <w:r>
         <w:t xml:space="preserve">RF1 </w:t>
       </w:r>
@@ -11896,7 +11896,7 @@
       <w:pPr>
         <w:pStyle w:val="Ttulo3"/>
       </w:pPr>
-      <w:bookmarkStart w:id="33" w:name="_Toc230777481"/>
+      <w:bookmarkStart w:id="33" w:name="_Toc230777746"/>
       <w:r>
         <w:t xml:space="preserve">RF2 </w:t>
       </w:r>
@@ -11943,7 +11943,7 @@
       <w:pPr>
         <w:pStyle w:val="Ttulo3"/>
       </w:pPr>
-      <w:bookmarkStart w:id="34" w:name="_Toc230777482"/>
+      <w:bookmarkStart w:id="34" w:name="_Toc230777747"/>
       <w:r>
         <w:t>RF</w:t>
       </w:r>
@@ -11988,7 +11988,7 @@
       <w:pPr>
         <w:pStyle w:val="Ttulo3"/>
       </w:pPr>
-      <w:bookmarkStart w:id="35" w:name="_Toc230777483"/>
+      <w:bookmarkStart w:id="35" w:name="_Toc230777748"/>
       <w:r>
         <w:t>RF</w:t>
       </w:r>
@@ -12027,7 +12027,7 @@
       <w:pPr>
         <w:pStyle w:val="Ttulo3"/>
       </w:pPr>
-      <w:bookmarkStart w:id="36" w:name="_Toc230777484"/>
+      <w:bookmarkStart w:id="36" w:name="_Toc230777749"/>
       <w:r>
         <w:t>RF</w:t>
       </w:r>
@@ -12078,7 +12078,7 @@
       <w:pPr>
         <w:pStyle w:val="Ttulo3"/>
       </w:pPr>
-      <w:bookmarkStart w:id="37" w:name="_Toc230777485"/>
+      <w:bookmarkStart w:id="37" w:name="_Toc230777750"/>
       <w:r>
         <w:t>RF</w:t>
       </w:r>
@@ -12139,7 +12139,7 @@
       <w:pPr>
         <w:pStyle w:val="Ttulo3"/>
       </w:pPr>
-      <w:bookmarkStart w:id="38" w:name="_Toc230777486"/>
+      <w:bookmarkStart w:id="38" w:name="_Toc230777751"/>
       <w:r>
         <w:t>RF</w:t>
       </w:r>
@@ -12181,7 +12181,7 @@
       <w:pPr>
         <w:pStyle w:val="Ttulo3"/>
       </w:pPr>
-      <w:bookmarkStart w:id="39" w:name="_Toc230777487"/>
+      <w:bookmarkStart w:id="39" w:name="_Toc230777752"/>
       <w:r>
         <w:lastRenderedPageBreak/>
         <w:t>RF</w:t>
@@ -12218,7 +12218,7 @@
       <w:pPr>
         <w:pStyle w:val="Ttulo3"/>
       </w:pPr>
-      <w:bookmarkStart w:id="40" w:name="_Toc230777488"/>
+      <w:bookmarkStart w:id="40" w:name="_Toc230777753"/>
       <w:r>
         <w:t>RF</w:t>
       </w:r>
@@ -12257,7 +12257,7 @@
       <w:pPr>
         <w:pStyle w:val="Ttulo3"/>
       </w:pPr>
-      <w:bookmarkStart w:id="41" w:name="_Toc230777489"/>
+      <w:bookmarkStart w:id="41" w:name="_Toc230777754"/>
       <w:r>
         <w:t>RF</w:t>
       </w:r>
@@ -12318,7 +12318,7 @@
       <w:pPr>
         <w:pStyle w:val="Ttulo3"/>
       </w:pPr>
-      <w:bookmarkStart w:id="42" w:name="_Toc230777490"/>
+      <w:bookmarkStart w:id="42" w:name="_Toc230777755"/>
       <w:r>
         <w:t>RF1</w:t>
       </w:r>
@@ -12387,7 +12387,7 @@
       <w:pPr>
         <w:pStyle w:val="Ttulo3"/>
       </w:pPr>
-      <w:bookmarkStart w:id="43" w:name="_Toc230777491"/>
+      <w:bookmarkStart w:id="43" w:name="_Toc230777756"/>
       <w:r>
         <w:t>RF</w:t>
       </w:r>
@@ -12414,7 +12414,7 @@
       <w:pPr>
         <w:pStyle w:val="Ttulo3"/>
       </w:pPr>
-      <w:bookmarkStart w:id="44" w:name="_Toc230777492"/>
+      <w:bookmarkStart w:id="44" w:name="_Toc230777757"/>
       <w:r>
         <w:t>RF</w:t>
       </w:r>
@@ -12441,7 +12441,7 @@
       <w:pPr>
         <w:pStyle w:val="Ttulo3"/>
       </w:pPr>
-      <w:bookmarkStart w:id="45" w:name="_Toc230777493"/>
+      <w:bookmarkStart w:id="45" w:name="_Toc230777758"/>
       <w:r>
         <w:t>RF1</w:t>
       </w:r>
@@ -12477,7 +12477,7 @@
       <w:pPr>
         <w:pStyle w:val="Ttulo3"/>
       </w:pPr>
-      <w:bookmarkStart w:id="46" w:name="_Toc230777494"/>
+      <w:bookmarkStart w:id="46" w:name="_Toc230777759"/>
       <w:r>
         <w:t>RF</w:t>
       </w:r>
@@ -12532,7 +12532,7 @@
       <w:pPr>
         <w:pStyle w:val="Ttulo3"/>
       </w:pPr>
-      <w:bookmarkStart w:id="47" w:name="_Toc230777495"/>
+      <w:bookmarkStart w:id="47" w:name="_Toc230777760"/>
       <w:r>
         <w:t>RF</w:t>
       </w:r>
@@ -12593,7 +12593,7 @@
       <w:pPr>
         <w:pStyle w:val="Ttulo3"/>
       </w:pPr>
-      <w:bookmarkStart w:id="48" w:name="_Toc230777496"/>
+      <w:bookmarkStart w:id="48" w:name="_Toc230777761"/>
       <w:r>
         <w:lastRenderedPageBreak/>
         <w:t>RF</w:t>
@@ -12632,7 +12632,7 @@
       <w:pPr>
         <w:pStyle w:val="Ttulo3"/>
       </w:pPr>
-      <w:bookmarkStart w:id="49" w:name="_Toc230777497"/>
+      <w:bookmarkStart w:id="49" w:name="_Toc230777762"/>
       <w:r>
         <w:t>RF</w:t>
       </w:r>
@@ -12670,7 +12670,7 @@
       <w:pPr>
         <w:pStyle w:val="Ttulo3"/>
       </w:pPr>
-      <w:bookmarkStart w:id="50" w:name="_Toc230777498"/>
+      <w:bookmarkStart w:id="50" w:name="_Toc230777763"/>
       <w:r>
         <w:t>RF</w:t>
       </w:r>
@@ -12752,7 +12752,7 @@
         <w:widowControl/>
         <w:spacing w:after="160" w:line="278" w:lineRule="auto"/>
       </w:pPr>
-      <w:bookmarkStart w:id="51" w:name="_Toc230777499"/>
+      <w:bookmarkStart w:id="51" w:name="_Toc230777764"/>
       <w:r>
         <w:t>RF</w:t>
       </w:r>
@@ -12793,7 +12793,7 @@
         <w:widowControl/>
         <w:spacing w:after="160" w:line="278" w:lineRule="auto"/>
       </w:pPr>
-      <w:bookmarkStart w:id="52" w:name="_Toc230777500"/>
+      <w:bookmarkStart w:id="52" w:name="_Toc230777765"/>
       <w:r>
         <w:t>RF</w:t>
       </w:r>
@@ -12821,7 +12821,7 @@
       <w:pPr>
         <w:pStyle w:val="Ttulo3"/>
       </w:pPr>
-      <w:bookmarkStart w:id="53" w:name="_Toc230777501"/>
+      <w:bookmarkStart w:id="53" w:name="_Toc230777766"/>
       <w:r>
         <w:t>RF</w:t>
       </w:r>
@@ -12892,7 +12892,7 @@
       <w:pPr>
         <w:pStyle w:val="Ttulo3"/>
       </w:pPr>
-      <w:bookmarkStart w:id="54" w:name="_Toc230777502"/>
+      <w:bookmarkStart w:id="54" w:name="_Toc230777767"/>
       <w:r>
         <w:t>RF</w:t>
       </w:r>
@@ -12944,7 +12944,7 @@
       <w:pPr>
         <w:pStyle w:val="Ttulo3"/>
       </w:pPr>
-      <w:bookmarkStart w:id="55" w:name="_Toc230777503"/>
+      <w:bookmarkStart w:id="55" w:name="_Toc230777768"/>
       <w:r>
         <w:t>RF</w:t>
       </w:r>
@@ -12992,7 +12992,7 @@
       <w:pPr>
         <w:pStyle w:val="Ttulo2"/>
       </w:pPr>
-      <w:bookmarkStart w:id="56" w:name="_Toc230777504"/>
+      <w:bookmarkStart w:id="56" w:name="_Toc230777769"/>
       <w:r>
         <w:t>Requisitos Não Funcionais</w:t>
       </w:r>
@@ -13231,7 +13231,7 @@
       </w:pPr>
       <w:bookmarkStart w:id="60" w:name="_Toc182927339"/>
       <w:bookmarkStart w:id="61" w:name="_Toc326436659"/>
-      <w:bookmarkStart w:id="62" w:name="_Toc230777505"/>
+      <w:bookmarkStart w:id="62" w:name="_Toc230777770"/>
       <w:r>
         <w:lastRenderedPageBreak/>
         <w:t>Diagrama de</w:t>
@@ -13306,7 +13306,7 @@
       <w:bookmarkStart w:id="82" w:name="_Toc213647691"/>
       <w:bookmarkStart w:id="83" w:name="_Toc213665795"/>
       <w:bookmarkStart w:id="84" w:name="_Toc213665834"/>
-      <w:bookmarkStart w:id="85" w:name="_Toc230777428"/>
+      <w:bookmarkStart w:id="85" w:name="_Toc230777801"/>
       <w:r>
         <w:t xml:space="preserve">Figura </w:t>
       </w:r>
@@ -13432,7 +13432,7 @@
       <w:pPr>
         <w:pStyle w:val="Ttulo3"/>
       </w:pPr>
-      <w:bookmarkStart w:id="86" w:name="_Toc230777506"/>
+      <w:bookmarkStart w:id="86" w:name="_Toc230777771"/>
       <w:r>
         <w:t>Casos de Usos de Alto Nível</w:t>
       </w:r>
@@ -13822,7 +13822,7 @@
       <w:pPr>
         <w:pStyle w:val="Ttulo3"/>
       </w:pPr>
-      <w:bookmarkStart w:id="87" w:name="_Toc230777507"/>
+      <w:bookmarkStart w:id="87" w:name="_Toc230777772"/>
       <w:r>
         <w:t>Casos de Usos Detalhados</w:t>
       </w:r>
@@ -17056,7 +17056,7 @@
         <w:pStyle w:val="Ttulo1"/>
       </w:pPr>
       <w:bookmarkStart w:id="88" w:name="_Toc489932645"/>
-      <w:bookmarkStart w:id="89" w:name="_Toc230777508"/>
+      <w:bookmarkStart w:id="89" w:name="_Toc230777773"/>
       <w:r>
         <w:t>Diagrama</w:t>
       </w:r>
@@ -17137,7 +17137,7 @@
       <w:pPr>
         <w:pStyle w:val="Ttulo1"/>
       </w:pPr>
-      <w:bookmarkStart w:id="90" w:name="_Toc230777509"/>
+      <w:bookmarkStart w:id="90" w:name="_Toc230777774"/>
       <w:r>
         <w:lastRenderedPageBreak/>
         <w:t>Diagrama BPMN</w:t>
@@ -17150,31 +17150,18 @@
       </w:pPr>
       <w:bookmarkStart w:id="91" w:name="_Toc168898593"/>
       <w:bookmarkStart w:id="92" w:name="_Toc169517816"/>
-      <w:bookmarkStart w:id="93" w:name="_Toc230777429"/>
+      <w:bookmarkStart w:id="93" w:name="_Toc230777802"/>
       <w:r>
         <w:t xml:space="preserve">Figura </w:t>
       </w:r>
-      <w:r>
-        <w:fldChar w:fldCharType="begin"/>
-      </w:r>
-      <w:r>
-        <w:instrText xml:space="preserve"> SEQ Figura \* ARABIC </w:instrText>
-      </w:r>
-      <w:r>
-        <w:fldChar w:fldCharType="separate"/>
-      </w:r>
-      <w:r>
-        <w:rPr>
-          <w:noProof/>
-        </w:rPr>
-        <w:t>2</w:t>
-      </w:r>
-      <w:r>
-        <w:rPr>
-          <w:noProof/>
-        </w:rPr>
-        <w:fldChar w:fldCharType="end"/>
-      </w:r>
+      <w:fldSimple w:instr=" SEQ Figura \* ARABIC ">
+        <w:r>
+          <w:rPr>
+            <w:noProof/>
+          </w:rPr>
+          <w:t>2</w:t>
+        </w:r>
+      </w:fldSimple>
       <w:r>
         <w:t xml:space="preserve"> – </w:t>
       </w:r>
@@ -17302,7 +17289,7 @@
           <w:sz w:val="20"/>
         </w:rPr>
       </w:pPr>
-      <w:bookmarkStart w:id="95" w:name="_Toc230777510"/>
+      <w:bookmarkStart w:id="95" w:name="_Toc230777775"/>
       <w:r>
         <w:rPr>
           <w:rStyle w:val="FiguraChar"/>
@@ -17332,7 +17319,7 @@
       </w:pPr>
       <w:bookmarkStart w:id="96" w:name="_Toc168898594"/>
       <w:bookmarkStart w:id="97" w:name="_Toc169517817"/>
-      <w:bookmarkStart w:id="98" w:name="_Toc230777430"/>
+      <w:bookmarkStart w:id="98" w:name="_Toc230777803"/>
       <w:r>
         <w:rPr>
           <w:szCs w:val="24"/>
@@ -17461,7 +17448,7 @@
       <w:pPr>
         <w:pStyle w:val="Ttulo2"/>
       </w:pPr>
-      <w:bookmarkStart w:id="99" w:name="_Toc230777511"/>
+      <w:bookmarkStart w:id="99" w:name="_Toc230777776"/>
       <w:r>
         <w:t>SUBPROCESSOS</w:t>
       </w:r>
@@ -17471,7 +17458,7 @@
       <w:pPr>
         <w:pStyle w:val="Ttulo3"/>
       </w:pPr>
-      <w:bookmarkStart w:id="100" w:name="_Toc230777512"/>
+      <w:bookmarkStart w:id="100" w:name="_Toc230777777"/>
       <w:r>
         <w:t>Agendamentos</w:t>
       </w:r>
@@ -17486,7 +17473,7 @@
       </w:pPr>
       <w:bookmarkStart w:id="101" w:name="_Toc168898595"/>
       <w:bookmarkStart w:id="102" w:name="_Toc169517818"/>
-      <w:bookmarkStart w:id="103" w:name="_Toc230777431"/>
+      <w:bookmarkStart w:id="103" w:name="_Toc230777804"/>
       <w:r>
         <w:rPr>
           <w:szCs w:val="24"/>
@@ -17604,7 +17591,7 @@
       <w:pPr>
         <w:pStyle w:val="Ttulo3"/>
       </w:pPr>
-      <w:bookmarkStart w:id="104" w:name="_Toc230777513"/>
+      <w:bookmarkStart w:id="104" w:name="_Toc230777778"/>
       <w:r>
         <w:lastRenderedPageBreak/>
         <w:t>Clientes</w:t>
@@ -17622,7 +17609,7 @@
       </w:pPr>
       <w:bookmarkStart w:id="105" w:name="_Toc168898596"/>
       <w:bookmarkStart w:id="106" w:name="_Toc169517819"/>
-      <w:bookmarkStart w:id="107" w:name="_Toc230777432"/>
+      <w:bookmarkStart w:id="107" w:name="_Toc230777805"/>
       <w:proofErr w:type="spellStart"/>
       <w:r>
         <w:rPr>
@@ -17779,7 +17766,7 @@
       <w:pPr>
         <w:pStyle w:val="Ttulo3"/>
       </w:pPr>
-      <w:bookmarkStart w:id="108" w:name="_Toc230777514"/>
+      <w:bookmarkStart w:id="108" w:name="_Toc230777779"/>
       <w:r>
         <w:t>Financeiro</w:t>
       </w:r>
@@ -17794,7 +17781,7 @@
       </w:pPr>
       <w:bookmarkStart w:id="109" w:name="_Toc168898597"/>
       <w:bookmarkStart w:id="110" w:name="_Toc169517820"/>
-      <w:bookmarkStart w:id="111" w:name="_Toc230777433"/>
+      <w:bookmarkStart w:id="111" w:name="_Toc230777806"/>
       <w:r>
         <w:rPr>
           <w:szCs w:val="24"/>
@@ -17922,7 +17909,7 @@
       <w:pPr>
         <w:pStyle w:val="Ttulo3"/>
       </w:pPr>
-      <w:bookmarkStart w:id="112" w:name="_Toc230777515"/>
+      <w:bookmarkStart w:id="112" w:name="_Toc230777780"/>
       <w:r>
         <w:t>Serviços</w:t>
       </w:r>
@@ -17935,7 +17922,7 @@
           <w:szCs w:val="24"/>
         </w:rPr>
       </w:pPr>
-      <w:bookmarkStart w:id="113" w:name="_Toc230777434"/>
+      <w:bookmarkStart w:id="113" w:name="_Toc230777807"/>
       <w:r>
         <w:rPr>
           <w:szCs w:val="24"/>
@@ -18090,7 +18077,7 @@
           <w:sz w:val="20"/>
         </w:rPr>
       </w:pPr>
-      <w:bookmarkStart w:id="114" w:name="_Toc230777516"/>
+      <w:bookmarkStart w:id="114" w:name="_Toc230777781"/>
       <w:r>
         <w:rPr>
           <w:rStyle w:val="FiguraChar"/>
@@ -18104,7 +18091,7 @@
       <w:pPr>
         <w:pStyle w:val="Figura"/>
       </w:pPr>
-      <w:bookmarkStart w:id="115" w:name="_Toc230777435"/>
+      <w:bookmarkStart w:id="115" w:name="_Toc230777808"/>
       <w:r>
         <w:rPr>
           <w:szCs w:val="24"/>
@@ -18244,7 +18231,7 @@
           <w:u w:val="single"/>
         </w:rPr>
       </w:pPr>
-      <w:bookmarkStart w:id="117" w:name="_Toc230777517"/>
+      <w:bookmarkStart w:id="117" w:name="_Toc230777782"/>
       <w:r>
         <w:lastRenderedPageBreak/>
         <w:t>Estudo de viabilidade</w:t>
@@ -18291,7 +18278,7 @@
       </w:pPr>
       <w:bookmarkStart w:id="118" w:name="_Toc182927342"/>
       <w:bookmarkStart w:id="119" w:name="_Toc857622307"/>
-      <w:bookmarkStart w:id="120" w:name="_Toc230777518"/>
+      <w:bookmarkStart w:id="120" w:name="_Toc230777783"/>
       <w:r>
         <w:t>Viabilidade de Mercado</w:t>
       </w:r>
@@ -18402,7 +18389,7 @@
       </w:pPr>
       <w:bookmarkStart w:id="121" w:name="_Toc182927343"/>
       <w:bookmarkStart w:id="122" w:name="_Toc2048096091"/>
-      <w:bookmarkStart w:id="123" w:name="_Toc230777519"/>
+      <w:bookmarkStart w:id="123" w:name="_Toc230777784"/>
       <w:r>
         <w:t xml:space="preserve">Viabilidade </w:t>
       </w:r>
@@ -18845,7 +18832,7 @@
         <w:pStyle w:val="Ttulo2"/>
       </w:pPr>
       <w:bookmarkStart w:id="124" w:name="_Toc512747447"/>
-      <w:bookmarkStart w:id="125" w:name="_Toc230777520"/>
+      <w:bookmarkStart w:id="125" w:name="_Toc230777785"/>
       <w:r>
         <w:t xml:space="preserve">Viabilidade </w:t>
       </w:r>
@@ -18985,7 +18972,7 @@
       <w:pPr>
         <w:pStyle w:val="Ttulo2"/>
       </w:pPr>
-      <w:bookmarkStart w:id="126" w:name="_Toc230777521"/>
+      <w:bookmarkStart w:id="126" w:name="_Toc230777786"/>
       <w:r>
         <w:t>Viabilidade Econômica</w:t>
       </w:r>
@@ -19142,7 +19129,7 @@
       </w:pPr>
       <w:bookmarkStart w:id="127" w:name="_Toc182927345"/>
       <w:bookmarkStart w:id="128" w:name="_Toc1966489106"/>
-      <w:bookmarkStart w:id="129" w:name="_Toc230777522"/>
+      <w:bookmarkStart w:id="129" w:name="_Toc230777787"/>
       <w:r>
         <w:t>Conclusão do Estudo de Viabilidade:</w:t>
       </w:r>
@@ -19207,7 +19194,7 @@
       </w:pPr>
       <w:bookmarkStart w:id="130" w:name="_Toc182927346"/>
       <w:bookmarkStart w:id="131" w:name="_Toc1016310750"/>
-      <w:bookmarkStart w:id="132" w:name="_Toc230777523"/>
+      <w:bookmarkStart w:id="132" w:name="_Toc230777788"/>
       <w:r>
         <w:lastRenderedPageBreak/>
         <w:t>Regras de negócio</w:t>
@@ -19315,7 +19302,7 @@
       <w:pPr>
         <w:pStyle w:val="Figura"/>
       </w:pPr>
-      <w:bookmarkStart w:id="133" w:name="_Toc230777436"/>
+      <w:bookmarkStart w:id="133" w:name="_Toc230777809"/>
       <w:r>
         <w:rPr>
           <w:szCs w:val="24"/>
@@ -19449,7 +19436,7 @@
       <w:bookmarkStart w:id="134" w:name="_Toc182927347"/>
       <w:bookmarkStart w:id="135" w:name="_Toc1999012226"/>
       <w:bookmarkStart w:id="136" w:name="_Toc165310879"/>
-      <w:bookmarkStart w:id="137" w:name="_Toc230777524"/>
+      <w:bookmarkStart w:id="137" w:name="_Toc230777789"/>
       <w:r>
         <w:t xml:space="preserve">O </w:t>
       </w:r>
@@ -19494,7 +19481,7 @@
       </w:pPr>
       <w:bookmarkStart w:id="139" w:name="_Toc182927348"/>
       <w:bookmarkStart w:id="140" w:name="_Toc1824459023"/>
-      <w:bookmarkStart w:id="141" w:name="_Toc230777525"/>
+      <w:bookmarkStart w:id="141" w:name="_Toc230777790"/>
       <w:r>
         <w:lastRenderedPageBreak/>
         <w:t>Como será elaborado?</w:t>
@@ -19617,7 +19604,7 @@
       </w:pPr>
       <w:bookmarkStart w:id="144" w:name="_Toc182927349"/>
       <w:bookmarkStart w:id="145" w:name="_Toc1308799086"/>
-      <w:bookmarkStart w:id="146" w:name="_Toc230777526"/>
+      <w:bookmarkStart w:id="146" w:name="_Toc230777791"/>
       <w:r>
         <w:t>Para quem será elaborado?</w:t>
       </w:r>
@@ -19729,7 +19716,7 @@
       <w:pPr>
         <w:pStyle w:val="Ttulo2"/>
       </w:pPr>
-      <w:bookmarkStart w:id="152" w:name="_Toc230777527"/>
+      <w:bookmarkStart w:id="152" w:name="_Toc230777792"/>
       <w:r>
         <w:t>Quanto vai custar?</w:t>
       </w:r>
@@ -19844,7 +19831,7 @@
           <w:lang w:val="pt-BR"/>
         </w:rPr>
       </w:pPr>
-      <w:bookmarkStart w:id="158" w:name="_Toc230777528"/>
+      <w:bookmarkStart w:id="158" w:name="_Toc230777793"/>
       <w:r>
         <w:rPr>
           <w:lang w:val="pt-BR"/>
@@ -19912,7 +19899,7 @@
       <w:bookmarkStart w:id="171" w:name="_Toc213647694"/>
       <w:bookmarkStart w:id="172" w:name="_Toc213665798"/>
       <w:bookmarkStart w:id="173" w:name="_Toc213665837"/>
-      <w:bookmarkStart w:id="174" w:name="_Toc230777529"/>
+      <w:bookmarkStart w:id="174" w:name="_Toc230777794"/>
       <w:r>
         <w:t xml:space="preserve">Paleta de </w:t>
       </w:r>
@@ -19930,7 +19917,7 @@
           <w:noProof/>
         </w:rPr>
       </w:pPr>
-      <w:bookmarkStart w:id="175" w:name="_Toc230777437"/>
+      <w:bookmarkStart w:id="175" w:name="_Toc230777810"/>
       <w:r>
         <w:rPr>
           <w:szCs w:val="24"/>
@@ -20219,7 +20206,7 @@
           <w:rFonts w:eastAsia="Arial" w:cs="Arial"/>
         </w:rPr>
       </w:pPr>
-      <w:bookmarkStart w:id="176" w:name="_Toc230777530"/>
+      <w:bookmarkStart w:id="176" w:name="_Toc230777795"/>
       <w:r>
         <w:lastRenderedPageBreak/>
         <w:t>Tipografia</w:t>
@@ -20281,7 +20268,7 @@
       <w:bookmarkStart w:id="195" w:name="_Toc213647695"/>
       <w:bookmarkStart w:id="196" w:name="_Toc213665799"/>
       <w:bookmarkStart w:id="197" w:name="_Toc213665838"/>
-      <w:bookmarkStart w:id="198" w:name="_Toc230777438"/>
+      <w:bookmarkStart w:id="198" w:name="_Toc230777811"/>
       <w:r>
         <w:rPr>
           <w:szCs w:val="24"/>
@@ -20446,7 +20433,7 @@
           <w:rFonts w:eastAsia="Arial" w:cs="Arial"/>
         </w:rPr>
       </w:pPr>
-      <w:bookmarkStart w:id="199" w:name="_Toc230777531"/>
+      <w:bookmarkStart w:id="199" w:name="_Toc230777796"/>
       <w:r>
         <w:t>Isotipo</w:t>
       </w:r>
@@ -20571,7 +20558,7 @@
       <w:bookmarkStart w:id="218" w:name="_Toc213647696"/>
       <w:bookmarkStart w:id="219" w:name="_Toc213665800"/>
       <w:bookmarkStart w:id="220" w:name="_Toc213665839"/>
-      <w:bookmarkStart w:id="221" w:name="_Toc230777439"/>
+      <w:bookmarkStart w:id="221" w:name="_Toc230777812"/>
       <w:r>
         <w:rPr>
           <w:szCs w:val="24"/>
@@ -20778,7 +20765,7 @@
       <w:pPr>
         <w:pStyle w:val="Ttulo1"/>
       </w:pPr>
-      <w:bookmarkStart w:id="224" w:name="_Toc230777532"/>
+      <w:bookmarkStart w:id="224" w:name="_Toc230777797"/>
       <w:bookmarkEnd w:id="223"/>
       <w:r>
         <w:t>Protótipo</w:t>
@@ -20888,7 +20875,7 @@
           <w:rFonts w:eastAsia="Arial"/>
         </w:rPr>
       </w:pPr>
-      <w:bookmarkStart w:id="225" w:name="_Toc230777533"/>
+      <w:bookmarkStart w:id="225" w:name="_Toc230777798"/>
       <w:r>
         <w:t>Aplicação</w:t>
       </w:r>
@@ -20930,7 +20917,7 @@
         </w:rPr>
         <w:tab/>
       </w:r>
-      <w:bookmarkStart w:id="227" w:name="_Toc230777440"/>
+      <w:bookmarkStart w:id="227" w:name="_Toc230777813"/>
       <w:r>
         <w:rPr>
           <w:i w:val="0"/>
@@ -21095,7 +21082,7 @@
         </w:rPr>
         <w:t xml:space="preserve"> </w:t>
       </w:r>
-      <w:bookmarkStart w:id="228" w:name="_Toc230777441"/>
+      <w:bookmarkStart w:id="228" w:name="_Toc230777814"/>
       <w:r>
         <w:rPr>
           <w:sz w:val="20"/>
@@ -21282,7 +21269,7 @@
         </w:rPr>
         <w:t xml:space="preserve">      </w:t>
       </w:r>
-      <w:bookmarkStart w:id="229" w:name="_Toc230777442"/>
+      <w:bookmarkStart w:id="229" w:name="_Toc230777815"/>
       <w:r>
         <w:rPr>
           <w:i w:val="0"/>
@@ -21503,7 +21490,7 @@
         </w:rPr>
         <w:tab/>
       </w:r>
-      <w:bookmarkStart w:id="230" w:name="_Toc230777443"/>
+      <w:bookmarkStart w:id="230" w:name="_Toc230777816"/>
       <w:r>
         <w:rPr>
           <w:i w:val="0"/>
@@ -21720,7 +21707,7 @@
         <w:lastRenderedPageBreak/>
         <w:t xml:space="preserve">     </w:t>
       </w:r>
-      <w:bookmarkStart w:id="231" w:name="_Toc230777444"/>
+      <w:bookmarkStart w:id="231" w:name="_Toc230777817"/>
       <w:r>
         <w:rPr>
           <w:i w:val="0"/>
@@ -21925,7 +21912,7 @@
         </w:rPr>
         <w:t xml:space="preserve">  </w:t>
       </w:r>
-      <w:bookmarkStart w:id="232" w:name="_Toc230777445"/>
+      <w:bookmarkStart w:id="232" w:name="_Toc230777818"/>
       <w:r>
         <w:rPr>
           <w:i w:val="0"/>
@@ -22125,7 +22112,7 @@
           <w:szCs w:val="20"/>
         </w:rPr>
       </w:pPr>
-      <w:bookmarkStart w:id="233" w:name="_Toc230777446"/>
+      <w:bookmarkStart w:id="233" w:name="_Toc230777819"/>
       <w:r>
         <w:rPr>
           <w:i w:val="0"/>
@@ -22296,7 +22283,7 @@
           <w:szCs w:val="20"/>
         </w:rPr>
       </w:pPr>
-      <w:bookmarkStart w:id="234" w:name="_Toc230777447"/>
+      <w:bookmarkStart w:id="234" w:name="_Toc230777820"/>
       <w:r>
         <w:rPr>
           <w:i w:val="0"/>
@@ -22421,7 +22408,7 @@
         <w:lastRenderedPageBreak/>
         <w:t xml:space="preserve">                                               </w:t>
       </w:r>
-      <w:bookmarkStart w:id="235" w:name="_Toc230777448"/>
+      <w:bookmarkStart w:id="235" w:name="_Toc230777821"/>
       <w:r>
         <w:rPr>
           <w:sz w:val="20"/>
@@ -22575,7 +22562,7 @@
           <w:szCs w:val="20"/>
         </w:rPr>
       </w:pPr>
-      <w:bookmarkStart w:id="236" w:name="_Toc230777449"/>
+      <w:bookmarkStart w:id="236" w:name="_Toc230777822"/>
       <w:r>
         <w:rPr>
           <w:i w:val="0"/>
@@ -22736,7 +22723,7 @@
           <w:szCs w:val="20"/>
         </w:rPr>
       </w:pPr>
-      <w:bookmarkStart w:id="237" w:name="_Toc230777450"/>
+      <w:bookmarkStart w:id="237" w:name="_Toc230777823"/>
       <w:r>
         <w:rPr>
           <w:i w:val="0"/>
@@ -22847,7 +22834,7 @@
           <w:szCs w:val="20"/>
         </w:rPr>
       </w:pPr>
-      <w:bookmarkStart w:id="238" w:name="_Toc230777451"/>
+      <w:bookmarkStart w:id="238" w:name="_Toc230777824"/>
       <w:r>
         <w:rPr>
           <w:i w:val="0"/>
@@ -22984,7 +22971,7 @@
           <w:szCs w:val="20"/>
         </w:rPr>
       </w:pPr>
-      <w:bookmarkStart w:id="239" w:name="_Toc230777452"/>
+      <w:bookmarkStart w:id="239" w:name="_Toc230777825"/>
       <w:r>
         <w:rPr>
           <w:i w:val="0"/>
@@ -23157,7 +23144,7 @@
           <w:sz w:val="20"/>
         </w:rPr>
       </w:pPr>
-      <w:bookmarkStart w:id="240" w:name="_Toc230777453"/>
+      <w:bookmarkStart w:id="240" w:name="_Toc230777826"/>
       <w:r>
         <w:rPr>
           <w:sz w:val="20"/>
@@ -23269,7 +23256,7 @@
           <w:szCs w:val="20"/>
         </w:rPr>
       </w:pPr>
-      <w:bookmarkStart w:id="241" w:name="_Toc230777454"/>
+      <w:bookmarkStart w:id="241" w:name="_Toc230777827"/>
       <w:r>
         <w:rPr>
           <w:i w:val="0"/>
@@ -23397,7 +23384,7 @@
           <w:sz w:val="20"/>
         </w:rPr>
       </w:pPr>
-      <w:bookmarkStart w:id="242" w:name="_Toc230777455"/>
+      <w:bookmarkStart w:id="242" w:name="_Toc230777828"/>
       <w:r>
         <w:rPr>
           <w:sz w:val="20"/>
@@ -23497,7 +23484,7 @@
           <w:szCs w:val="20"/>
         </w:rPr>
       </w:pPr>
-      <w:bookmarkStart w:id="243" w:name="_Toc230777456"/>
+      <w:bookmarkStart w:id="243" w:name="_Toc230777829"/>
       <w:r>
         <w:rPr>
           <w:i w:val="0"/>
@@ -23608,7 +23595,7 @@
           <w:sz w:val="20"/>
         </w:rPr>
       </w:pPr>
-      <w:bookmarkStart w:id="244" w:name="_Toc230777457"/>
+      <w:bookmarkStart w:id="244" w:name="_Toc230777830"/>
       <w:r>
         <w:rPr>
           <w:sz w:val="20"/>
@@ -23772,7 +23759,7 @@
           <w:szCs w:val="20"/>
         </w:rPr>
       </w:pPr>
-      <w:bookmarkStart w:id="245" w:name="_Toc230777458"/>
+      <w:bookmarkStart w:id="245" w:name="_Toc230777831"/>
       <w:r>
         <w:rPr>
           <w:i w:val="0"/>
@@ -23891,7 +23878,7 @@
           <w:sz w:val="20"/>
         </w:rPr>
       </w:pPr>
-      <w:bookmarkStart w:id="246" w:name="_Toc230777459"/>
+      <w:bookmarkStart w:id="246" w:name="_Toc230777832"/>
       <w:r>
         <w:rPr>
           <w:sz w:val="20"/>
@@ -23991,7 +23978,7 @@
           <w:szCs w:val="20"/>
         </w:rPr>
       </w:pPr>
-      <w:bookmarkStart w:id="247" w:name="_Toc230777460"/>
+      <w:bookmarkStart w:id="247" w:name="_Toc230777833"/>
       <w:r>
         <w:rPr>
           <w:i w:val="0"/>
@@ -24070,9 +24057,61 @@
     </w:p>
     <w:p>
       <w:pPr>
+        <w:jc w:val="center"/>
+      </w:pPr>
+      <w:r>
+        <w:rPr>
+          <w:noProof/>
+        </w:rPr>
+        <w:drawing>
+          <wp:inline distT="0" distB="0" distL="0" distR="0" wp14:anchorId="7CEE18C5" wp14:editId="3D1738F5">
+            <wp:extent cx="1800000" cy="3258000"/>
+            <wp:effectExtent l="0" t="0" r="0" b="0"/>
+            <wp:docPr id="26" name="Imagem 26"/>
+            <wp:cNvGraphicFramePr>
+              <a:graphicFrameLocks xmlns:a="http://schemas.openxmlformats.org/drawingml/2006/main" noChangeAspect="1"/>
+            </wp:cNvGraphicFramePr>
+            <a:graphic xmlns:a="http://schemas.openxmlformats.org/drawingml/2006/main">
+              <a:graphicData uri="http://schemas.openxmlformats.org/drawingml/2006/picture">
+                <pic:pic xmlns:pic="http://schemas.openxmlformats.org/drawingml/2006/picture">
+                  <pic:nvPicPr>
+                    <pic:cNvPr id="26" name="entrada-saida.PNG"/>
+                    <pic:cNvPicPr/>
+                  </pic:nvPicPr>
+                  <pic:blipFill>
+                    <a:blip r:embed="rId38" cstate="print">
+                      <a:extLst>
+                        <a:ext uri="{28A0092B-C50C-407E-A947-70E740481C1C}">
+                          <a14:useLocalDpi xmlns:a14="http://schemas.microsoft.com/office/drawing/2010/main" val="0"/>
+                        </a:ext>
+                      </a:extLst>
+                    </a:blip>
+                    <a:stretch>
+                      <a:fillRect/>
+                    </a:stretch>
+                  </pic:blipFill>
+                  <pic:spPr>
+                    <a:xfrm>
+                      <a:off x="0" y="0"/>
+                      <a:ext cx="1800000" cy="3258000"/>
+                    </a:xfrm>
+                    <a:prstGeom prst="rect">
+                      <a:avLst/>
+                    </a:prstGeom>
+                  </pic:spPr>
+                </pic:pic>
+              </a:graphicData>
+            </a:graphic>
+          </wp:inline>
+        </w:drawing>
+      </w:r>
+    </w:p>
+    <w:p>
+      <w:pPr>
         <w:pStyle w:val="Figura"/>
         <w:widowControl/>
         <w:spacing w:line="240" w:lineRule="auto"/>
+        <w:ind w:firstLine="708"/>
       </w:pPr>
       <w:r>
         <w:t>Fonte: Elaborado pelos autores (2026)</w:t>
@@ -24110,7 +24149,7 @@
           <w:sz w:val="20"/>
         </w:rPr>
       </w:pPr>
-      <w:bookmarkStart w:id="248" w:name="_Toc230777461"/>
+      <w:bookmarkStart w:id="248" w:name="_Toc230777834"/>
       <w:r>
         <w:rPr>
           <w:sz w:val="20"/>
@@ -24210,7 +24249,7 @@
           <w:szCs w:val="20"/>
         </w:rPr>
       </w:pPr>
-      <w:bookmarkStart w:id="249" w:name="_Toc230777462"/>
+      <w:bookmarkStart w:id="249" w:name="_Toc230777835"/>
       <w:r>
         <w:rPr>
           <w:i w:val="0"/>
@@ -24335,7 +24374,7 @@
         </w:rPr>
         <w:t xml:space="preserve">         </w:t>
       </w:r>
-      <w:bookmarkStart w:id="250" w:name="_Toc230777463"/>
+      <w:bookmarkStart w:id="250" w:name="_Toc230777836"/>
       <w:r>
         <w:rPr>
           <w:sz w:val="20"/>
@@ -24419,7 +24458,7 @@
                     </pic:cNvPicPr>
                   </pic:nvPicPr>
                   <pic:blipFill>
-                    <a:blip r:embed="rId38" cstate="print">
+                    <a:blip r:embed="rId39" cstate="print">
                       <a:extLst>
                         <a:ext uri="{28A0092B-C50C-407E-A947-70E740481C1C}">
                           <a14:useLocalDpi xmlns:a14="http://schemas.microsoft.com/office/drawing/2010/main" val="0"/>
@@ -24508,7 +24547,7 @@
           <w:szCs w:val="20"/>
         </w:rPr>
       </w:pPr>
-      <w:bookmarkStart w:id="251" w:name="_Toc230777464"/>
+      <w:bookmarkStart w:id="251" w:name="_Toc230777837"/>
       <w:r>
         <w:rPr>
           <w:i w:val="0"/>
@@ -24611,7 +24650,7 @@
                     </pic:cNvPicPr>
                   </pic:nvPicPr>
                   <pic:blipFill>
-                    <a:blip r:embed="rId39" cstate="print">
+                    <a:blip r:embed="rId40" cstate="print">
                       <a:extLst>
                         <a:ext uri="{28A0092B-C50C-407E-A947-70E740481C1C}">
                           <a14:useLocalDpi xmlns:a14="http://schemas.microsoft.com/office/drawing/2010/main" val="0"/>
@@ -24681,7 +24720,7 @@
           <w:szCs w:val="20"/>
         </w:rPr>
       </w:pPr>
-      <w:bookmarkStart w:id="252" w:name="_Toc230777465"/>
+      <w:bookmarkStart w:id="252" w:name="_Toc230777838"/>
       <w:r>
         <w:rPr>
           <w:i w:val="0"/>
@@ -24783,7 +24822,7 @@
                     </pic:cNvPicPr>
                   </pic:nvPicPr>
                   <pic:blipFill>
-                    <a:blip r:embed="rId40" cstate="print">
+                    <a:blip r:embed="rId41" cstate="print">
                       <a:extLst>
                         <a:ext uri="{28A0092B-C50C-407E-A947-70E740481C1C}">
                           <a14:useLocalDpi xmlns:a14="http://schemas.microsoft.com/office/drawing/2010/main" val="0"/>
@@ -24837,7 +24876,7 @@
           <w:szCs w:val="20"/>
         </w:rPr>
       </w:pPr>
-      <w:bookmarkStart w:id="253" w:name="_Toc230777466"/>
+      <w:bookmarkStart w:id="253" w:name="_Toc230777839"/>
       <w:r>
         <w:rPr>
           <w:i w:val="0"/>
@@ -24940,7 +24979,7 @@
                     </pic:cNvPicPr>
                   </pic:nvPicPr>
                   <pic:blipFill>
-                    <a:blip r:embed="rId41" cstate="print">
+                    <a:blip r:embed="rId42" cstate="print">
                       <a:extLst>
                         <a:ext uri="{28A0092B-C50C-407E-A947-70E740481C1C}">
                           <a14:useLocalDpi xmlns:a14="http://schemas.microsoft.com/office/drawing/2010/main" val="0"/>
@@ -25010,7 +25049,7 @@
           <w:szCs w:val="20"/>
         </w:rPr>
       </w:pPr>
-      <w:bookmarkStart w:id="254" w:name="_Toc230777467"/>
+      <w:bookmarkStart w:id="254" w:name="_Toc230777840"/>
       <w:r>
         <w:rPr>
           <w:i w:val="0"/>
@@ -25112,7 +25151,7 @@
                     </pic:cNvPicPr>
                   </pic:nvPicPr>
                   <pic:blipFill>
-                    <a:blip r:embed="rId42" cstate="print">
+                    <a:blip r:embed="rId43" cstate="print">
                       <a:extLst>
                         <a:ext uri="{28A0092B-C50C-407E-A947-70E740481C1C}">
                           <a14:useLocalDpi xmlns:a14="http://schemas.microsoft.com/office/drawing/2010/main" val="0"/>
@@ -25166,7 +25205,7 @@
           <w:szCs w:val="20"/>
         </w:rPr>
       </w:pPr>
-      <w:bookmarkStart w:id="255" w:name="_Toc230777468"/>
+      <w:bookmarkStart w:id="255" w:name="_Toc230777841"/>
       <w:r>
         <w:rPr>
           <w:i w:val="0"/>
@@ -25269,7 +25308,7 @@
                     </pic:cNvPicPr>
                   </pic:nvPicPr>
                   <pic:blipFill>
-                    <a:blip r:embed="rId43" cstate="print">
+                    <a:blip r:embed="rId44" cstate="print">
                       <a:extLst>
                         <a:ext uri="{28A0092B-C50C-407E-A947-70E740481C1C}">
                           <a14:useLocalDpi xmlns:a14="http://schemas.microsoft.com/office/drawing/2010/main" val="0"/>
@@ -25352,7 +25391,7 @@
         </w:rPr>
         <w:t xml:space="preserve">      </w:t>
       </w:r>
-      <w:bookmarkStart w:id="256" w:name="_Toc230777469"/>
+      <w:bookmarkStart w:id="256" w:name="_Toc230777842"/>
       <w:r>
         <w:rPr>
           <w:sz w:val="20"/>
@@ -25436,7 +25475,7 @@
                     </pic:cNvPicPr>
                   </pic:nvPicPr>
                   <pic:blipFill>
-                    <a:blip r:embed="rId44" cstate="print">
+                    <a:blip r:embed="rId45" cstate="print">
                       <a:extLst>
                         <a:ext uri="{28A0092B-C50C-407E-A947-70E740481C1C}">
                           <a14:useLocalDpi xmlns:a14="http://schemas.microsoft.com/office/drawing/2010/main" val="0"/>
@@ -25481,106 +25520,10 @@
     </w:p>
     <w:p>
       <w:pPr>
-        <w:pStyle w:val="Figura"/>
-        <w:widowControl/>
-        <w:spacing w:line="240" w:lineRule="auto"/>
-      </w:pPr>
-    </w:p>
-    <w:p>
-      <w:pPr>
-        <w:pStyle w:val="Figura"/>
-        <w:widowControl/>
-        <w:spacing w:line="240" w:lineRule="auto"/>
-      </w:pPr>
-    </w:p>
-    <w:p>
-      <w:pPr>
-        <w:pStyle w:val="Figura"/>
-        <w:widowControl/>
-        <w:spacing w:line="240" w:lineRule="auto"/>
-      </w:pPr>
-    </w:p>
-    <w:p>
-      <w:pPr>
-        <w:pStyle w:val="Figura"/>
-        <w:widowControl/>
-        <w:spacing w:line="240" w:lineRule="auto"/>
-      </w:pPr>
-    </w:p>
-    <w:p>
-      <w:pPr>
-        <w:pStyle w:val="Figura"/>
-        <w:widowControl/>
-        <w:spacing w:line="240" w:lineRule="auto"/>
-      </w:pPr>
-    </w:p>
-    <w:p>
-      <w:pPr>
-        <w:pStyle w:val="Figura"/>
-        <w:widowControl/>
-        <w:spacing w:line="240" w:lineRule="auto"/>
-      </w:pPr>
-    </w:p>
-    <w:p>
-      <w:pPr>
-        <w:pStyle w:val="Figura"/>
-        <w:widowControl/>
-        <w:spacing w:line="240" w:lineRule="auto"/>
-      </w:pPr>
-    </w:p>
-    <w:p>
-      <w:pPr>
-        <w:pStyle w:val="Figura"/>
-        <w:widowControl/>
-        <w:spacing w:line="240" w:lineRule="auto"/>
-      </w:pPr>
-    </w:p>
-    <w:p>
-      <w:pPr>
-        <w:pStyle w:val="Figura"/>
-        <w:widowControl/>
-        <w:spacing w:line="240" w:lineRule="auto"/>
-      </w:pPr>
-    </w:p>
-    <w:p>
-      <w:pPr>
-        <w:widowControl/>
-        <w:spacing w:line="240" w:lineRule="auto"/>
-        <w:ind w:firstLine="0"/>
-        <w:jc w:val="left"/>
-        <w:rPr>
-          <w:b/>
-          <w:caps/>
-        </w:rPr>
-      </w:pPr>
-    </w:p>
-    <w:p>
-      <w:pPr>
-        <w:widowControl/>
-        <w:spacing w:line="240" w:lineRule="auto"/>
-        <w:ind w:firstLine="0"/>
-        <w:jc w:val="left"/>
-        <w:rPr>
-          <w:b/>
-          <w:caps/>
-        </w:rPr>
-      </w:pPr>
-      <w:r>
-        <w:br w:type="page"/>
-      </w:r>
-    </w:p>
-    <w:p>
-      <w:pPr>
         <w:pStyle w:val="Ttulo1"/>
-        <w:rPr>
-          <w:lang w:val="pt-BR"/>
-        </w:rPr>
-      </w:pPr>
-      <w:bookmarkStart w:id="257" w:name="_Toc230777534"/>
-      <w:r>
-        <w:rPr>
-          <w:lang w:val="pt-BR"/>
-        </w:rPr>
+      </w:pPr>
+      <w:bookmarkStart w:id="257" w:name="_Toc230777799"/>
+      <w:r>
         <w:lastRenderedPageBreak/>
         <w:t>Considerações Finais</w:t>
       </w:r>
@@ -25634,7 +25577,7 @@
           <w:lang w:val="pt-BR"/>
         </w:rPr>
       </w:pPr>
-      <w:bookmarkStart w:id="258" w:name="_Toc230777535"/>
+      <w:bookmarkStart w:id="258" w:name="_Toc230777800"/>
       <w:r>
         <w:rPr>
           <w:lang w:val="pt-BR"/>
@@ -25692,7 +25635,7 @@
       <w:r>
         <w:t xml:space="preserve"> </w:t>
       </w:r>
-      <w:hyperlink r:id="rId45" w:history="1">
+      <w:hyperlink r:id="rId46" w:history="1">
         <w:r>
           <w:rPr>
             <w:rStyle w:val="Hyperlink"/>
@@ -25749,7 +25692,7 @@
         </w:rPr>
         <w:t xml:space="preserve">. Disponível em: </w:t>
       </w:r>
-      <w:hyperlink r:id="rId46" w:history="1">
+      <w:hyperlink r:id="rId47" w:history="1">
         <w:r>
           <w:rPr>
             <w:rStyle w:val="Hyperlink"/>
@@ -25818,7 +25761,7 @@
         </w:rPr>
         <w:t xml:space="preserve">. Disponível em: </w:t>
       </w:r>
-      <w:hyperlink r:id="rId47" w:history="1">
+      <w:hyperlink r:id="rId48" w:history="1">
         <w:r>
           <w:rPr>
             <w:rStyle w:val="Hyperlink"/>
@@ -25890,7 +25833,7 @@
         </w:rPr>
         <w:t xml:space="preserve">. Disponível em: </w:t>
       </w:r>
-      <w:hyperlink r:id="rId48" w:history="1">
+      <w:hyperlink r:id="rId49" w:history="1">
         <w:r>
           <w:rPr>
             <w:rStyle w:val="Hyperlink"/>
@@ -25960,7 +25903,7 @@
         </w:rPr>
         <w:t xml:space="preserve">em: </w:t>
       </w:r>
-      <w:hyperlink r:id="rId49">
+      <w:hyperlink r:id="rId50">
         <w:r>
           <w:rPr>
             <w:rStyle w:val="Hyperlink"/>
@@ -26034,7 +25977,7 @@
         </w:rPr>
         <w:t xml:space="preserve">. Disponível em: </w:t>
       </w:r>
-      <w:hyperlink r:id="rId50">
+      <w:hyperlink r:id="rId51">
         <w:r>
           <w:rPr>
             <w:rStyle w:val="Hyperlink"/>
@@ -26096,7 +26039,7 @@
         </w:rPr>
         <w:t xml:space="preserve">. Disponível em: </w:t>
       </w:r>
-      <w:hyperlink r:id="rId51">
+      <w:hyperlink r:id="rId52">
         <w:r>
           <w:rPr>
             <w:rStyle w:val="Hyperlink"/>
@@ -26155,7 +26098,7 @@
       <w:r>
         <w:t xml:space="preserve">. Disponível em: </w:t>
       </w:r>
-      <w:hyperlink r:id="rId52" w:history="1">
+      <w:hyperlink r:id="rId53" w:history="1">
         <w:r>
           <w:rPr>
             <w:rStyle w:val="Hyperlink"/>
@@ -26201,8 +26144,8 @@
     <w:p/>
     <w:p/>
     <w:sectPr>
-      <w:headerReference w:type="default" r:id="rId53"/>
-      <w:footerReference w:type="default" r:id="rId54"/>
+      <w:headerReference w:type="default" r:id="rId54"/>
+      <w:footerReference w:type="default" r:id="rId55"/>
       <w:pgSz w:w="11907" w:h="16840" w:code="9"/>
       <w:pgMar w:top="1701" w:right="1134" w:bottom="1134" w:left="1701" w:header="709" w:footer="709" w:gutter="0"/>
       <w:cols w:space="720"/>
@@ -26423,7 +26366,7 @@
       <w:rPr>
         <w:noProof/>
       </w:rPr>
-      <w:t>8</w:t>
+      <w:t>11</w:t>
     </w:r>
     <w:r>
       <w:fldChar w:fldCharType="end"/>
@@ -30696,17 +30639,6 @@
 </file>
 
 <file path=customXml/item1.xml><?xml version="1.0" encoding="utf-8"?>
-<p:properties xmlns:p="http://schemas.microsoft.com/office/2006/metadata/properties" xmlns:xsi="http://www.w3.org/2001/XMLSchema-instance" xmlns:pc="http://schemas.microsoft.com/office/infopath/2007/PartnerControls">
-  <documentManagement>
-    <lcf76f155ced4ddcb4097134ff3c332f xmlns="73616d7f-17b8-4c43-aa5e-25ef7e462a18">
-      <Terms xmlns="http://schemas.microsoft.com/office/infopath/2007/PartnerControls"/>
-    </lcf76f155ced4ddcb4097134ff3c332f>
-    <TaxCatchAll xmlns="686b96b7-37ef-4e5c-bc3c-4e780f33c780" xsi:nil="true"/>
-  </documentManagement>
-</p:properties>
-</file>
-
-<file path=customXml/item2.xml><?xml version="1.0" encoding="utf-8"?>
 <ct:contentTypeSchema xmlns:ct="http://schemas.microsoft.com/office/2006/metadata/contentType" xmlns:ma="http://schemas.microsoft.com/office/2006/metadata/properties/metaAttributes" ct:_="" ma:_="" ma:contentTypeName="Documento" ma:contentTypeID="0x01010020DA79A94EAF84479D995EE9166ADAA4" ma:contentTypeVersion="11" ma:contentTypeDescription="Crie um novo documento." ma:contentTypeScope="" ma:versionID="db0f6cab5e24e8cd6751fda002f09c0a">
   <xsd:schema xmlns:xsd="http://www.w3.org/2001/XMLSchema" xmlns:xs="http://www.w3.org/2001/XMLSchema" xmlns:p="http://schemas.microsoft.com/office/2006/metadata/properties" xmlns:ns2="73616d7f-17b8-4c43-aa5e-25ef7e462a18" xmlns:ns3="686b96b7-37ef-4e5c-bc3c-4e780f33c780" targetNamespace="http://schemas.microsoft.com/office/2006/metadata/properties" ma:root="true" ma:fieldsID="0fb1f17ca0d982144b9f7f51c1ea08de" ns2:_="" ns3:_="">
     <xsd:import namespace="73616d7f-17b8-4c43-aa5e-25ef7e462a18"/>
@@ -30901,7 +30833,7 @@
 </ct:contentTypeSchema>
 </file>
 
-<file path=customXml/item3.xml><?xml version="1.0" encoding="utf-8"?>
+<file path=customXml/item2.xml><?xml version="1.0" encoding="utf-8"?>
 <?mso-contentType ?>
 <FormTemplates xmlns="http://schemas.microsoft.com/sharepoint/v3/contenttype/forms">
   <Display>DocumentLibraryForm</Display>
@@ -30910,22 +30842,22 @@
 </FormTemplates>
 </file>
 
+<file path=customXml/item3.xml><?xml version="1.0" encoding="utf-8"?>
+<p:properties xmlns:p="http://schemas.microsoft.com/office/2006/metadata/properties" xmlns:xsi="http://www.w3.org/2001/XMLSchema-instance" xmlns:pc="http://schemas.microsoft.com/office/infopath/2007/PartnerControls">
+  <documentManagement>
+    <lcf76f155ced4ddcb4097134ff3c332f xmlns="73616d7f-17b8-4c43-aa5e-25ef7e462a18">
+      <Terms xmlns="http://schemas.microsoft.com/office/infopath/2007/PartnerControls"/>
+    </lcf76f155ced4ddcb4097134ff3c332f>
+    <TaxCatchAll xmlns="686b96b7-37ef-4e5c-bc3c-4e780f33c780" xsi:nil="true"/>
+  </documentManagement>
+</p:properties>
+</file>
+
 <file path=customXml/item4.xml><?xml version="1.0" encoding="utf-8"?>
 <b:Sources xmlns:b="http://schemas.openxmlformats.org/officeDocument/2006/bibliography" xmlns="http://schemas.openxmlformats.org/officeDocument/2006/bibliography" SelectedStyle="\APA.XSL" StyleName="APA"/>
 </file>
 
 <file path=customXml/itemProps1.xml><?xml version="1.0" encoding="utf-8"?>
-<ds:datastoreItem xmlns:ds="http://schemas.openxmlformats.org/officeDocument/2006/customXml" ds:itemID="{0FB482D0-C62D-40F8-A30D-80102D84D1F8}">
-  <ds:schemaRefs>
-    <ds:schemaRef ds:uri="http://schemas.microsoft.com/office/2006/metadata/properties"/>
-    <ds:schemaRef ds:uri="http://schemas.microsoft.com/office/infopath/2007/PartnerControls"/>
-    <ds:schemaRef ds:uri="73616d7f-17b8-4c43-aa5e-25ef7e462a18"/>
-    <ds:schemaRef ds:uri="686b96b7-37ef-4e5c-bc3c-4e780f33c780"/>
-  </ds:schemaRefs>
-</ds:datastoreItem>
-</file>
-
-<file path=customXml/itemProps2.xml><?xml version="1.0" encoding="utf-8"?>
 <ds:datastoreItem xmlns:ds="http://schemas.openxmlformats.org/officeDocument/2006/customXml" ds:itemID="{89C5A49E-B54F-4963-BBA9-17020C92F744}">
   <ds:schemaRefs>
     <ds:schemaRef ds:uri="http://schemas.microsoft.com/office/2006/metadata/contentType"/>
@@ -30944,7 +30876,7 @@
 </ds:datastoreItem>
 </file>
 
-<file path=customXml/itemProps3.xml><?xml version="1.0" encoding="utf-8"?>
+<file path=customXml/itemProps2.xml><?xml version="1.0" encoding="utf-8"?>
 <ds:datastoreItem xmlns:ds="http://schemas.openxmlformats.org/officeDocument/2006/customXml" ds:itemID="{CF1FD0AD-7A56-4031-B24D-376004EB8526}">
   <ds:schemaRefs>
     <ds:schemaRef ds:uri="http://schemas.microsoft.com/sharepoint/v3/contenttype/forms"/>
@@ -30952,8 +30884,19 @@
 </ds:datastoreItem>
 </file>
 
+<file path=customXml/itemProps3.xml><?xml version="1.0" encoding="utf-8"?>
+<ds:datastoreItem xmlns:ds="http://schemas.openxmlformats.org/officeDocument/2006/customXml" ds:itemID="{0FB482D0-C62D-40F8-A30D-80102D84D1F8}">
+  <ds:schemaRefs>
+    <ds:schemaRef ds:uri="http://schemas.microsoft.com/office/2006/metadata/properties"/>
+    <ds:schemaRef ds:uri="http://schemas.microsoft.com/office/infopath/2007/PartnerControls"/>
+    <ds:schemaRef ds:uri="73616d7f-17b8-4c43-aa5e-25ef7e462a18"/>
+    <ds:schemaRef ds:uri="686b96b7-37ef-4e5c-bc3c-4e780f33c780"/>
+  </ds:schemaRefs>
+</ds:datastoreItem>
+</file>
+
 <file path=customXml/itemProps4.xml><?xml version="1.0" encoding="utf-8"?>
-<ds:datastoreItem xmlns:ds="http://schemas.openxmlformats.org/officeDocument/2006/customXml" ds:itemID="{325C46C5-A8D2-48C9-BA52-D994E0638649}">
+<ds:datastoreItem xmlns:ds="http://schemas.openxmlformats.org/officeDocument/2006/customXml" ds:itemID="{1DD959BD-EBCB-476D-AC28-F5597926F234}">
   <ds:schemaRefs>
     <ds:schemaRef ds:uri="http://schemas.openxmlformats.org/officeDocument/2006/bibliography"/>
   </ds:schemaRefs>

</xml_diff>

<commit_message>
documentação nova do sexto semestre
</commit_message>
<xml_diff>
--- a/DayPlannio.docx
+++ b/DayPlannio.docx
@@ -332,25 +332,25 @@
         <w:ind w:firstLine="0"/>
         <w:jc w:val="center"/>
         <w:rPr>
-          <w:b/>
-          <w:bCs/>
+          <w:b w:val="1"/>
+          <w:bCs w:val="1"/>
           <w:sz w:val="28"/>
           <w:szCs w:val="28"/>
         </w:rPr>
       </w:pPr>
       <w:r>
         <w:rPr>
-          <w:b/>
-          <w:bCs/>
+          <w:b w:val="1"/>
+          <w:bCs w:val="1"/>
           <w:sz w:val="28"/>
           <w:szCs w:val="28"/>
         </w:rPr>
-        <w:t>5</w:t>
-      </w:r>
-      <w:r>
-        <w:rPr>
-          <w:b/>
-          <w:bCs/>
+        <w:t>6</w:t>
+      </w:r>
+      <w:r>
+        <w:rPr>
+          <w:b w:val="1"/>
+          <w:bCs w:val="1"/>
           <w:sz w:val="28"/>
           <w:szCs w:val="28"/>
         </w:rPr>
@@ -358,8 +358,8 @@
       </w:r>
       <w:r>
         <w:rPr>
-          <w:b/>
-          <w:bCs/>
+          <w:b w:val="1"/>
+          <w:bCs w:val="1"/>
           <w:sz w:val="28"/>
           <w:szCs w:val="28"/>
         </w:rPr>
@@ -367,12 +367,12 @@
       </w:r>
       <w:r>
         <w:rPr>
-          <w:b/>
-          <w:bCs/>
+          <w:b w:val="1"/>
+          <w:bCs w:val="1"/>
           <w:sz w:val="28"/>
           <w:szCs w:val="28"/>
         </w:rPr>
-        <w:t>5</w:t>
+        <w:t>6</w:t>
       </w:r>
     </w:p>
     <w:p>
@@ -865,24 +865,25 @@
         <w:ind w:firstLine="0"/>
         <w:jc w:val="center"/>
         <w:rPr>
-          <w:rStyle w:val="Forte"/>
+          <w:b w:val="1"/>
+          <w:bCs w:val="1"/>
           <w:sz w:val="28"/>
           <w:szCs w:val="28"/>
         </w:rPr>
       </w:pPr>
       <w:r>
         <w:rPr>
-          <w:b/>
-          <w:bCs/>
+          <w:b w:val="1"/>
+          <w:bCs w:val="1"/>
           <w:sz w:val="28"/>
           <w:szCs w:val="28"/>
         </w:rPr>
-        <w:t>5</w:t>
-      </w:r>
-      <w:r>
-        <w:rPr>
-          <w:b/>
-          <w:bCs/>
+        <w:t>6</w:t>
+      </w:r>
+      <w:r>
+        <w:rPr>
+          <w:b w:val="1"/>
+          <w:bCs w:val="1"/>
           <w:sz w:val="28"/>
           <w:szCs w:val="28"/>
         </w:rPr>
@@ -890,12 +891,12 @@
       </w:r>
       <w:r>
         <w:rPr>
-          <w:b/>
-          <w:bCs/>
+          <w:b w:val="1"/>
+          <w:bCs w:val="1"/>
           <w:sz w:val="28"/>
           <w:szCs w:val="28"/>
         </w:rPr>
-        <w:t>5</w:t>
+        <w:t>6</w:t>
       </w:r>
     </w:p>
     <w:p>
@@ -4095,10 +4096,11 @@
               <w:tab w:val="right" w:leader="dot" w:pos="9062"/>
             </w:tabs>
             <w:rPr>
-              <w:rFonts w:asciiTheme="minorHAnsi" w:hAnsiTheme="minorHAnsi" w:eastAsiaTheme="minorEastAsia" w:cstheme="minorBidi"/>
+              <w:rFonts w:ascii="Calibri" w:hAnsi="Calibri" w:eastAsia="ＭＳ 明朝" w:cs="Arial" w:asciiTheme="minorAscii" w:hAnsiTheme="minorAscii" w:eastAsiaTheme="minorEastAsia" w:cstheme="minorBidi"/>
               <w:b w:val="0"/>
               <w:bCs w:val="0"/>
               <w:caps w:val="0"/>
+              <w:smallCaps w:val="0"/>
               <w:noProof/>
               <w:sz w:val="22"/>
               <w:szCs w:val="22"/>
@@ -4113,82 +4115,92 @@
           <w:r>
             <w:fldChar w:fldCharType="separate"/>
           </w:r>
-          <w:hyperlink w:history="1" w:anchor="_Toc230779092">
-            <w:r>
-              <w:rPr>
-                <w:rStyle w:val="Hyperlink"/>
-                <w:noProof/>
-              </w:rPr>
-              <w:t>1</w:t>
-            </w:r>
-            <w:r>
-              <w:rPr>
-                <w:rFonts w:asciiTheme="minorHAnsi" w:hAnsiTheme="minorHAnsi" w:eastAsiaTheme="minorEastAsia" w:cstheme="minorBidi"/>
-                <w:b w:val="0"/>
-                <w:bCs w:val="0"/>
-                <w:caps w:val="0"/>
-                <w:noProof/>
-                <w:sz w:val="22"/>
-                <w:szCs w:val="22"/>
-              </w:rPr>
-              <w:tab/>
-            </w:r>
-            <w:r>
-              <w:rPr>
-                <w:rStyle w:val="Hyperlink"/>
-                <w:noProof/>
-              </w:rPr>
-              <w:t>Descrição da Aplicação Web</w:t>
-            </w:r>
-            <w:r>
-              <w:rPr>
-                <w:noProof/>
-                <w:webHidden/>
-              </w:rPr>
-              <w:tab/>
-            </w:r>
-            <w:r>
-              <w:rPr>
-                <w:noProof/>
-                <w:webHidden/>
-              </w:rPr>
-              <w:fldChar w:fldCharType="begin"/>
-            </w:r>
-            <w:r>
-              <w:rPr>
-                <w:noProof/>
-                <w:webHidden/>
-              </w:rPr>
-              <w:instrText xml:space="preserve"> PAGEREF _Toc230779092 \h </w:instrText>
-            </w:r>
-            <w:r>
-              <w:rPr>
-                <w:noProof/>
-                <w:webHidden/>
-              </w:rPr>
-            </w:r>
-            <w:r>
-              <w:rPr>
-                <w:noProof/>
-                <w:webHidden/>
-              </w:rPr>
-              <w:fldChar w:fldCharType="separate"/>
-            </w:r>
-            <w:r>
-              <w:rPr>
-                <w:noProof/>
-                <w:webHidden/>
-              </w:rPr>
-              <w:t>8</w:t>
-            </w:r>
-            <w:r>
-              <w:rPr>
-                <w:noProof/>
-                <w:webHidden/>
-              </w:rPr>
-              <w:fldChar w:fldCharType="end"/>
-            </w:r>
-          </w:hyperlink>
+          <w:r>
+            <w:fldChar w:fldCharType="begin"/>
+          </w:r>
+          <w:r>
+            <w:instrText xml:space="preserve">HYPERLINK  \l "_Toc230779092"</w:instrText>
+          </w:r>
+          <w:r>
+            <w:fldChar w:fldCharType="separate"/>
+          </w:r>
+          <w:r>
+            <w:rPr>
+              <w:rStyle w:val="Hyperlink"/>
+              <w:noProof/>
+            </w:rPr>
+            <w:t>1</w:t>
+          </w:r>
+          <w:r>
+            <w:rPr>
+              <w:rFonts w:asciiTheme="minorHAnsi" w:hAnsiTheme="minorHAnsi" w:eastAsiaTheme="minorEastAsia" w:cstheme="minorBidi"/>
+              <w:b w:val="0"/>
+              <w:bCs w:val="0"/>
+              <w:caps w:val="0"/>
+              <w:noProof/>
+              <w:sz w:val="22"/>
+              <w:szCs w:val="22"/>
+            </w:rPr>
+            <w:tab/>
+          </w:r>
+          <w:r>
+            <w:rPr>
+              <w:rStyle w:val="Hyperlink"/>
+              <w:noProof/>
+            </w:rPr>
+            <w:t>Descrição da Aplicação Web</w:t>
+          </w:r>
+          <w:r>
+            <w:rPr>
+              <w:noProof/>
+              <w:webHidden/>
+            </w:rPr>
+            <w:tab/>
+          </w:r>
+          <w:r>
+            <w:rPr>
+              <w:noProof/>
+              <w:webHidden/>
+            </w:rPr>
+            <w:fldChar w:fldCharType="begin"/>
+          </w:r>
+          <w:r>
+            <w:rPr>
+              <w:noProof/>
+              <w:webHidden/>
+            </w:rPr>
+            <w:instrText xml:space="preserve"> PAGEREF _Toc230779092 \h </w:instrText>
+          </w:r>
+          <w:r>
+            <w:rPr>
+              <w:noProof/>
+              <w:webHidden/>
+            </w:rPr>
+          </w:r>
+          <w:r>
+            <w:rPr>
+              <w:noProof/>
+              <w:webHidden/>
+            </w:rPr>
+            <w:fldChar w:fldCharType="separate"/>
+          </w:r>
+          <w:r>
+            <w:rPr>
+              <w:noProof/>
+              <w:webHidden/>
+            </w:rPr>
+            <w:t>8</w:t>
+          </w:r>
+          <w:r>
+            <w:rPr>
+              <w:noProof/>
+              <w:webHidden/>
+            </w:rPr>
+            <w:fldChar w:fldCharType="end"/>
+          </w:r>
+          <w:r>
+            <w:fldChar w:fldCharType="end"/>
+          </w:r>
         </w:p>
         <w:p>
           <w:pPr>
@@ -10365,99 +10377,380 @@
     <w:p>
       <w:pPr>
         <w:pStyle w:val="Ttulo1"/>
+        <w:bidi w:val="0"/>
         <w:rPr>
           <w:lang w:val="pt-BR"/>
         </w:rPr>
       </w:pPr>
-      <w:bookmarkStart w:name="_Toc230779092" w:id="1"/>
       <w:r>
         <w:rPr>
           <w:lang w:val="pt-BR"/>
         </w:rPr>
-        <w:lastRenderedPageBreak/>
-        <w:t>Descrição da Aplicação Web</w:t>
-      </w:r>
-      <w:bookmarkEnd w:id="1"/>
+        <w:t>introdução</w:t>
+      </w:r>
+    </w:p>
+    <w:p>
+      <w:pPr>
+        <w:bidi w:val="0"/>
+        <w:spacing w:before="240" w:beforeAutospacing="off" w:after="240" w:afterAutospacing="off"/>
+        <w:jc w:val="left"/>
+      </w:pPr>
+      <w:r>
+        <w:rPr>
+          <w:rFonts w:ascii="Arial" w:hAnsi="Arial" w:eastAsia="Arial" w:cs="Arial"/>
+          <w:noProof w:val="0"/>
+          <w:sz w:val="24"/>
+          <w:szCs w:val="24"/>
+          <w:lang w:val="pt-BR"/>
+        </w:rPr>
+        <w:t>No cenário atual, a organização da rotina e a gestão eficiente do tempo têm se tornado cada vez mais importantes para profissionais autônomos que precisam lidar diariamente com múltiplas tarefas, clientes e serviços. A falta de uma solução que centralize agenda, cadastro de clientes, controle financeiro e gestão de serviços em um único ambiente dificulta a administração das atividades profissionais.</w:t>
+      </w:r>
+    </w:p>
+    <w:p>
+      <w:pPr>
+        <w:bidi w:val="0"/>
+        <w:spacing w:before="240" w:beforeAutospacing="off" w:after="240" w:afterAutospacing="off"/>
+        <w:jc w:val="left"/>
+      </w:pPr>
+      <w:r>
+        <w:rPr>
+          <w:rFonts w:ascii="Arial" w:hAnsi="Arial" w:eastAsia="Arial" w:cs="Arial"/>
+          <w:noProof w:val="0"/>
+          <w:sz w:val="24"/>
+          <w:szCs w:val="24"/>
+          <w:lang w:val="pt-BR"/>
+        </w:rPr>
+        <w:t>O DayPlannio surge para suprir essa necessidade, oferecendo uma plataforma integrada composta por aplicativo mobile, portal web e serviços em nuvem. A solução permite organizar compromissos, acompanhar atendimentos, registrar clientes, controlar ganhos e despesas, além de disponibilizar métricas de produtividade, faturamento, tempo trabalhado e desempenho dos atendimentos.</w:t>
+      </w:r>
+    </w:p>
+    <w:p>
+      <w:pPr>
+        <w:bidi w:val="0"/>
+        <w:spacing w:before="240" w:beforeAutospacing="off" w:after="240" w:afterAutospacing="off"/>
+        <w:jc w:val="left"/>
+      </w:pPr>
+      <w:r>
+        <w:rPr>
+          <w:rFonts w:ascii="Arial" w:hAnsi="Arial" w:eastAsia="Arial" w:cs="Arial"/>
+          <w:noProof w:val="0"/>
+          <w:sz w:val="24"/>
+          <w:szCs w:val="24"/>
+          <w:lang w:val="pt-BR"/>
+        </w:rPr>
+        <w:t>A plataforma também contará com recursos de Internet das Coisas (IoT) e mineração de dados para automatizar a coleta e análise de informações, permitindo a geração de métricas e relatórios gerenciais. Além disso, os clientes poderão acompanhar o histórico de serviços realizados por meio do portal web, enquanto os prestadores poderão divulgar seus trabalhos em um portfólio público com fotos dos atendimentos, mediante autorização prévia. Os dados e imagens da plataforma serão armazenados em nuvem, garantindo sua disponibilidade e integração entre os diferentes módulos do sistema.</w:t>
+      </w:r>
     </w:p>
     <w:p>
       <w:pPr>
         <w:pStyle w:val="Ttulo2"/>
-      </w:pPr>
-      <w:bookmarkStart w:name="_Toc230779093" w:id="2"/>
-      <w:r>
-        <w:t>Introdução</w:t>
-      </w:r>
-      <w:bookmarkEnd w:id="2"/>
-    </w:p>
-    <w:p>
-      <w:r>
-        <w:t xml:space="preserve">No cenário atual, a organização da rotina e a gestão eficiente do tempo têm se tornado cada vez mais essenciais para profissionais autônomos que precisam lidar diariamente com múltiplas </w:t>
-      </w:r>
-      <w:r>
-        <w:t>tarefas, clientes e serviços. A falta de uma aplicação que centralize agenda, cadastro de clientes, controle financeiro e gestão de serviços em um único ambiente dificulta a administração das atividades profissionais</w:t>
-      </w:r>
-      <w:r>
-        <w:t xml:space="preserve">. A criação do </w:t>
-      </w:r>
-      <w:proofErr w:type="spellStart"/>
-      <w:r>
+        <w:rPr>
+          <w:lang w:val="pt-BR"/>
+        </w:rPr>
+      </w:pPr>
+      <w:r>
+        <w:rPr>
+          <w:lang w:val="pt-BR"/>
+        </w:rPr>
+        <w:t>Objetivos</w:t>
+      </w:r>
+    </w:p>
+    <w:p>
+      <w:pPr>
+        <w:pStyle w:val="Ttulo3"/>
+        <w:rPr/>
+      </w:pPr>
+      <w:r>
+        <w:rPr/>
+        <w:t>Geral</w:t>
+      </w:r>
+    </w:p>
+    <w:p>
+      <w:pPr>
+        <w:spacing w:before="240" w:after="240"/>
+      </w:pPr>
+      <w:r>
+        <w:rPr>
+          <w:rFonts w:eastAsia="Arial" w:cs="Arial"/>
+          <w:b w:val="1"/>
+          <w:bCs w:val="1"/>
+        </w:rPr>
+        <w:t>Objetivo Geral</w:t>
+      </w:r>
+    </w:p>
+    <w:p>
+      <w:pPr>
+        <w:pStyle w:val="Normal"/>
+      </w:pPr>
+      <w:r>
+        <w:rPr>
+          <w:rFonts w:ascii="Arial" w:hAnsi="Arial" w:eastAsia="Arial" w:cs="Arial"/>
+          <w:noProof w:val="0"/>
+          <w:sz w:val="24"/>
+          <w:szCs w:val="24"/>
+          <w:lang w:val="pt-BR"/>
+        </w:rPr>
+        <w:t>Desenvolver a plataforma DayPlannio para auxiliar profissionais autônomos na organização de sua rotina, integrando agenda de serviços, cadastro de clientes, controle financeiro, acompanhamento de atendimentos, métricas de desempenho e recursos de Internet das Coisas (IoT) para automatização de registros operacionais. A solução contará com aplicativo mobile para gestão das atividades do prestador, portal web para clientes acompanharem métricas e histórico de serviços realizados, portal administrativo para gerenciamento de clientes, prestadores e registros do sistema, além de uma área pública para divulgação dos serviços realizados por meio de um portfólio contendo fotos dos atendimentos, disponibilizadas mediante autorização do prestador. Dessa forma, todas as informações serão reunidas em um único ambiente digital, proporcionando uma gestão centralizada e eficiente das atividades profissionais.</w:t>
+      </w:r>
+    </w:p>
+    <w:p>
+      <w:pPr>
+        <w:pStyle w:val="Normal"/>
+        <w:rPr>
+          <w:rFonts w:ascii="Arial" w:hAnsi="Arial" w:eastAsia="Arial" w:cs="Arial"/>
+          <w:noProof w:val="0"/>
+          <w:sz w:val="24"/>
+          <w:szCs w:val="24"/>
+          <w:lang w:val="pt-BR"/>
+        </w:rPr>
+      </w:pPr>
+    </w:p>
+    <w:p>
+      <w:pPr>
+        <w:pStyle w:val="Normal"/>
+      </w:pPr>
+      <w:r>
+        <w:rPr>
+          <w:rFonts w:ascii="Arial" w:hAnsi="Arial" w:eastAsia="Arial" w:cs="Arial"/>
+          <w:noProof w:val="0"/>
+          <w:sz w:val="24"/>
+          <w:szCs w:val="24"/>
+          <w:lang w:val="pt-BR"/>
+        </w:rPr>
+        <w:t>A proposta busca proporcionar maior organização, produtividade e controle das atividades profissionais, oferecendo também recursos para acompanhamento dos serviços pelos clientes.</w:t>
+      </w:r>
+    </w:p>
+    <w:p>
+      <w:pPr>
+        <w:rPr>
+          <w:rFonts w:cs="Arial"/>
+        </w:rPr>
+      </w:pPr>
+    </w:p>
+    <w:p>
+      <w:pPr>
+        <w:pStyle w:val="Ttulo3"/>
+        <w:rPr/>
+      </w:pPr>
+      <w:r>
+        <w:rPr/>
+        <w:t>Específicos</w:t>
+      </w:r>
+    </w:p>
+    <w:p>
+      <w:pPr>
+        <w:rPr>
+          <w:rFonts w:cs="Arial"/>
+          <w:b w:val="1"/>
+          <w:bCs w:val="1"/>
+        </w:rPr>
+      </w:pPr>
+      <w:r>
+        <w:rPr>
+          <w:rFonts w:cs="Arial"/>
+          <w:b w:val="1"/>
+          <w:bCs w:val="1"/>
+        </w:rPr>
+        <w:t>Pesquisar Outras Aplicações de Gestão e Produtividade</w:t>
+      </w:r>
+    </w:p>
+    <w:p>
+      <w:pPr>
+        <w:pStyle w:val="Normal"/>
+      </w:pPr>
+      <w:r>
+        <w:rPr>
+          <w:rFonts w:ascii="Arial" w:hAnsi="Arial" w:eastAsia="Arial" w:cs="Arial"/>
+          <w:noProof w:val="0"/>
+          <w:sz w:val="24"/>
+          <w:szCs w:val="24"/>
+          <w:lang w:val="pt-BR"/>
+        </w:rPr>
+        <w:t>Analisar sistemas existentes de organização, agenda e gestão de atividades para identificar boas práticas e funcionalidades relevantes, como visualização de dados, integração com calendários, controle financeiro, acompanhamento de métricas, histórico de serviços, portais web e recursos de geolocalização, garantindo que o DayPlannio ofereça uma experiência moderna, eficiente e alinhada às necessidades dos usuários.</w:t>
+      </w:r>
+    </w:p>
+    <w:p>
+      <w:pPr>
+        <w:rPr>
+          <w:rFonts w:cs="Arial"/>
+        </w:rPr>
+      </w:pPr>
+    </w:p>
+    <w:p>
+      <w:pPr>
+        <w:rPr>
+          <w:rFonts w:cs="Arial"/>
+          <w:b w:val="1"/>
+          <w:bCs w:val="1"/>
+        </w:rPr>
+      </w:pPr>
+    </w:p>
+    <w:p>
+      <w:r>
+        <w:br w:type="page"/>
+      </w:r>
+    </w:p>
+    <w:p>
+      <w:pPr>
+        <w:pStyle w:val="Normal"/>
+        <w:rPr>
+          <w:rFonts w:cs="Arial"/>
+          <w:b w:val="1"/>
+          <w:bCs w:val="1"/>
+        </w:rPr>
+      </w:pPr>
+      <w:r>
+        <w:rPr>
+          <w:rFonts w:cs="Arial"/>
+          <w:b w:val="1"/>
+          <w:bCs w:val="1"/>
+        </w:rPr>
+        <w:t>Identificar</w:t>
+      </w:r>
+      <w:r>
+        <w:rPr>
+          <w:rFonts w:cs="Arial"/>
+          <w:b w:val="1"/>
+          <w:bCs w:val="1"/>
+        </w:rPr>
+        <w:t xml:space="preserve"> </w:t>
+      </w:r>
+      <w:r>
+        <w:rPr>
+          <w:rFonts w:cs="Arial"/>
+          <w:b w:val="1"/>
+          <w:bCs w:val="1"/>
+        </w:rPr>
+        <w:t>ferramentas</w:t>
+      </w:r>
+    </w:p>
+    <w:p>
+      <w:pPr>
+        <w:pStyle w:val="Normal"/>
+      </w:pPr>
+      <w:r>
+        <w:rPr>
+          <w:rFonts w:ascii="Arial" w:hAnsi="Arial" w:eastAsia="Arial" w:cs="Arial"/>
+          <w:noProof w:val="0"/>
+          <w:sz w:val="24"/>
+          <w:szCs w:val="24"/>
+          <w:lang w:val="pt-BR"/>
+        </w:rPr>
+        <w:t>Definir os requisitos técnicos e funcionais da aplicação, considerando aspectos como desenvolvimento front-end, back-end, banco de dados, segurança, escalabilidade, geolocalização, Internet das Coisas (IoT), mineração de dados, computação em nuvem e manutenção. Para assegurar que o desenvolvimento da aplicação seja eficiente, seguro e escalável.</w:t>
+      </w:r>
+    </w:p>
+    <w:p>
+      <w:pPr>
+        <w:bidi w:val="0"/>
+        <w:spacing w:before="240" w:beforeAutospacing="off" w:after="240" w:afterAutospacing="off"/>
+        <w:jc w:val="left"/>
+        <w:rPr>
+          <w:rFonts w:ascii="Arial" w:hAnsi="Arial" w:eastAsia="Arial" w:cs="Arial"/>
+          <w:noProof w:val="0"/>
+          <w:sz w:val="24"/>
+          <w:szCs w:val="24"/>
+          <w:lang w:val="pt-BR"/>
+        </w:rPr>
+      </w:pPr>
+    </w:p>
+    <w:p>
+      <w:pPr>
+        <w:pStyle w:val="Ttulo2"/>
+        <w:suppressLineNumbers w:val="0"/>
+        <w:bidi w:val="0"/>
+        <w:spacing w:before="0" w:beforeAutospacing="off" w:after="0" w:afterAutospacing="off" w:line="360" w:lineRule="auto"/>
+        <w:ind w:left="576" w:right="0" w:hanging="576"/>
+        <w:jc w:val="left"/>
+        <w:rPr/>
+      </w:pPr>
+      <w:r>
+        <w:rPr/>
+        <w:t>METODOLOGIA</w:t>
+      </w:r>
+    </w:p>
+    <w:p>
+      <w:pPr>
+        <w:pStyle w:val="Normal"/>
+      </w:pPr>
+      <w:r>
+        <w:rPr>
+          <w:rFonts w:ascii="Arial" w:hAnsi="Arial" w:eastAsia="Arial" w:cs="Arial"/>
+          <w:noProof w:val="0"/>
+          <w:sz w:val="24"/>
+          <w:szCs w:val="24"/>
+          <w:lang w:val="pt-BR"/>
+        </w:rPr>
+        <w:t xml:space="preserve">Para o desenvolvimento da plataforma </w:t>
+      </w:r>
+      <w:r>
+        <w:rPr>
+          <w:rFonts w:ascii="Arial" w:hAnsi="Arial" w:eastAsia="Arial" w:cs="Arial"/>
+          <w:noProof w:val="0"/>
+          <w:sz w:val="24"/>
+          <w:szCs w:val="24"/>
+          <w:lang w:val="pt-BR"/>
+        </w:rPr>
         <w:t>DayPlannio</w:t>
       </w:r>
-      <w:proofErr w:type="spellEnd"/>
-      <w:r>
-        <w:t xml:space="preserve"> surge para suprir essa necessidade, oferecendo uma plataforma integrada que permite organizar compromissos, acompanhar atendimentos, registrar clientes e controlar ganhos e despesas, contribuindo para uma gestão mais eficiente, produtiva e organizada da rotina de trabalho.</w:t>
-      </w:r>
-    </w:p>
-    <w:p/>
-    <w:p>
-      <w:pPr>
-        <w:pStyle w:val="Ttulo2"/>
-      </w:pPr>
-      <w:bookmarkStart w:name="_Toc165310847" w:id="3"/>
-      <w:bookmarkStart w:name="_Toc182927330" w:id="4"/>
-      <w:bookmarkStart w:name="_Toc275318808" w:id="5"/>
-      <w:bookmarkStart w:name="_Toc230779094" w:id="6"/>
-      <w:r>
-        <w:t>Métodos</w:t>
-      </w:r>
-      <w:r>
-        <w:t xml:space="preserve"> utilizados</w:t>
-      </w:r>
-      <w:bookmarkEnd w:id="3"/>
-      <w:bookmarkEnd w:id="4"/>
-      <w:bookmarkEnd w:id="5"/>
-      <w:bookmarkEnd w:id="6"/>
-    </w:p>
-    <w:p>
-      <w:r>
-        <w:rPr>
-          <w:rFonts w:eastAsia="Arial" w:cs="Arial"/>
-          <w:szCs w:val="24"/>
-        </w:rPr>
-        <w:t xml:space="preserve">Para o desenvolvimento da aplicação web, foram adotadas ferramentas e tecnologias atuais que contribuem para a construção de um sistema eficiente, seguro e de fácil manutenção. A escolha dessas tecnologias visa otimizar o processo de desenvolvimento e garantir uma </w:t>
-      </w:r>
-      <w:r>
-        <w:rPr>
-          <w:rFonts w:eastAsia="Arial" w:cs="Arial"/>
-          <w:szCs w:val="24"/>
-        </w:rPr>
-        <w:t>melhor</w:t>
-      </w:r>
-      <w:r>
-        <w:rPr>
-          <w:rFonts w:eastAsia="Arial" w:cs="Arial"/>
-          <w:szCs w:val="24"/>
-        </w:rPr>
-        <w:t xml:space="preserve"> integração entre os módulos da aplicação. Dentre as ferramentas utilizadas, estão: </w:t>
-      </w:r>
-    </w:p>
-    <w:p>
-      <w:pPr>
-        <w:ind w:firstLine="0"/>
-        <w:rPr>
-          <w:rFonts w:cs="Arial"/>
-        </w:rPr>
-      </w:pPr>
+      <w:r>
+        <w:rPr>
+          <w:rFonts w:ascii="Arial" w:hAnsi="Arial" w:eastAsia="Arial" w:cs="Arial"/>
+          <w:noProof w:val="0"/>
+          <w:sz w:val="24"/>
+          <w:szCs w:val="24"/>
+          <w:lang w:val="pt-BR"/>
+        </w:rPr>
+        <w:t>, foram adotadas ferramentas e tecnologias atuais que contribuem para a construção de um sistema eficiente, seguro e de fácil manutenção. A escolha dessas tecnologias visa otimizar o processo de desenvolvimento e garantir a integração entre os módulos mobile, web, nuvem, IoT e mineração de dados da aplicação. Dentre as ferramentas utilizadas, estão:</w:t>
+      </w:r>
+    </w:p>
+    <w:p>
+      <w:pPr>
+        <w:pStyle w:val="Normal"/>
+        <w:rPr>
+          <w:b w:val="1"/>
+          <w:bCs w:val="1"/>
+        </w:rPr>
+      </w:pPr>
+      <w:bookmarkStart w:name="_Toc165310848" w:id="7"/>
+      <w:r>
+        <w:rPr>
+          <w:b w:val="1"/>
+          <w:bCs w:val="1"/>
+        </w:rPr>
+        <w:t>Linguagens de Programação</w:t>
+      </w:r>
+      <w:bookmarkEnd w:id="7"/>
+    </w:p>
+    <w:p>
+      <w:pPr>
+        <w:spacing w:before="240" w:beforeAutospacing="off" w:after="240" w:afterAutospacing="off"/>
+        <w:ind/>
+      </w:pPr>
+      <w:r>
+        <w:rPr>
+          <w:rFonts w:ascii="Arial" w:hAnsi="Arial" w:eastAsia="Arial" w:cs="Arial"/>
+          <w:noProof w:val="0"/>
+          <w:sz w:val="24"/>
+          <w:szCs w:val="24"/>
+          <w:lang w:val="pt-BR"/>
+        </w:rPr>
+        <w:t>Foi utilizada a linguagem C#, responsável pela implementação da lógica de negócio da aplicação, APIs, funcionalidades do aplicativo mobile e dos portais web.</w:t>
+      </w:r>
+    </w:p>
+    <w:p>
+      <w:pPr>
+        <w:spacing w:before="240" w:beforeAutospacing="off" w:after="240" w:afterAutospacing="off"/>
+        <w:ind/>
+      </w:pPr>
+      <w:r>
+        <w:rPr>
+          <w:rFonts w:ascii="Arial" w:hAnsi="Arial" w:eastAsia="Arial" w:cs="Arial"/>
+          <w:noProof w:val="0"/>
+          <w:sz w:val="24"/>
+          <w:szCs w:val="24"/>
+          <w:lang w:val="pt-BR"/>
+        </w:rPr>
+        <w:t>O C# é uma linguagem moderna, orientada a objetos e amplamente utilizada na plataforma .NET. Sua utilização proporciona maior organização do código, segurança, alto desempenho e facilidade de manutenção, contribuindo para a construção de uma aplicação robusta, escalável e eficiente.</w:t>
+      </w:r>
     </w:p>
     <w:p>
       <w:pPr>
@@ -10466,369 +10759,436 @@
           <w:bCs/>
         </w:rPr>
       </w:pPr>
-      <w:bookmarkStart w:name="_Toc165310848" w:id="7"/>
-      <w:r>
-        <w:rPr>
-          <w:b/>
-          <w:bCs/>
-        </w:rPr>
-        <w:t>Linguagens de Programação</w:t>
-      </w:r>
-      <w:bookmarkEnd w:id="7"/>
-    </w:p>
-    <w:p>
-      <w:pPr>
+      <w:bookmarkStart w:name="_Toc165310849" w:id="8"/>
+      <w:r>
+        <w:rPr>
+          <w:b w:val="1"/>
+          <w:bCs w:val="1"/>
+        </w:rPr>
+        <w:t>Frameworks e Bibliotecas</w:t>
+      </w:r>
+      <w:bookmarkEnd w:id="8"/>
+    </w:p>
+    <w:p>
+      <w:pPr>
+        <w:spacing w:before="240" w:beforeAutospacing="off" w:after="240" w:afterAutospacing="off"/>
+      </w:pPr>
+      <w:r>
+        <w:rPr>
+          <w:rFonts w:ascii="Arial" w:hAnsi="Arial" w:eastAsia="Arial" w:cs="Arial"/>
+          <w:noProof w:val="0"/>
+          <w:sz w:val="24"/>
+          <w:szCs w:val="24"/>
+          <w:lang w:val="pt-BR"/>
+        </w:rPr>
+        <w:t>No desenvolvimento mobile foi utilizado o .NET MAUI, permitindo a criação de aplicações multiplataforma para Android e iOS a partir de uma única base de código.</w:t>
+      </w:r>
+    </w:p>
+    <w:p>
+      <w:pPr>
+        <w:spacing w:before="240" w:beforeAutospacing="off" w:after="240" w:afterAutospacing="off"/>
+      </w:pPr>
+      <w:r>
+        <w:rPr>
+          <w:rFonts w:ascii="Arial" w:hAnsi="Arial" w:eastAsia="Arial" w:cs="Arial"/>
+          <w:noProof w:val="0"/>
+          <w:sz w:val="24"/>
+          <w:szCs w:val="24"/>
+          <w:lang w:val="pt-BR"/>
+        </w:rPr>
+        <w:t>O .NET MAUI permite desenvolver aplicações capazes de rodar em diferentes sistemas operacionais, como Android e iOS. Isso facilita o processo de desenvolvimento e manutenção, além de possibilitar a criação de interfaces modernas, responsivas e adaptadas para dispositivos móveis.</w:t>
+      </w:r>
+    </w:p>
+    <w:p>
+      <w:pPr>
+        <w:spacing w:before="240" w:beforeAutospacing="off" w:after="240" w:afterAutospacing="off"/>
+      </w:pPr>
+      <w:r>
+        <w:rPr>
+          <w:rFonts w:ascii="Arial" w:hAnsi="Arial" w:eastAsia="Arial" w:cs="Arial"/>
+          <w:noProof w:val="0"/>
+          <w:sz w:val="24"/>
+          <w:szCs w:val="24"/>
+          <w:lang w:val="pt-BR"/>
+        </w:rPr>
+        <w:t>No backend foi utilizado o ASP.NET para construção das APIs responsáveis pela comunicação entre a aplicação, o banco de dados e os serviços web.</w:t>
+      </w:r>
+    </w:p>
+    <w:p>
+      <w:pPr>
+        <w:spacing w:before="240" w:beforeAutospacing="off" w:after="240" w:afterAutospacing="off"/>
+      </w:pPr>
+      <w:r>
+        <w:rPr>
+          <w:rFonts w:ascii="Arial" w:hAnsi="Arial" w:eastAsia="Arial" w:cs="Arial"/>
+          <w:noProof w:val="0"/>
+          <w:sz w:val="24"/>
+          <w:szCs w:val="24"/>
+          <w:lang w:val="pt-BR"/>
+        </w:rPr>
+        <w:t>Para os portais web foi utilizado o ASP.NET MVC, permitindo a construção das interfaces destinadas aos clientes, administradores e ao portfólio público dos prestadores de serviço.</w:t>
+      </w:r>
+    </w:p>
+    <w:p>
+      <w:pPr>
+        <w:pStyle w:val="Normal"/>
+        <w:rPr>
+          <w:b w:val="1"/>
+          <w:bCs w:val="1"/>
+        </w:rPr>
+      </w:pPr>
+      <w:r>
+        <w:rPr>
+          <w:rFonts w:ascii="Arial" w:hAnsi="Arial" w:eastAsia="Arial" w:cs="Arial"/>
+          <w:b w:val="1"/>
+          <w:bCs w:val="1"/>
+          <w:noProof w:val="0"/>
+          <w:sz w:val="24"/>
+          <w:szCs w:val="24"/>
+          <w:lang w:val="pt-BR"/>
+        </w:rPr>
+        <w:t>Internet das Coisas (IoT)</w:t>
+      </w:r>
+    </w:p>
+    <w:p>
+      <w:pPr>
+        <w:pStyle w:val="Normal"/>
+      </w:pPr>
+      <w:r>
+        <w:rPr>
+          <w:rFonts w:ascii="Arial" w:hAnsi="Arial" w:eastAsia="Arial" w:cs="Arial"/>
+          <w:noProof w:val="0"/>
+          <w:sz w:val="24"/>
+          <w:szCs w:val="24"/>
+          <w:lang w:val="pt-BR"/>
+        </w:rPr>
+        <w:t xml:space="preserve">Para a implementação das funcionalidades de </w:t>
+      </w:r>
+      <w:r>
+        <w:rPr>
+          <w:rFonts w:ascii="Arial" w:hAnsi="Arial" w:eastAsia="Arial" w:cs="Arial"/>
+          <w:noProof w:val="0"/>
+          <w:sz w:val="24"/>
+          <w:szCs w:val="24"/>
+          <w:lang w:val="pt-BR"/>
+        </w:rPr>
+        <w:t>geofencing</w:t>
+      </w:r>
+      <w:r>
+        <w:rPr>
+          <w:rFonts w:ascii="Arial" w:hAnsi="Arial" w:eastAsia="Arial" w:cs="Arial"/>
+          <w:noProof w:val="0"/>
+          <w:sz w:val="24"/>
+          <w:szCs w:val="24"/>
+          <w:lang w:val="pt-BR"/>
+        </w:rPr>
+        <w:t>, serão utilizados recursos de geolocalização integrados à plataforma. Por meio da criação de cercas virtuais em torno do local do atendimento, o sistema será capaz de identificar automaticamente a chegada e a saída do prestador de serviço, registrando essas informações e enviando os dados para processamento sem a necessidade de interação manual do usuário.</w:t>
+      </w:r>
+    </w:p>
+    <w:p>
+      <w:pPr>
+        <w:pStyle w:val="Normal"/>
+        <w:rPr>
+          <w:rFonts w:ascii="Arial" w:hAnsi="Arial" w:eastAsia="Arial" w:cs="Arial"/>
+          <w:noProof w:val="0"/>
+          <w:sz w:val="24"/>
+          <w:szCs w:val="24"/>
+          <w:lang w:val="pt-BR"/>
+        </w:rPr>
+      </w:pPr>
+    </w:p>
+    <w:p>
+      <w:pPr>
+        <w:pStyle w:val="Normal"/>
+        <w:rPr>
+          <w:b w:val="1"/>
+          <w:bCs w:val="1"/>
+        </w:rPr>
+      </w:pPr>
+      <w:r>
+        <w:rPr>
+          <w:rFonts w:ascii="Arial" w:hAnsi="Arial" w:eastAsia="Arial" w:cs="Arial"/>
+          <w:b w:val="1"/>
+          <w:bCs w:val="1"/>
+          <w:noProof w:val="0"/>
+          <w:sz w:val="24"/>
+          <w:szCs w:val="24"/>
+          <w:lang w:val="pt-BR"/>
+        </w:rPr>
+        <w:t>Mineração de Dados</w:t>
+      </w:r>
+    </w:p>
+    <w:p>
+      <w:pPr>
+        <w:pStyle w:val="Normal"/>
+      </w:pPr>
+      <w:r>
+        <w:rPr>
+          <w:rFonts w:ascii="Arial" w:hAnsi="Arial" w:eastAsia="Arial" w:cs="Arial"/>
+          <w:noProof w:val="0"/>
+          <w:sz w:val="24"/>
+          <w:szCs w:val="24"/>
+          <w:lang w:val="pt-BR"/>
+        </w:rPr>
+        <w:t>Técnicas de mineração de dados serão utilizadas para coletar, organizar e analisar as informações geradas pelos atendimentos realizados na plataforma. Os dados processados permitirão a geração de métricas relacionadas à produtividade, faturamento, tempo trabalhado, desempenho dos atendimentos e demais indicadores disponibilizados nos dashboards do sistema.</w:t>
+      </w:r>
+      <w:bookmarkStart w:name="_Toc165310851" w:id="9"/>
+    </w:p>
+    <w:p>
+      <w:pPr>
+        <w:ind w:firstLine="0"/>
         <w:rPr>
           <w:rFonts w:eastAsia="Arial" w:cs="Arial"/>
           <w:szCs w:val="24"/>
         </w:rPr>
       </w:pPr>
-      <w:r>
-        <w:t xml:space="preserve">Para o desenvolvimento da aplicação foi utilizada a linguagem de programação C#, responsável pela implementação da lógica do sistema, tanto no </w:t>
+    </w:p>
+    <w:p>
+      <w:pPr>
+        <w:rPr>
+          <w:b w:val="1"/>
+          <w:bCs w:val="1"/>
+        </w:rPr>
+      </w:pPr>
+      <w:r>
+        <w:rPr>
+          <w:b w:val="1"/>
+          <w:bCs w:val="1"/>
+        </w:rPr>
+        <w:t>Banco de Dados</w:t>
+      </w:r>
+      <w:bookmarkEnd w:id="9"/>
+    </w:p>
+    <w:p>
+      <w:r>
+        <w:rPr>
+          <w:rFonts w:eastAsia="Arial" w:cs="Arial"/>
+          <w:szCs w:val="24"/>
+        </w:rPr>
+        <w:t xml:space="preserve">Para o armazenamento e gerenciamento dos dados da aplicação, foi utilizado o </w:t>
       </w:r>
       <w:proofErr w:type="spellStart"/>
       <w:r>
-        <w:t>frontend</w:t>
+        <w:rPr>
+          <w:rFonts w:eastAsia="Arial" w:cs="Arial"/>
+          <w:szCs w:val="24"/>
+        </w:rPr>
+        <w:t>MongoDB</w:t>
       </w:r>
       <w:proofErr w:type="spellEnd"/>
       <w:r>
-        <w:t xml:space="preserve"> quanto no </w:t>
-      </w:r>
-      <w:proofErr w:type="spellStart"/>
-      <w:r>
-        <w:t>backend</w:t>
-      </w:r>
-      <w:proofErr w:type="spellEnd"/>
-      <w:r>
-        <w:t>.</w:t>
-      </w:r>
-    </w:p>
-    <w:p>
-      <w:pPr>
         <w:rPr>
           <w:rFonts w:eastAsia="Arial" w:cs="Arial"/>
           <w:szCs w:val="24"/>
         </w:rPr>
-      </w:pPr>
-      <w:r>
-        <w:t>O C# é uma linguagem moderna, orientada a objetos e amplamente utilizada na plataforma .NET. Sua utilização proporciona maior organização do código, segurança, alto desempenho e facilidade de manutenção, contribuindo para a construção de uma aplicação robusta, escalável e eficiente.</w:t>
-      </w:r>
-    </w:p>
-    <w:p>
-      <w:pPr>
-        <w:ind w:firstLine="0"/>
-      </w:pPr>
-    </w:p>
-    <w:p>
-      <w:pPr>
-        <w:rPr>
-          <w:b/>
-          <w:bCs/>
-        </w:rPr>
-      </w:pPr>
-      <w:bookmarkStart w:name="_Toc165310849" w:id="8"/>
-      <w:r>
-        <w:rPr>
-          <w:b/>
-          <w:bCs/>
-        </w:rPr>
-        <w:t>Frameworks e Bibliotecas</w:t>
-      </w:r>
-      <w:bookmarkEnd w:id="8"/>
-    </w:p>
-    <w:p>
-      <w:pPr>
-        <w:ind w:firstLine="708"/>
+        <w:t>, um sistema de gerenciamento de banco de dados não relacional amplamente utilizado no mercado.</w:t>
+      </w:r>
+    </w:p>
+    <w:p>
+      <w:pPr>
         <w:rPr>
           <w:rFonts w:eastAsia="Arial" w:cs="Arial"/>
           <w:szCs w:val="24"/>
         </w:rPr>
       </w:pPr>
+    </w:p>
+    <w:p>
+      <w:pPr>
+        <w:widowControl w:val="1"/>
+        <w:spacing w:line="240" w:lineRule="auto"/>
+      </w:pPr>
       <w:r>
         <w:rPr>
           <w:rFonts w:eastAsia="Arial" w:cs="Arial"/>
-          <w:szCs w:val="24"/>
-        </w:rPr>
-        <w:t xml:space="preserve">Para o desenvolvimento da aplicação mobile, </w:t>
+        </w:rPr>
+        <w:t xml:space="preserve">O </w:t>
       </w:r>
       <w:r>
         <w:rPr>
           <w:rFonts w:eastAsia="Arial" w:cs="Arial"/>
-          <w:szCs w:val="24"/>
-        </w:rPr>
-        <w:t>foi</w:t>
+        </w:rPr>
+        <w:t>MongoDB</w:t>
       </w:r>
       <w:r>
         <w:rPr>
           <w:rFonts w:eastAsia="Arial" w:cs="Arial"/>
-          <w:szCs w:val="24"/>
-        </w:rPr>
-        <w:t xml:space="preserve"> utilizado o .NET MAUI (</w:t>
-      </w:r>
-      <w:proofErr w:type="spellStart"/>
-      <w:r>
+        </w:rPr>
+        <w:t xml:space="preserve"> oferece alta flexibilidade na modelagem dos dados, permitindo o armazenamento em formato de documentos (JSON/BSON), o que facilita a adaptação a diferentes estruturas e requisitos da aplicação. Além disso, apresenta bom desempenho, alta escalabilidade horizontal e suporte a grandes volumes de dados.</w:t>
+      </w:r>
+    </w:p>
+    <w:p>
+      <w:pPr>
+        <w:widowControl w:val="1"/>
+        <w:spacing w:line="240" w:lineRule="auto"/>
         <w:rPr>
           <w:rFonts w:eastAsia="Arial" w:cs="Arial"/>
-          <w:szCs w:val="24"/>
-        </w:rPr>
-        <w:t>Multi-platform</w:t>
-      </w:r>
-      <w:proofErr w:type="spellEnd"/>
-      <w:r>
+        </w:rPr>
+      </w:pPr>
+    </w:p>
+    <w:p>
+      <w:pPr>
+        <w:widowControl w:val="1"/>
+        <w:spacing w:line="240" w:lineRule="auto"/>
         <w:rPr>
           <w:rFonts w:eastAsia="Arial" w:cs="Arial"/>
-          <w:szCs w:val="24"/>
-        </w:rPr>
-        <w:t xml:space="preserve"> </w:t>
-      </w:r>
-      <w:proofErr w:type="spellStart"/>
-      <w:r>
-        <w:rPr>
-          <w:rFonts w:eastAsia="Arial" w:cs="Arial"/>
-          <w:szCs w:val="24"/>
-        </w:rPr>
-        <w:t>App</w:t>
-      </w:r>
-      <w:proofErr w:type="spellEnd"/>
-      <w:r>
-        <w:rPr>
-          <w:rFonts w:eastAsia="Arial" w:cs="Arial"/>
-          <w:szCs w:val="24"/>
-        </w:rPr>
-        <w:t xml:space="preserve"> UI), um framework da plataforma .NET voltado para a criação de aplicativos </w:t>
-      </w:r>
-      <w:proofErr w:type="spellStart"/>
-      <w:r>
-        <w:rPr>
-          <w:rFonts w:eastAsia="Arial" w:cs="Arial"/>
-          <w:szCs w:val="24"/>
-        </w:rPr>
-        <w:t>multiplataforma</w:t>
-      </w:r>
-      <w:proofErr w:type="spellEnd"/>
-      <w:r>
-        <w:rPr>
-          <w:rFonts w:eastAsia="Arial" w:cs="Arial"/>
-          <w:szCs w:val="24"/>
-        </w:rPr>
-        <w:t>.</w:t>
-      </w:r>
-    </w:p>
-    <w:p>
-      <w:pPr>
-        <w:ind w:firstLine="0"/>
-        <w:rPr>
-          <w:rFonts w:eastAsia="Arial" w:cs="Arial"/>
-          <w:szCs w:val="24"/>
-        </w:rPr>
-      </w:pPr>
-    </w:p>
-    <w:p>
-      <w:pPr>
-        <w:ind w:firstLine="708"/>
-        <w:rPr>
-          <w:rFonts w:eastAsia="Arial" w:cs="Arial"/>
-          <w:szCs w:val="24"/>
-        </w:rPr>
-      </w:pPr>
-      <w:r>
-        <w:rPr>
-          <w:rFonts w:eastAsia="Arial" w:cs="Arial"/>
-          <w:szCs w:val="24"/>
-        </w:rPr>
-        <w:lastRenderedPageBreak/>
-        <w:t xml:space="preserve">O .NET MAUI permite desenvolver aplicações capazes de rodar em diferentes sistemas operacionais, como </w:t>
-      </w:r>
-      <w:proofErr w:type="spellStart"/>
-      <w:r>
-        <w:rPr>
-          <w:rFonts w:eastAsia="Arial" w:cs="Arial"/>
-          <w:szCs w:val="24"/>
-        </w:rPr>
-        <w:t>Android</w:t>
-      </w:r>
-      <w:proofErr w:type="spellEnd"/>
-      <w:r>
-        <w:rPr>
-          <w:rFonts w:eastAsia="Arial" w:cs="Arial"/>
-          <w:szCs w:val="24"/>
-        </w:rPr>
-        <w:t xml:space="preserve"> e iOS, a partir de uma única base de código. Isso facilita o processo de desenvolvimento e manutenção, além de possibilitar a criação de interfaces modernas, responsivas e adaptadas para dispositivos móveis.</w:t>
-      </w:r>
-    </w:p>
-    <w:p>
-      <w:pPr>
-        <w:ind w:firstLine="0"/>
-        <w:rPr>
-          <w:rFonts w:eastAsia="Arial" w:cs="Arial"/>
-          <w:szCs w:val="24"/>
-        </w:rPr>
-      </w:pPr>
-    </w:p>
-    <w:p>
-      <w:pPr>
-        <w:rPr>
-          <w:rFonts w:eastAsia="Arial" w:cs="Arial"/>
-          <w:szCs w:val="24"/>
-        </w:rPr>
-      </w:pPr>
-      <w:bookmarkStart w:name="_Toc165310851" w:id="9"/>
-      <w:r>
-        <w:rPr>
-          <w:rFonts w:eastAsia="Arial" w:cs="Arial"/>
-          <w:szCs w:val="24"/>
-        </w:rPr>
-        <w:t xml:space="preserve">No </w:t>
-      </w:r>
-      <w:proofErr w:type="spellStart"/>
-      <w:r>
-        <w:rPr>
-          <w:rFonts w:eastAsia="Arial" w:cs="Arial"/>
-          <w:szCs w:val="24"/>
-        </w:rPr>
-        <w:t>backend</w:t>
-      </w:r>
-      <w:proofErr w:type="spellEnd"/>
-      <w:r>
-        <w:rPr>
-          <w:rFonts w:eastAsia="Arial" w:cs="Arial"/>
-          <w:szCs w:val="24"/>
-        </w:rPr>
-        <w:t xml:space="preserve">, </w:t>
-      </w:r>
-      <w:r>
-        <w:rPr>
-          <w:rFonts w:eastAsia="Arial" w:cs="Arial"/>
-          <w:szCs w:val="24"/>
-        </w:rPr>
-        <w:t>foi</w:t>
-      </w:r>
-      <w:r>
-        <w:rPr>
-          <w:rFonts w:eastAsia="Arial" w:cs="Arial"/>
-          <w:szCs w:val="24"/>
-        </w:rPr>
-        <w:t xml:space="preserve"> utilizado o ASP.NET, responsável pela construção da API que fará a comunicação entre o aplicativo e o banco de dados. O ASP.NET é amplamente utilizado para o desenvolvimento de aplicações web e </w:t>
-      </w:r>
-      <w:proofErr w:type="spellStart"/>
-      <w:r>
-        <w:rPr>
-          <w:rFonts w:eastAsia="Arial" w:cs="Arial"/>
-          <w:szCs w:val="24"/>
-        </w:rPr>
-        <w:t>APIs</w:t>
-      </w:r>
-      <w:proofErr w:type="spellEnd"/>
-      <w:r>
-        <w:rPr>
-          <w:rFonts w:eastAsia="Arial" w:cs="Arial"/>
-          <w:szCs w:val="24"/>
-        </w:rPr>
-        <w:t xml:space="preserve"> REST, oferecendo alto desempenho, segurança e integração nativa com o ecossistema .NET.</w:t>
-      </w:r>
-    </w:p>
-    <w:p>
-      <w:pPr>
-        <w:ind w:firstLine="0"/>
-        <w:rPr>
-          <w:rFonts w:eastAsia="Arial" w:cs="Arial"/>
-          <w:szCs w:val="24"/>
-        </w:rPr>
-      </w:pPr>
-    </w:p>
-    <w:p>
-      <w:pPr>
-        <w:rPr>
-          <w:b/>
-          <w:bCs/>
-        </w:rPr>
-      </w:pPr>
-      <w:r>
-        <w:rPr>
-          <w:b/>
-          <w:bCs/>
-        </w:rPr>
-        <w:t>Banco de Dados</w:t>
-      </w:r>
-      <w:r>
-        <w:rPr>
-          <w:b/>
-          <w:bCs/>
-        </w:rPr>
-        <w:t>:</w:t>
-      </w:r>
-      <w:bookmarkEnd w:id="9"/>
-    </w:p>
-    <w:p>
-      <w:r>
-        <w:rPr>
-          <w:rFonts w:eastAsia="Arial" w:cs="Arial"/>
-          <w:szCs w:val="24"/>
-        </w:rPr>
-        <w:t xml:space="preserve">Para o armazenamento e gerenciamento dos dados da aplicação, foi utilizado o </w:t>
-      </w:r>
-      <w:proofErr w:type="spellStart"/>
-      <w:r>
-        <w:rPr>
-          <w:rFonts w:eastAsia="Arial" w:cs="Arial"/>
-          <w:szCs w:val="24"/>
+        </w:rPr>
+      </w:pPr>
+    </w:p>
+    <w:p>
+      <w:pPr>
+        <w:pStyle w:val="Normal"/>
+        <w:rPr>
+          <w:rFonts w:ascii="Arial" w:hAnsi="Arial" w:eastAsia="Arial" w:cs="Arial"/>
+          <w:b w:val="1"/>
+          <w:bCs w:val="1"/>
+          <w:noProof w:val="0"/>
+          <w:sz w:val="24"/>
+          <w:szCs w:val="24"/>
+          <w:lang w:val="pt-BR"/>
+        </w:rPr>
+      </w:pPr>
+    </w:p>
+    <w:p>
+      <w:pPr/>
+      <w:r>
+        <w:br w:type="page"/>
+      </w:r>
+    </w:p>
+    <w:p>
+      <w:pPr>
+        <w:pStyle w:val="Normal"/>
+        <w:rPr>
+          <w:rFonts w:ascii="Arial" w:hAnsi="Arial" w:eastAsia="Arial" w:cs="Arial"/>
+          <w:b w:val="1"/>
+          <w:bCs w:val="1"/>
+          <w:noProof w:val="0"/>
+          <w:sz w:val="24"/>
+          <w:szCs w:val="24"/>
+          <w:lang w:val="pt-BR"/>
+        </w:rPr>
+      </w:pPr>
+      <w:r>
+        <w:rPr>
+          <w:rFonts w:ascii="Arial" w:hAnsi="Arial" w:eastAsia="Arial" w:cs="Arial"/>
+          <w:b w:val="1"/>
+          <w:bCs w:val="1"/>
+          <w:noProof w:val="0"/>
+          <w:sz w:val="24"/>
+          <w:szCs w:val="24"/>
+          <w:lang w:val="pt-BR"/>
+        </w:rPr>
+        <w:t>Computação em Nuvem</w:t>
+      </w:r>
+    </w:p>
+    <w:p>
+      <w:pPr>
+        <w:spacing w:before="240" w:beforeAutospacing="off" w:after="240" w:afterAutospacing="off"/>
+      </w:pPr>
+      <w:r>
+        <w:rPr>
+          <w:rFonts w:ascii="Arial" w:hAnsi="Arial" w:eastAsia="Arial" w:cs="Arial"/>
+          <w:noProof w:val="0"/>
+          <w:sz w:val="24"/>
+          <w:szCs w:val="24"/>
+          <w:lang w:val="pt-BR"/>
+        </w:rPr>
+        <w:t>Para o armazenamento e processamento das informações da plataforma, serão utilizados os serviços de nuvem da Microsoft Azure em conjunto com o MongoDB Atlas. A infraestrutura em nuvem será responsável por armazenar os dados da aplicação, incluindo informações dos atendimentos, métricas geradas pelo sistema e imagens utilizadas no portfólio dos prestadores.</w:t>
+      </w:r>
+    </w:p>
+    <w:p>
+      <w:pPr>
+        <w:widowControl w:val="1"/>
+        <w:spacing w:before="240" w:beforeAutospacing="off" w:after="240" w:afterAutospacing="off" w:line="240" w:lineRule="auto"/>
+        <w:ind/>
+      </w:pPr>
+      <w:r>
+        <w:rPr>
+          <w:rFonts w:ascii="Arial" w:hAnsi="Arial" w:eastAsia="Arial" w:cs="Arial"/>
+          <w:noProof w:val="0"/>
+          <w:sz w:val="24"/>
+          <w:szCs w:val="24"/>
+          <w:lang w:val="pt-BR"/>
+        </w:rPr>
+        <w:t xml:space="preserve">A utilização da Azure permitirá a integração entre os diferentes módulos da plataforma, enquanto o </w:t>
+      </w:r>
+      <w:r>
+        <w:rPr>
+          <w:rFonts w:ascii="Arial" w:hAnsi="Arial" w:eastAsia="Arial" w:cs="Arial"/>
+          <w:noProof w:val="0"/>
+          <w:sz w:val="24"/>
+          <w:szCs w:val="24"/>
+          <w:lang w:val="pt-BR"/>
         </w:rPr>
         <w:t>MongoDB</w:t>
       </w:r>
-      <w:proofErr w:type="spellEnd"/>
-      <w:r>
-        <w:rPr>
-          <w:rFonts w:eastAsia="Arial" w:cs="Arial"/>
-          <w:szCs w:val="24"/>
-        </w:rPr>
-        <w:t>, um sistema de gerenciamento de banco de dados não relacional amplamente utilizado no mercado.</w:t>
-      </w:r>
-    </w:p>
-    <w:p>
-      <w:pPr>
-        <w:rPr>
-          <w:rFonts w:eastAsia="Arial" w:cs="Arial"/>
-          <w:szCs w:val="24"/>
-        </w:rPr>
-      </w:pPr>
-    </w:p>
-    <w:p>
-      <w:pPr>
-        <w:widowControl/>
+      <w:r>
+        <w:rPr>
+          <w:rFonts w:ascii="Arial" w:hAnsi="Arial" w:eastAsia="Arial" w:cs="Arial"/>
+          <w:noProof w:val="0"/>
+          <w:sz w:val="24"/>
+          <w:szCs w:val="24"/>
+          <w:lang w:val="pt-BR"/>
+        </w:rPr>
+        <w:t xml:space="preserve"> Atlas será responsável pelo gerenciamento do banco de dados em nuvem. Essa abordagem proporciona maior disponibilidade, escalabilidade, segurança e facilidade de acesso às informações, permitindo que os dados sejam compartilhados entre o aplicativo mobile, os portais web e os mecanismos de análise e geração de relatórios do sistema.</w:t>
+      </w:r>
+    </w:p>
+    <w:p>
+      <w:pPr>
+        <w:pStyle w:val="Normal"/>
+        <w:widowControl w:val="1"/>
         <w:spacing w:line="240" w:lineRule="auto"/>
-      </w:pPr>
-      <w:r>
-        <w:rPr>
-          <w:rFonts w:eastAsia="Arial" w:cs="Arial"/>
-          <w:szCs w:val="24"/>
-        </w:rPr>
-        <w:t xml:space="preserve">O </w:t>
-      </w:r>
-      <w:proofErr w:type="spellStart"/>
-      <w:r>
-        <w:rPr>
-          <w:rFonts w:eastAsia="Arial" w:cs="Arial"/>
-          <w:szCs w:val="24"/>
-        </w:rPr>
-        <w:t>MongoDB</w:t>
-      </w:r>
-      <w:proofErr w:type="spellEnd"/>
-      <w:r>
-        <w:rPr>
-          <w:rFonts w:eastAsia="Arial" w:cs="Arial"/>
-          <w:szCs w:val="24"/>
-        </w:rPr>
-        <w:t xml:space="preserve"> oferece alta flexibilidade na modelagem dos dados, permitindo o armazenamento em formato de documentos (JSON/BSON), o que facilita a adaptação a diferentes estruturas e requisitos da aplicação. Além disso, apresenta bom desempenho, alta escalabilidade horizontal e suporte a grandes volumes de dados.</w:t>
-      </w:r>
-    </w:p>
-    <w:p>
-      <w:pPr>
-        <w:rPr>
-          <w:rFonts w:eastAsia="Arial" w:cs="Arial"/>
-          <w:szCs w:val="24"/>
-        </w:rPr>
-      </w:pPr>
+        <w:ind/>
+      </w:pPr>
+      <w:r>
+        <w:rPr>
+          <w:rFonts w:ascii="Arial" w:hAnsi="Arial" w:eastAsia="Arial" w:cs="Arial"/>
+          <w:b w:val="1"/>
+          <w:bCs w:val="1"/>
+          <w:noProof w:val="0"/>
+          <w:sz w:val="24"/>
+          <w:szCs w:val="24"/>
+          <w:lang w:val="pt-BR"/>
+        </w:rPr>
+        <w:t>Qualidade e Testes de Software</w:t>
+      </w:r>
+    </w:p>
+    <w:p>
+      <w:pPr>
+        <w:widowControl w:val="1"/>
+        <w:spacing w:before="240" w:beforeAutospacing="off" w:after="240" w:afterAutospacing="off" w:line="240" w:lineRule="auto"/>
+        <w:ind/>
+      </w:pPr>
+      <w:r>
+        <w:rPr>
+          <w:rFonts w:ascii="Arial" w:hAnsi="Arial" w:eastAsia="Arial" w:cs="Arial"/>
+          <w:noProof w:val="0"/>
+          <w:sz w:val="24"/>
+          <w:szCs w:val="24"/>
+          <w:lang w:val="pt-BR"/>
+        </w:rPr>
+        <w:t>Aplicar conceitos, normas e modelos de qualidade do processo e do produto de software, assegurando a conformidade e a confiabilidade da solução desenvolvida. Aplicar conceitos de verificação e validação de software, bem como princípios, métodos, técnicas e ferramentas de apoio às atividades de teste, contribuindo para a identificação de falhas e para a melhoria contínua da qualidade da plataforma.</w:t>
+      </w:r>
       <w:bookmarkStart w:name="_Toc165310852" w:id="10"/>
+    </w:p>
+    <w:p>
+      <w:pPr>
+        <w:pStyle w:val="Normal"/>
+        <w:widowControl w:val="1"/>
+        <w:spacing w:line="240" w:lineRule="auto"/>
+        <w:ind/>
+        <w:rPr>
+          <w:b w:val="1"/>
+          <w:bCs w:val="1"/>
+        </w:rPr>
+      </w:pPr>
+      <w:r>
+        <w:rPr>
+          <w:b w:val="1"/>
+          <w:bCs w:val="1"/>
+        </w:rPr>
+        <w:t>Ferramentas de Controle de Versão</w:t>
+      </w:r>
+      <w:bookmarkEnd w:id="10"/>
     </w:p>
     <w:p>
       <w:pPr>
@@ -10841,73 +11201,146 @@
           <w:bCs/>
         </w:rPr>
       </w:pPr>
-      <w:r>
-        <w:rPr>
-          <w:b/>
-          <w:bCs/>
-        </w:rPr>
-        <w:t>Ferramentas de Controle de Versão:</w:t>
-      </w:r>
-      <w:bookmarkEnd w:id="10"/>
-    </w:p>
-    <w:p>
-      <w:pPr>
-        <w:widowControl/>
+    </w:p>
+    <w:p>
+      <w:pPr>
+        <w:ind w:firstLine="708"/>
+        <w:rPr>
+          <w:rFonts w:eastAsia="Arial" w:cs="Arial"/>
+          <w:szCs w:val="24"/>
+        </w:rPr>
+      </w:pPr>
+      <w:r>
+        <w:rPr>
+          <w:rFonts w:eastAsia="Arial" w:cs="Arial"/>
+          <w:szCs w:val="24"/>
+        </w:rPr>
+        <w:t xml:space="preserve">Foram utilizadas as ferramentas </w:t>
+      </w:r>
+      <w:proofErr w:type="spellStart"/>
+      <w:r>
+        <w:rPr>
+          <w:rFonts w:eastAsia="Arial" w:cs="Arial"/>
+          <w:szCs w:val="24"/>
+        </w:rPr>
+        <w:t>Git</w:t>
+      </w:r>
+      <w:proofErr w:type="spellEnd"/>
+      <w:r>
+        <w:rPr>
+          <w:rFonts w:eastAsia="Arial" w:cs="Arial"/>
+          <w:szCs w:val="24"/>
+        </w:rPr>
+        <w:t xml:space="preserve"> e GitHub para o versionamento do código-fonte do </w:t>
+      </w:r>
+      <w:proofErr w:type="spellStart"/>
+      <w:r>
+        <w:rPr>
+          <w:rFonts w:eastAsia="Arial" w:cs="Arial"/>
+          <w:szCs w:val="24"/>
+        </w:rPr>
+        <w:t>DayPlannio</w:t>
+      </w:r>
+      <w:proofErr w:type="spellEnd"/>
+      <w:r>
+        <w:rPr>
+          <w:rFonts w:eastAsia="Arial" w:cs="Arial"/>
+          <w:szCs w:val="24"/>
+        </w:rPr>
+        <w:t>, permitindo o controle de alterações, a rastreabilidade das modificações e a colaboração eficiente entre os membros da equipe durante o desenvolvimento.</w:t>
+      </w:r>
+    </w:p>
+    <w:p>
+      <w:pPr>
+        <w:ind w:firstLine="0"/>
+        <w:rPr>
+          <w:rFonts w:cs="Arial"/>
+        </w:rPr>
+      </w:pPr>
+    </w:p>
+    <w:p>
+      <w:pPr>
+        <w:rPr>
+          <w:b w:val="1"/>
+          <w:bCs w:val="1"/>
+        </w:rPr>
+      </w:pPr>
+      <w:bookmarkStart w:name="_Toc165310853" w:id="11"/>
+      <w:r>
+        <w:rPr>
+          <w:b w:val="1"/>
+          <w:bCs w:val="1"/>
+        </w:rPr>
+        <w:t>Modelo de Processo de Desenvolvimento</w:t>
+      </w:r>
+      <w:bookmarkEnd w:id="11"/>
+    </w:p>
+    <w:p>
+      <w:r>
+        <w:rPr/>
+        <w:t xml:space="preserve">O modelo </w:t>
+      </w:r>
+      <w:r>
+        <w:rPr/>
+        <w:t>Kanban</w:t>
+      </w:r>
+      <w:r>
+        <w:rPr/>
+        <w:t xml:space="preserve"> foi adotado por sua simplicidade e eficiência na organização das tarefas. Ele permite visualizar o fluxo de trabalho em colunas como “A Fazer”, “Em Andamento” e “Concluído”, facilitando o acompanhamento do progresso e a identificação de melhorias no processo.</w:t>
+      </w:r>
+      <w:proofErr w:type="spellStart"/>
+      <w:proofErr w:type="spellEnd"/>
+    </w:p>
+    <w:p/>
+    <w:p>
+      <w:pPr>
+        <w:pStyle w:val="Normal"/>
+      </w:pPr>
+      <w:bookmarkStart w:name="_Toc165310854" w:id="12"/>
+      <w:r>
+        <w:rPr>
+          <w:b w:val="1"/>
+          <w:bCs w:val="1"/>
+        </w:rPr>
+        <w:t>Prototipagem</w:t>
+      </w:r>
+      <w:bookmarkEnd w:id="12"/>
+    </w:p>
+    <w:p>
+      <w:pPr>
+        <w:pStyle w:val="Normal"/>
+        <w:widowControl w:val="1"/>
         <w:spacing w:line="240" w:lineRule="auto"/>
         <w:ind w:firstLine="708"/>
         <w:jc w:val="left"/>
-        <w:rPr>
-          <w:b/>
-          <w:bCs/>
-        </w:rPr>
-      </w:pPr>
-    </w:p>
-    <w:p>
-      <w:pPr>
-        <w:ind w:firstLine="708"/>
-        <w:rPr>
-          <w:rFonts w:eastAsia="Arial" w:cs="Arial"/>
-          <w:szCs w:val="24"/>
-        </w:rPr>
-      </w:pPr>
-      <w:r>
-        <w:rPr>
-          <w:rFonts w:eastAsia="Arial" w:cs="Arial"/>
-          <w:szCs w:val="24"/>
-        </w:rPr>
-        <w:t xml:space="preserve">Foram utilizadas as ferramentas </w:t>
-      </w:r>
-      <w:proofErr w:type="spellStart"/>
-      <w:r>
-        <w:rPr>
-          <w:rFonts w:eastAsia="Arial" w:cs="Arial"/>
-          <w:szCs w:val="24"/>
-        </w:rPr>
-        <w:t>Git</w:t>
-      </w:r>
-      <w:proofErr w:type="spellEnd"/>
-      <w:r>
-        <w:rPr>
-          <w:rFonts w:eastAsia="Arial" w:cs="Arial"/>
-          <w:szCs w:val="24"/>
-        </w:rPr>
-        <w:t xml:space="preserve"> e GitHub para o versionamento do código-fonte do </w:t>
-      </w:r>
-      <w:proofErr w:type="spellStart"/>
-      <w:r>
-        <w:rPr>
-          <w:rFonts w:eastAsia="Arial" w:cs="Arial"/>
-          <w:szCs w:val="24"/>
-        </w:rPr>
-        <w:t>DayPlannio</w:t>
-      </w:r>
-      <w:proofErr w:type="spellEnd"/>
-      <w:r>
-        <w:rPr>
-          <w:rFonts w:eastAsia="Arial" w:cs="Arial"/>
-          <w:szCs w:val="24"/>
-        </w:rPr>
-        <w:t>, permitindo o controle de alterações, a rastreabilidade das modificações e a colaboração eficiente entre os membros da equipe durante o desenvolvimento.</w:t>
+      </w:pPr>
+      <w:r>
+        <w:rPr/>
+        <w:t xml:space="preserve">A abordagem de prototipação também </w:t>
+      </w:r>
+      <w:r>
+        <w:rPr/>
+        <w:t>será adotada</w:t>
+      </w:r>
+      <w:r>
+        <w:rPr/>
+        <w:t xml:space="preserve"> para validar conceitos e interações do usuário antes do desenvolvimento completo, utilizando</w:t>
+      </w:r>
+      <w:r>
+        <w:rPr/>
+        <w:t xml:space="preserve"> a</w:t>
+      </w:r>
+      <w:r>
+        <w:rPr/>
+        <w:t xml:space="preserve"> ferramenta </w:t>
+      </w:r>
+      <w:r>
+        <w:rPr/>
+        <w:t>Figma</w:t>
+      </w:r>
+      <w:r>
+        <w:rPr/>
+        <w:t>.</w:t>
       </w:r>
     </w:p>
     <w:p>
@@ -10920,42 +11353,71 @@
     </w:p>
     <w:p>
       <w:pPr>
-        <w:rPr>
-          <w:b/>
-          <w:bCs/>
-        </w:rPr>
-      </w:pPr>
-      <w:bookmarkStart w:name="_Toc165310853" w:id="11"/>
-      <w:r>
-        <w:rPr>
-          <w:b/>
-          <w:bCs/>
-        </w:rPr>
-        <w:t>Modelo de Processo de Desenvolvimento</w:t>
-      </w:r>
-      <w:bookmarkEnd w:id="11"/>
-      <w:r>
-        <w:rPr>
-          <w:b/>
-          <w:bCs/>
-        </w:rPr>
-        <w:t>:</w:t>
-      </w:r>
-    </w:p>
-    <w:p>
-      <w:r>
-        <w:t xml:space="preserve">O modelo </w:t>
-      </w:r>
-      <w:proofErr w:type="spellStart"/>
-      <w:r>
-        <w:t>Kanban</w:t>
-      </w:r>
-      <w:proofErr w:type="spellEnd"/>
-      <w:r>
-        <w:t xml:space="preserve"> foi adotado por sua simplicidade e eficiência na organização das tarefas. Ele permite visualizar o fluxo de trabalho em colunas como “A Fazer”, “Em Andamento” e “Concluído”, facilitando o acompanhamento do progresso e a identificação de melhorias no processo.</w:t>
-      </w:r>
-    </w:p>
-    <w:p/>
+        <w:pStyle w:val="Normal"/>
+        <w:bidi w:val="0"/>
+        <w:rPr>
+          <w:b w:val="1"/>
+          <w:bCs w:val="1"/>
+        </w:rPr>
+      </w:pPr>
+      <w:r>
+        <w:rPr>
+          <w:b w:val="1"/>
+          <w:bCs w:val="1"/>
+        </w:rPr>
+        <w:t>Cronograma do Projeto</w:t>
+      </w:r>
+    </w:p>
+    <w:p>
+      <w:r>
+        <w:rPr/>
+        <w:t xml:space="preserve">Para a criação e gestão do cronograma optamos por utilizar a plataforma visual </w:t>
+      </w:r>
+      <w:r>
+        <w:rPr/>
+        <w:t>Trello</w:t>
+      </w:r>
+      <w:r>
+        <w:rPr/>
+        <w:t>. Esta plataforma oferece uma abordagem visual que permite à equipe gerenciar o projeto, acompanhar o fluxo de trabalho e monitorar as tarefas de forma eficaz</w:t>
+      </w:r>
+    </w:p>
+    <w:p>
+      <w:pPr>
+        <w:rPr>
+          <w:rStyle w:val="Hyperlink"/>
+        </w:rPr>
+      </w:pPr>
+      <w:r>
+        <w:t>Segue</w:t>
+      </w:r>
+      <w:r>
+        <w:t xml:space="preserve"> </w:t>
+      </w:r>
+      <w:r>
+        <w:t xml:space="preserve">o link do cronograma: </w:t>
+      </w:r>
+      <w:hyperlink r:id="rId13">
+        <w:r>
+          <w:rPr>
+            <w:rStyle w:val="Hyperlink"/>
+          </w:rPr>
+          <w:t>https://trello.com/invite/b/69a978e1ea6fcdc0da80330f/ATTId141e10f85548ec9e1e46c60d1084b05A0FC1CB9/dayplannio</w:t>
+        </w:r>
+      </w:hyperlink>
+    </w:p>
+    <w:p>
+      <w:pPr>
+        <w:pStyle w:val="Normal"/>
+        <w:widowControl w:val="1"/>
+        <w:spacing w:line="240" w:lineRule="auto"/>
+        <w:ind w:firstLine="0"/>
+        <w:jc w:val="left"/>
+        <w:rPr>
+          <w:rStyle w:val="Hyperlink"/>
+        </w:rPr>
+      </w:pPr>
+    </w:p>
     <w:p>
       <w:pPr>
         <w:widowControl/>
@@ -10964,485 +11426,6 @@
         <w:jc w:val="left"/>
         <w:rPr>
           <w:b/>
-          <w:bCs/>
-        </w:rPr>
-      </w:pPr>
-      <w:bookmarkStart w:name="_Toc165310854" w:id="12"/>
-      <w:r>
-        <w:rPr>
-          <w:b/>
-          <w:bCs/>
-        </w:rPr>
-        <w:br w:type="page"/>
-      </w:r>
-    </w:p>
-    <w:p>
-      <w:pPr>
-        <w:rPr>
-          <w:b/>
-          <w:bCs/>
-        </w:rPr>
-      </w:pPr>
-      <w:r>
-        <w:rPr>
-          <w:b/>
-          <w:bCs/>
-        </w:rPr>
-        <w:lastRenderedPageBreak/>
-        <w:t>Prototipagem:</w:t>
-      </w:r>
-      <w:bookmarkEnd w:id="12"/>
-      <w:r>
-        <w:rPr>
-          <w:b/>
-          <w:bCs/>
-        </w:rPr>
-        <w:t xml:space="preserve"> </w:t>
-      </w:r>
-    </w:p>
-    <w:p>
-      <w:r>
-        <w:t xml:space="preserve">A abordagem de prototipação também </w:t>
-      </w:r>
-      <w:r>
-        <w:t>será adotada</w:t>
-      </w:r>
-      <w:r>
-        <w:t xml:space="preserve"> para validar conceitos e interações do usuário antes do desenvolvimento completo, utilizando</w:t>
-      </w:r>
-      <w:r>
-        <w:t xml:space="preserve"> a</w:t>
-      </w:r>
-      <w:r>
-        <w:t xml:space="preserve"> ferramenta </w:t>
-      </w:r>
-      <w:proofErr w:type="spellStart"/>
-      <w:r>
-        <w:t>Figma</w:t>
-      </w:r>
-      <w:proofErr w:type="spellEnd"/>
-      <w:r>
-        <w:t>.</w:t>
-      </w:r>
-    </w:p>
-    <w:p>
-      <w:pPr>
-        <w:ind w:firstLine="0"/>
-        <w:rPr>
-          <w:rFonts w:cs="Arial"/>
-        </w:rPr>
-      </w:pPr>
-    </w:p>
-    <w:p>
-      <w:pPr>
-        <w:pStyle w:val="Ttulo2"/>
-      </w:pPr>
-      <w:bookmarkStart w:name="_Toc230779095" w:id="13"/>
-      <w:r>
-        <w:t>Cronograma do projeto</w:t>
-      </w:r>
-      <w:bookmarkEnd w:id="13"/>
-    </w:p>
-    <w:p>
-      <w:r>
-        <w:t xml:space="preserve">Para a criação e gestão do cronograma optamos por utilizar a plataforma visual </w:t>
-      </w:r>
-      <w:proofErr w:type="spellStart"/>
-      <w:r>
-        <w:t>Trello</w:t>
-      </w:r>
-      <w:proofErr w:type="spellEnd"/>
-      <w:r>
-        <w:t>. Esta plataforma oferece uma abordagem visual que permite à equipe gerenciar o projeto, acompanhar o fluxo de trabalho e monitorar as tarefas de forma eficaz.</w:t>
-      </w:r>
-    </w:p>
-    <w:p/>
-    <w:p>
-      <w:pPr>
-        <w:rPr>
-          <w:rStyle w:val="Hyperlink"/>
-        </w:rPr>
-      </w:pPr>
-      <w:r>
-        <w:t>Segue</w:t>
-      </w:r>
-      <w:r>
-        <w:t xml:space="preserve"> </w:t>
-      </w:r>
-      <w:r>
-        <w:t xml:space="preserve">o link do cronograma: </w:t>
-      </w:r>
-      <w:hyperlink r:id="rId13">
-        <w:r>
-          <w:rPr>
-            <w:rStyle w:val="Hyperlink"/>
-          </w:rPr>
-          <w:t>https://trello.com/invite/b/69a978e1ea6fcdc0da80330f/ATTId141e10f85548ec9e1e46c60d1084b05A0FC1CB9/dayplannio</w:t>
-        </w:r>
-      </w:hyperlink>
-    </w:p>
-    <w:p>
-      <w:pPr>
-        <w:widowControl/>
-        <w:spacing w:line="240" w:lineRule="auto"/>
-        <w:ind w:firstLine="0"/>
-        <w:jc w:val="left"/>
-        <w:rPr>
-          <w:rStyle w:val="Hyperlink"/>
-          <w:u w:val="none"/>
-        </w:rPr>
-      </w:pPr>
-      <w:r>
-        <w:rPr>
-          <w:rStyle w:val="Hyperlink"/>
-        </w:rPr>
-        <w:br w:type="page"/>
-      </w:r>
-    </w:p>
-    <w:p>
-      <w:pPr>
-        <w:pStyle w:val="Ttulo1"/>
-        <w:rPr>
-          <w:lang w:val="pt-BR"/>
-        </w:rPr>
-      </w:pPr>
-      <w:bookmarkStart w:name="_Toc331506313" w:id="14"/>
-      <w:bookmarkStart w:name="_Toc331507621" w:id="15"/>
-      <w:bookmarkStart w:name="_Toc165310856" w:id="16"/>
-      <w:bookmarkStart w:name="_Toc182927332" w:id="17"/>
-      <w:bookmarkStart w:name="_Toc1365652471" w:id="18"/>
-      <w:bookmarkStart w:name="_Toc230779096" w:id="19"/>
-      <w:r>
-        <w:rPr>
-          <w:lang w:val="pt-BR"/>
-        </w:rPr>
-        <w:lastRenderedPageBreak/>
-        <w:t>Objetivos</w:t>
-      </w:r>
-      <w:bookmarkEnd w:id="14"/>
-      <w:bookmarkEnd w:id="15"/>
-      <w:bookmarkEnd w:id="16"/>
-      <w:bookmarkEnd w:id="17"/>
-      <w:bookmarkEnd w:id="18"/>
-      <w:bookmarkEnd w:id="19"/>
-    </w:p>
-    <w:p>
-      <w:pPr>
-        <w:pStyle w:val="Ttulo2"/>
-      </w:pPr>
-      <w:bookmarkStart w:name="_Toc165310857" w:id="20"/>
-      <w:bookmarkStart w:name="_Toc182927333" w:id="21"/>
-      <w:bookmarkStart w:name="_Toc1600256300" w:id="22"/>
-      <w:bookmarkStart w:name="_Toc230779097" w:id="23"/>
-      <w:r>
-        <w:t>Geral</w:t>
-      </w:r>
-      <w:bookmarkEnd w:id="20"/>
-      <w:bookmarkEnd w:id="21"/>
-      <w:bookmarkEnd w:id="22"/>
-      <w:bookmarkEnd w:id="23"/>
-    </w:p>
-    <w:p>
-      <w:pPr>
-        <w:spacing w:before="240" w:after="240"/>
-      </w:pPr>
-      <w:r>
-        <w:rPr>
-          <w:rFonts w:eastAsia="Arial" w:cs="Arial"/>
-          <w:b/>
-          <w:bCs/>
-          <w:szCs w:val="24"/>
-        </w:rPr>
-        <w:t>Objetivo Geral</w:t>
-      </w:r>
-    </w:p>
-    <w:p>
-      <w:pPr>
-        <w:rPr>
-          <w:rFonts w:eastAsia="Arial" w:cs="Arial"/>
-          <w:szCs w:val="24"/>
-        </w:rPr>
-      </w:pPr>
-      <w:r>
-        <w:rPr>
-          <w:rFonts w:eastAsia="Arial" w:cs="Arial"/>
-          <w:szCs w:val="24"/>
-        </w:rPr>
-        <w:t xml:space="preserve">O objetivo do projeto é desenvolver a aplicação </w:t>
-      </w:r>
-      <w:proofErr w:type="spellStart"/>
-      <w:r>
-        <w:rPr>
-          <w:rFonts w:eastAsia="Arial" w:cs="Arial"/>
-          <w:szCs w:val="24"/>
-        </w:rPr>
-        <w:t>DayPlannio</w:t>
-      </w:r>
-      <w:proofErr w:type="spellEnd"/>
-      <w:r>
-        <w:rPr>
-          <w:rFonts w:eastAsia="Arial" w:cs="Arial"/>
-          <w:szCs w:val="24"/>
-        </w:rPr>
-        <w:t>, voltada para a organização da rotina de profissionais autônomos. O aplicativo integrará agenda de serviços, cadastro de clientes, controle financeiro e gestão de a</w:t>
-      </w:r>
-      <w:r>
-        <w:rPr>
-          <w:rFonts w:eastAsia="Arial" w:cs="Arial"/>
-          <w:szCs w:val="24"/>
-        </w:rPr>
-        <w:t>tividades em um único ambiente.</w:t>
-      </w:r>
-    </w:p>
-    <w:p>
-      <w:pPr>
-        <w:rPr>
-          <w:rFonts w:cs="Arial"/>
-        </w:rPr>
-      </w:pPr>
-      <w:r>
-        <w:rPr>
-          <w:rFonts w:eastAsia="Arial" w:cs="Arial"/>
-          <w:szCs w:val="24"/>
-        </w:rPr>
-        <w:t>A proposta é oferecer uma plataforma simples e intuitiva que permita ao usuário organizar suas tarefas, otimizar seu tempo e acompanhar suas atividades de forma clara e centralizada.</w:t>
-      </w:r>
-    </w:p>
-    <w:p>
-      <w:pPr>
-        <w:rPr>
-          <w:rFonts w:cs="Arial"/>
-          <w:szCs w:val="24"/>
-        </w:rPr>
-      </w:pPr>
-    </w:p>
-    <w:p>
-      <w:pPr>
-        <w:pStyle w:val="Ttulo2"/>
-      </w:pPr>
-      <w:bookmarkStart w:name="_Toc182927334" w:id="24"/>
-      <w:bookmarkStart w:name="_Toc997807490" w:id="25"/>
-      <w:bookmarkStart w:name="_Toc230779098" w:id="26"/>
-      <w:r>
-        <w:t>Especí</w:t>
-      </w:r>
-      <w:r>
-        <w:t>ficos</w:t>
-      </w:r>
-      <w:bookmarkEnd w:id="24"/>
-      <w:bookmarkEnd w:id="25"/>
-      <w:bookmarkEnd w:id="26"/>
-    </w:p>
-    <w:p>
-      <w:pPr>
-        <w:rPr>
-          <w:rFonts w:cs="Arial"/>
-          <w:b/>
-          <w:bCs/>
-        </w:rPr>
-      </w:pPr>
-      <w:r>
-        <w:rPr>
-          <w:rFonts w:cs="Arial"/>
-          <w:b/>
-          <w:bCs/>
-        </w:rPr>
-        <w:t xml:space="preserve">Pesquisar Outras Aplicações de </w:t>
-      </w:r>
-      <w:r>
-        <w:rPr>
-          <w:rFonts w:cs="Arial"/>
-          <w:b/>
-          <w:bCs/>
-        </w:rPr>
-        <w:t>Gestão e Produtividade</w:t>
-      </w:r>
-    </w:p>
-    <w:p>
-      <w:pPr>
-        <w:rPr>
-          <w:rFonts w:eastAsia="Arial" w:cs="Arial"/>
-          <w:szCs w:val="24"/>
-        </w:rPr>
-      </w:pPr>
-      <w:r>
-        <w:rPr>
-          <w:rFonts w:eastAsia="Arial" w:cs="Arial"/>
-          <w:szCs w:val="24"/>
-        </w:rPr>
-        <w:t>Analisar sistemas existentes de organização, agenda e gestão de atividades para identificar boas práticas e f</w:t>
-      </w:r>
-      <w:r>
-        <w:rPr>
-          <w:rFonts w:eastAsia="Arial" w:cs="Arial"/>
-          <w:szCs w:val="24"/>
-        </w:rPr>
-        <w:t xml:space="preserve">uncionalidades relevantes, como </w:t>
-      </w:r>
-      <w:r>
-        <w:rPr>
-          <w:rFonts w:eastAsia="Arial" w:cs="Arial"/>
-          <w:szCs w:val="24"/>
-        </w:rPr>
-        <w:t xml:space="preserve">visualização de dados, integração com calendários e controle financeiro, garantindo que o </w:t>
-      </w:r>
-      <w:proofErr w:type="spellStart"/>
-      <w:r>
-        <w:rPr>
-          <w:rFonts w:eastAsia="Arial" w:cs="Arial"/>
-          <w:szCs w:val="24"/>
-        </w:rPr>
-        <w:t>DayPlannio</w:t>
-      </w:r>
-      <w:proofErr w:type="spellEnd"/>
-      <w:r>
-        <w:rPr>
-          <w:rFonts w:eastAsia="Arial" w:cs="Arial"/>
-          <w:szCs w:val="24"/>
-        </w:rPr>
-        <w:t xml:space="preserve"> ofereça uma experiência moderna, eficiente e alinhada às necessidades dos usuários.</w:t>
-      </w:r>
-    </w:p>
-    <w:p>
-      <w:pPr>
-        <w:rPr>
-          <w:rFonts w:cs="Arial"/>
-          <w:szCs w:val="24"/>
-        </w:rPr>
-      </w:pPr>
-    </w:p>
-    <w:p>
-      <w:pPr>
-        <w:rPr>
-          <w:rFonts w:cs="Arial"/>
-          <w:b/>
-          <w:bCs/>
-          <w:szCs w:val="24"/>
-        </w:rPr>
-      </w:pPr>
-      <w:r>
-        <w:rPr>
-          <w:rFonts w:cs="Arial"/>
-          <w:b/>
-          <w:bCs/>
-          <w:szCs w:val="24"/>
-        </w:rPr>
-        <w:t>I</w:t>
-      </w:r>
-      <w:r>
-        <w:rPr>
-          <w:rFonts w:cs="Arial"/>
-          <w:b/>
-          <w:bCs/>
-          <w:szCs w:val="24"/>
-        </w:rPr>
-        <w:t>dentificar</w:t>
-      </w:r>
-      <w:r>
-        <w:rPr>
-          <w:rFonts w:cs="Arial"/>
-          <w:b/>
-          <w:bCs/>
-          <w:szCs w:val="24"/>
-        </w:rPr>
-        <w:t xml:space="preserve"> </w:t>
-      </w:r>
-      <w:r>
-        <w:rPr>
-          <w:rFonts w:cs="Arial"/>
-          <w:b/>
-          <w:bCs/>
-          <w:szCs w:val="24"/>
-        </w:rPr>
-        <w:t>ferramentas</w:t>
-      </w:r>
-    </w:p>
-    <w:p>
-      <w:r>
-        <w:t>Definir os requisitos técnicos e funcionais da aplicação</w:t>
-      </w:r>
-      <w:r>
-        <w:t xml:space="preserve">, </w:t>
-      </w:r>
-      <w:r>
-        <w:t>c</w:t>
-      </w:r>
-      <w:r>
-        <w:t>onsideran</w:t>
-      </w:r>
-      <w:r>
-        <w:t xml:space="preserve">do </w:t>
-      </w:r>
-      <w:r>
-        <w:t>aspectos</w:t>
-      </w:r>
-      <w:r>
-        <w:t xml:space="preserve"> como desenvolvimento front-</w:t>
-      </w:r>
-      <w:proofErr w:type="spellStart"/>
-      <w:r>
-        <w:t>end</w:t>
-      </w:r>
-      <w:proofErr w:type="spellEnd"/>
-      <w:r>
-        <w:t xml:space="preserve">, </w:t>
-      </w:r>
-      <w:proofErr w:type="spellStart"/>
-      <w:r>
-        <w:t>back-end</w:t>
-      </w:r>
-      <w:proofErr w:type="spellEnd"/>
-      <w:r>
-        <w:t>, banco de dados, segurança, escalabilidade e manutenção.</w:t>
-      </w:r>
-      <w:r>
-        <w:t xml:space="preserve"> </w:t>
-      </w:r>
-      <w:r>
-        <w:t>Para</w:t>
-      </w:r>
-      <w:r>
-        <w:t xml:space="preserve"> </w:t>
-      </w:r>
-      <w:r>
-        <w:t>a</w:t>
-      </w:r>
-      <w:r>
-        <w:t>ssegurar que o desenvolvimento da aplicação seja eficiente, seguro e escalável.</w:t>
-      </w:r>
-    </w:p>
-    <w:p>
-      <w:pPr>
-        <w:rPr>
-          <w:rFonts w:cs="Arial"/>
-          <w:szCs w:val="24"/>
-        </w:rPr>
-      </w:pPr>
-    </w:p>
-    <w:p>
-      <w:pPr>
-        <w:rPr>
-          <w:rFonts w:cs="Arial"/>
-          <w:szCs w:val="24"/>
-        </w:rPr>
-      </w:pPr>
-    </w:p>
-    <w:p>
-      <w:pPr>
-        <w:rPr>
-          <w:rFonts w:cs="Arial"/>
-          <w:szCs w:val="24"/>
-        </w:rPr>
-      </w:pPr>
-    </w:p>
-    <w:p>
-      <w:pPr>
-        <w:widowControl/>
-        <w:spacing w:line="240" w:lineRule="auto"/>
-        <w:ind w:firstLine="0"/>
-        <w:jc w:val="left"/>
-        <w:rPr>
-          <w:b/>
           <w:caps/>
         </w:rPr>
       </w:pPr>
@@ -11455,19 +11438,19 @@
     <w:p>
       <w:pPr>
         <w:pStyle w:val="Ttulo1"/>
+        <w:suppressLineNumbers w:val="0"/>
+        <w:bidi w:val="0"/>
+        <w:spacing w:before="0" w:beforeAutospacing="off" w:after="0" w:afterAutospacing="off" w:line="360" w:lineRule="auto"/>
+        <w:ind w:left="432" w:right="0" w:hanging="432"/>
+        <w:jc w:val="both"/>
+        <w:rPr/>
+      </w:pPr>
+      <w:r>
         <w:rPr>
           <w:lang w:val="pt-BR"/>
         </w:rPr>
-      </w:pPr>
-      <w:bookmarkStart w:name="_Toc230779099" w:id="29"/>
-      <w:r>
-        <w:rPr>
-          <w:lang w:val="pt-BR"/>
-        </w:rPr>
-        <w:lastRenderedPageBreak/>
-        <w:t>Documento de Requisitos</w:t>
-      </w:r>
-      <w:bookmarkEnd w:id="29"/>
+        <w:t>requisitos</w:t>
+      </w:r>
     </w:p>
     <w:p>
       <w:r>
@@ -13231,47 +13214,18 @@
     <w:p>
       <w:pPr>
         <w:pStyle w:val="Ttulo1"/>
-      </w:pPr>
-      <w:bookmarkStart w:name="_Toc182927339" w:id="60"/>
-      <w:bookmarkStart w:name="_Toc326436659" w:id="61"/>
-      <w:bookmarkStart w:name="_Toc230779127" w:id="62"/>
-      <w:r>
-        <w:lastRenderedPageBreak/>
-        <w:t>Diagrama de</w:t>
-      </w:r>
-      <w:r>
-        <w:t xml:space="preserve"> </w:t>
-      </w:r>
-      <w:r>
-        <w:t>Caso de Uso</w:t>
+        <w:suppressLineNumbers w:val="0"/>
+        <w:bidi w:val="0"/>
+        <w:spacing w:before="0" w:beforeAutospacing="off" w:after="0" w:afterAutospacing="off" w:line="360" w:lineRule="auto"/>
+        <w:ind w:left="432" w:right="0" w:hanging="432"/>
+        <w:jc w:val="both"/>
+        <w:rPr/>
+      </w:pPr>
+      <w:r>
+        <w:rPr/>
+        <w:t>Modelo de casos de uso</w:t>
       </w:r>
       <w:bookmarkStart w:name="_Toc165310878" w:id="63"/>
-      <w:bookmarkEnd w:id="60"/>
-      <w:bookmarkEnd w:id="61"/>
-      <w:bookmarkEnd w:id="62"/>
-    </w:p>
-    <w:p>
-      <w:pPr>
-        <w:rPr>
-          <w:noProof/>
-        </w:rPr>
-      </w:pPr>
-    </w:p>
-    <w:p>
-      <w:pPr>
-        <w:tabs>
-          <w:tab w:val="left" w:pos="6998"/>
-        </w:tabs>
-        <w:rPr>
-          <w:noProof/>
-        </w:rPr>
-      </w:pPr>
-      <w:r>
-        <w:rPr>
-          <w:noProof/>
-        </w:rPr>
-        <w:tab/>
-      </w:r>
     </w:p>
     <w:p>
       <w:pPr>
@@ -13427,7 +13381,21 @@
       <w:pPr>
         <w:rPr>
           <w:sz w:val="28"/>
-          <w:szCs w:val="22"/>
+          <w:szCs w:val="28"/>
+        </w:rPr>
+      </w:pPr>
+    </w:p>
+    <w:p>
+      <w:r>
+        <w:br w:type="page"/>
+      </w:r>
+    </w:p>
+    <w:p>
+      <w:pPr>
+        <w:pStyle w:val="Normal"/>
+        <w:rPr>
+          <w:sz w:val="28"/>
+          <w:szCs w:val="28"/>
         </w:rPr>
       </w:pPr>
     </w:p>
@@ -13464,6 +13432,7 @@
         <w:tc>
           <w:tcPr>
             <w:tcW w:w="9062" w:type="dxa"/>
+            <w:tcMar/>
           </w:tcPr>
           <w:p>
             <w:pPr>
@@ -13486,6 +13455,7 @@
         <w:tc>
           <w:tcPr>
             <w:tcW w:w="9062" w:type="dxa"/>
+            <w:tcMar/>
           </w:tcPr>
           <w:p>
             <w:pPr>
@@ -13520,25 +13490,8 @@
     </w:tbl>
     <w:p>
       <w:pPr>
-        <w:ind w:firstLine="0"/>
-        <w:rPr>
-          <w:b/>
-          <w:bCs/>
-        </w:rPr>
-      </w:pPr>
-    </w:p>
-    <w:p>
-      <w:r>
-        <w:br w:type="page"/>
-      </w:r>
-    </w:p>
-    <w:p>
-      <w:pPr>
-        <w:ind w:firstLine="0"/>
-        <w:rPr>
-          <w:b/>
-          <w:bCs/>
-        </w:rPr>
+        <w:pStyle w:val="Normal"/>
+        <w:ind/>
       </w:pPr>
     </w:p>
     <w:tbl>
@@ -16782,45 +16735,23 @@
     </w:p>
     <w:p>
       <w:pPr>
-        <w:widowControl/>
+        <w:pStyle w:val="Normal"/>
+        <w:widowControl w:val="1"/>
         <w:spacing w:line="240" w:lineRule="auto"/>
         <w:ind w:firstLine="0"/>
         <w:jc w:val="left"/>
         <w:rPr>
           <w:rFonts w:eastAsia="Arial" w:cs="Arial"/>
-          <w:b/>
-          <w:bCs/>
+          <w:b w:val="1"/>
+          <w:bCs w:val="1"/>
         </w:rPr>
       </w:pPr>
       <w:r>
         <w:rPr>
           <w:rFonts w:eastAsia="Arial" w:cs="Arial"/>
-          <w:b/>
-          <w:bCs/>
-        </w:rPr>
-        <w:br w:type="page"/>
-      </w:r>
-    </w:p>
-    <w:p>
-      <w:pPr>
-        <w:widowControl/>
-        <w:spacing w:line="240" w:lineRule="auto"/>
-        <w:ind w:firstLine="0"/>
-        <w:jc w:val="left"/>
-        <w:rPr>
-          <w:rFonts w:eastAsia="Arial" w:cs="Arial"/>
-          <w:b/>
-          <w:bCs/>
-          <w:szCs w:val="24"/>
-        </w:rPr>
-      </w:pPr>
-      <w:r>
-        <w:rPr>
-          <w:rFonts w:eastAsia="Arial" w:cs="Arial"/>
-          <w:b/>
-          <w:bCs/>
-        </w:rPr>
-        <w:lastRenderedPageBreak/>
+          <w:b w:val="1"/>
+          <w:bCs w:val="1"/>
+        </w:rPr>
         <w:t>Fluxo Alternativo:</w:t>
       </w:r>
     </w:p>
@@ -17057,69 +16988,29 @@
     <w:p>
       <w:pPr>
         <w:pStyle w:val="Ttulo1"/>
-      </w:pPr>
-      <w:bookmarkStart w:name="_Toc489932645" w:id="88"/>
-      <w:bookmarkStart w:name="_Toc230779130" w:id="89"/>
-      <w:r>
-        <w:t>Diagrama</w:t>
-      </w:r>
-      <w:r>
-        <w:t xml:space="preserve"> </w:t>
-      </w:r>
-      <w:r>
-        <w:t>de</w:t>
-      </w:r>
-      <w:r>
-        <w:t xml:space="preserve"> Classe</w:t>
-      </w:r>
-      <w:bookmarkEnd w:id="88"/>
-      <w:bookmarkEnd w:id="89"/>
+        <w:suppressLineNumbers w:val="0"/>
+        <w:bidi w:val="0"/>
+        <w:spacing w:before="0" w:beforeAutospacing="off" w:after="0" w:afterAutospacing="off" w:line="360" w:lineRule="auto"/>
+        <w:ind w:left="432" w:right="0" w:hanging="432"/>
+        <w:jc w:val="both"/>
+        <w:rPr/>
+      </w:pPr>
+      <w:r>
+        <w:rPr/>
+        <w:t>Modelo do banco de dados</w:t>
+      </w:r>
+    </w:p>
+    <w:p>
+      <w:pPr>
+        <w:pStyle w:val="Normal"/>
+        <w:bidi w:val="0"/>
+      </w:pPr>
+      <w:r>
+        <w:rPr/>
+        <w:t>(conceitual, fisico e logico)</w:t>
+      </w:r>
     </w:p>
     <w:p/>
-    <w:p>
-      <w:pPr>
-        <w:ind w:firstLine="708"/>
-      </w:pPr>
-      <w:r>
-        <w:rPr>
-          <w:rFonts w:eastAsia="Arial" w:cs="Arial"/>
-          <w:szCs w:val="24"/>
-        </w:rPr>
-        <w:t xml:space="preserve">O </w:t>
-      </w:r>
-      <w:proofErr w:type="spellStart"/>
-      <w:r>
-        <w:rPr>
-          <w:rFonts w:eastAsia="Arial" w:cs="Arial"/>
-          <w:szCs w:val="24"/>
-        </w:rPr>
-        <w:t>MongoDB</w:t>
-      </w:r>
-      <w:proofErr w:type="spellEnd"/>
-      <w:r>
-        <w:rPr>
-          <w:rFonts w:eastAsia="Arial" w:cs="Arial"/>
-          <w:szCs w:val="24"/>
-        </w:rPr>
-        <w:t xml:space="preserve"> não utiliza um Diagrama de Classe, pois é um banco de dados não relacional orientado a documentos. Em vez de organizar os dados em tabelas com relações rígidas, o </w:t>
-      </w:r>
-      <w:proofErr w:type="spellStart"/>
-      <w:r>
-        <w:rPr>
-          <w:rFonts w:eastAsia="Arial" w:cs="Arial"/>
-          <w:szCs w:val="24"/>
-        </w:rPr>
-        <w:t>MongoDB</w:t>
-      </w:r>
-      <w:proofErr w:type="spellEnd"/>
-      <w:r>
-        <w:rPr>
-          <w:rFonts w:eastAsia="Arial" w:cs="Arial"/>
-          <w:szCs w:val="24"/>
-        </w:rPr>
-        <w:t xml:space="preserve"> armazena informações em coleções de documentos no formato JSON (ou BSON), permitindo maior flexibilidade na modelagem dos dados.</w:t>
-      </w:r>
-    </w:p>
     <w:p>
       <w:pPr>
         <w:widowControl/>
@@ -17139,120 +17030,101 @@
     <w:p>
       <w:pPr>
         <w:pStyle w:val="Ttulo1"/>
-      </w:pPr>
-      <w:bookmarkStart w:name="_Toc230779131" w:id="90"/>
-      <w:r>
-        <w:lastRenderedPageBreak/>
-        <w:t>Diagrama BPMN</w:t>
-      </w:r>
-      <w:bookmarkEnd w:id="90"/>
-    </w:p>
-    <w:p>
-      <w:pPr>
-        <w:pStyle w:val="Figura"/>
-      </w:pPr>
-      <w:bookmarkStart w:name="_Toc168898593" w:id="91"/>
-      <w:bookmarkStart w:name="_Toc169517816" w:id="92"/>
-      <w:bookmarkStart w:name="_Toc230779159" w:id="93"/>
-      <w:r>
-        <w:t xml:space="preserve">Figura </w:t>
-      </w:r>
-      <w:r>
-        <w:fldChar w:fldCharType="begin"/>
-      </w:r>
-      <w:r>
-        <w:instrText xml:space="preserve"> SEQ Figura \* ARABIC </w:instrText>
-      </w:r>
-      <w:r>
-        <w:fldChar w:fldCharType="separate"/>
-      </w:r>
-      <w:r>
-        <w:rPr>
-          <w:noProof/>
-        </w:rPr>
-        <w:t>2</w:t>
-      </w:r>
-      <w:r>
-        <w:rPr>
-          <w:noProof/>
-        </w:rPr>
-        <w:fldChar w:fldCharType="end"/>
-      </w:r>
-      <w:r>
-        <w:t xml:space="preserve"> – </w:t>
-      </w:r>
-      <w:bookmarkEnd w:id="91"/>
-      <w:bookmarkEnd w:id="92"/>
-      <w:r>
-        <w:t>Diagrama BPMN</w:t>
-      </w:r>
-      <w:bookmarkEnd w:id="93"/>
-    </w:p>
-    <w:p>
-      <w:pPr>
-        <w:pStyle w:val="Figura"/>
-      </w:pPr>
-      <w:r>
-        <w:rPr>
-          <w:noProof/>
-        </w:rPr>
-        <w:drawing>
-          <wp:inline distT="0" distB="0" distL="0" distR="0" wp14:anchorId="12B54143" wp14:editId="4464351F">
-            <wp:extent cx="2708563" cy="4533900"/>
-            <wp:effectExtent l="0" t="0" r="0" b="0"/>
-            <wp:docPr id="13" name="drawing"/>
-            <wp:cNvGraphicFramePr>
-              <a:graphicFrameLocks xmlns:a="http://schemas.openxmlformats.org/drawingml/2006/main" noChangeAspect="1"/>
-            </wp:cNvGraphicFramePr>
-            <a:graphic xmlns:a="http://schemas.openxmlformats.org/drawingml/2006/main">
-              <a:graphicData uri="http://schemas.openxmlformats.org/drawingml/2006/picture">
-                <pic:pic xmlns:pic="http://schemas.openxmlformats.org/drawingml/2006/picture">
-                  <pic:nvPicPr>
-                    <pic:cNvPr id="953221992" name="Picture 953221992"/>
-                    <pic:cNvPicPr/>
-                  </pic:nvPicPr>
-                  <pic:blipFill>
-                    <a:blip r:embed="rId15" cstate="print">
-                      <a:extLst>
-                        <a:ext uri="{28A0092B-C50C-407E-A947-70E740481C1C}">
-                          <a14:useLocalDpi xmlns:a14="http://schemas.microsoft.com/office/drawing/2010/main" val="0"/>
-                        </a:ext>
-                      </a:extLst>
-                    </a:blip>
-                    <a:stretch>
-                      <a:fillRect/>
-                    </a:stretch>
-                  </pic:blipFill>
-                  <pic:spPr>
-                    <a:xfrm>
-                      <a:off x="0" y="0"/>
-                      <a:ext cx="2708563" cy="4533900"/>
-                    </a:xfrm>
-                    <a:prstGeom prst="rect">
-                      <a:avLst/>
-                    </a:prstGeom>
-                  </pic:spPr>
-                </pic:pic>
-              </a:graphicData>
-            </a:graphic>
-          </wp:inline>
-        </w:drawing>
-      </w:r>
-    </w:p>
-    <w:p>
-      <w:pPr>
-        <w:pStyle w:val="Figura"/>
-      </w:pPr>
-      <w:r>
-        <w:t>Fonte: Elaborado pelos autores (2026).</w:t>
-      </w:r>
-    </w:p>
-    <w:p>
-      <w:pPr>
-        <w:rPr>
-          <w:lang w:val="en-US"/>
-        </w:rPr>
-      </w:pPr>
+        <w:suppressLineNumbers w:val="0"/>
+        <w:bidi w:val="0"/>
+        <w:spacing w:before="0" w:beforeAutospacing="off" w:after="0" w:afterAutospacing="off" w:line="360" w:lineRule="auto"/>
+        <w:ind w:left="432" w:right="0" w:hanging="432"/>
+        <w:jc w:val="both"/>
+        <w:rPr/>
+      </w:pPr>
+      <w:r>
+        <w:rPr/>
+        <w:t>Banco de dados</w:t>
+      </w:r>
+    </w:p>
+    <w:p>
+      <w:pPr>
+        <w:bidi w:val="0"/>
+        <w:spacing w:before="240" w:beforeAutospacing="off" w:after="240" w:afterAutospacing="off"/>
+      </w:pPr>
+      <w:r>
+        <w:rPr>
+          <w:rFonts w:ascii="Arial" w:hAnsi="Arial" w:eastAsia="Arial" w:cs="Arial"/>
+          <w:noProof w:val="0"/>
+          <w:sz w:val="24"/>
+          <w:szCs w:val="24"/>
+          <w:lang w:val="pt-BR"/>
+        </w:rPr>
+        <w:t>O banco de dados utilizado na plataforma DayPlannio é o MongoDB, um sistema de gerenciamento de banco de dados não relacional orientado a documentos. Essa tecnologia foi escolhida por sua flexibilidade na modelagem dos dados, permitindo armazenar e gerenciar informações de forma eficiente e adaptável às necessidades da aplicação.</w:t>
+      </w:r>
+    </w:p>
+    <w:p>
+      <w:pPr>
+        <w:bidi w:val="0"/>
+        <w:spacing w:before="240" w:beforeAutospacing="off" w:after="240" w:afterAutospacing="off"/>
+      </w:pPr>
+      <w:r>
+        <w:rPr>
+          <w:rFonts w:ascii="Arial" w:hAnsi="Arial" w:eastAsia="Arial" w:cs="Arial"/>
+          <w:noProof w:val="0"/>
+          <w:sz w:val="24"/>
+          <w:szCs w:val="24"/>
+          <w:lang w:val="pt-BR"/>
+        </w:rPr>
+        <w:t>Os dados são organizados em coleções compostas por documentos no formato BSON (Binary JSON), possibilitando o armazenamento de informações relacionadas a usuários, clientes, prestadores, atendimentos, agendamentos, métricas, portfólios e demais funcionalidades da plataforma.</w:t>
+      </w:r>
+    </w:p>
+    <w:p>
+      <w:pPr>
+        <w:bidi w:val="0"/>
+        <w:spacing w:before="240" w:beforeAutospacing="off" w:after="240" w:afterAutospacing="off"/>
+      </w:pPr>
+      <w:r>
+        <w:rPr>
+          <w:rFonts w:ascii="Arial" w:hAnsi="Arial" w:eastAsia="Arial" w:cs="Arial"/>
+          <w:noProof w:val="0"/>
+          <w:sz w:val="24"/>
+          <w:szCs w:val="24"/>
+          <w:lang w:val="pt-BR"/>
+        </w:rPr>
+        <w:t>Além das informações operacionais, o banco de dados também armazenará os dados necessários para a geração de métricas, indicadores e relatórios gerenciais, apoiando os processos de mineração de dados da aplicação. As informações armazenadas serão compartilhadas entre o aplicativo mobile, os portais web e os demais serviços que compõem a plataforma.</w:t>
+      </w:r>
+    </w:p>
+    <w:p>
+      <w:pPr>
+        <w:bidi w:val="0"/>
+        <w:spacing w:before="240" w:beforeAutospacing="off" w:after="240" w:afterAutospacing="off"/>
+      </w:pPr>
+      <w:r>
+        <w:rPr>
+          <w:rFonts w:ascii="Arial" w:hAnsi="Arial" w:eastAsia="Arial" w:cs="Arial"/>
+          <w:noProof w:val="0"/>
+          <w:sz w:val="24"/>
+          <w:szCs w:val="24"/>
+          <w:lang w:val="pt-BR"/>
+        </w:rPr>
+        <w:t xml:space="preserve">A utilização do </w:t>
+      </w:r>
+      <w:r>
+        <w:rPr>
+          <w:rFonts w:ascii="Arial" w:hAnsi="Arial" w:eastAsia="Arial" w:cs="Arial"/>
+          <w:noProof w:val="0"/>
+          <w:sz w:val="24"/>
+          <w:szCs w:val="24"/>
+          <w:lang w:val="pt-BR"/>
+        </w:rPr>
+        <w:t>MongoDB</w:t>
+      </w:r>
+      <w:r>
+        <w:rPr>
+          <w:rFonts w:ascii="Arial" w:hAnsi="Arial" w:eastAsia="Arial" w:cs="Arial"/>
+          <w:noProof w:val="0"/>
+          <w:sz w:val="24"/>
+          <w:szCs w:val="24"/>
+          <w:lang w:val="pt-BR"/>
+        </w:rPr>
+        <w:t xml:space="preserve"> proporciona flexibilidade, escalabilidade e bom desempenho no gerenciamento dos dados, contribuindo para a integração e o funcionamento eficiente dos diferentes módulos do sistema.</w:t>
+      </w:r>
     </w:p>
     <w:p>
       <w:pPr>
@@ -17293,6 +17165,7 @@
         <w:rPr>
           <w:rStyle w:val="FiguraChar"/>
           <w:sz w:val="20"/>
+          <w:szCs w:val="20"/>
         </w:rPr>
         <w:br w:type="page"/>
       </w:r>
@@ -17300,21 +17173,49 @@
     <w:p>
       <w:pPr>
         <w:pStyle w:val="Ttulo1"/>
-        <w:rPr>
-          <w:rStyle w:val="FiguraChar"/>
-          <w:sz w:val="20"/>
-        </w:rPr>
-      </w:pPr>
-      <w:bookmarkStart w:name="_Toc230779132" w:id="95"/>
-      <w:r>
-        <w:rPr>
-          <w:rStyle w:val="FiguraChar"/>
-          <w:sz w:val="20"/>
-        </w:rPr>
-        <w:lastRenderedPageBreak/>
-        <w:t>Fluxograma</w:t>
-      </w:r>
-      <w:bookmarkEnd w:id="95"/>
+        <w:suppressLineNumbers w:val="0"/>
+        <w:bidi w:val="0"/>
+        <w:spacing w:before="0" w:beforeAutospacing="off" w:after="0" w:afterAutospacing="off" w:line="360" w:lineRule="auto"/>
+        <w:ind w:left="432" w:right="0" w:hanging="432"/>
+        <w:jc w:val="both"/>
+        <w:rPr/>
+      </w:pPr>
+      <w:r>
+        <w:rPr/>
+        <w:t>Diagrama de classes</w:t>
+      </w:r>
+    </w:p>
+    <w:p>
+      <w:pPr>
+        <w:pStyle w:val="Normal"/>
+        <w:bidi w:val="0"/>
+      </w:pPr>
+    </w:p>
+    <w:p>
+      <w:pPr>
+        <w:pStyle w:val="Normal"/>
+        <w:bidi w:val="0"/>
+      </w:pPr>
+      <w:r>
+        <w:rPr>
+          <w:rFonts w:ascii="Arial" w:hAnsi="Arial" w:eastAsia="Arial" w:cs="Arial"/>
+          <w:noProof w:val="0"/>
+          <w:sz w:val="24"/>
+          <w:szCs w:val="24"/>
+          <w:lang w:val="pt-BR"/>
+        </w:rPr>
+        <w:t xml:space="preserve">O MongoDB não utiliza um Diagrama de Classe, pois é um banco de dados não relacional orientado a documentos. Em vez de organizar os dados em tabelas com relações rígidas, o MongoDB armazena informações em coleções de documentos no formato JSON (ou BSON), permitindo maior flexibilidade na modelagem dos dados.  </w:t>
+      </w:r>
+    </w:p>
+    <w:p>
+      <w:pPr>
+        <w:pStyle w:val="Normal"/>
+      </w:pPr>
+    </w:p>
+    <w:p>
+      <w:pPr>
+        <w:pStyle w:val="Normal"/>
+      </w:pPr>
     </w:p>
     <w:p>
       <w:pPr>
@@ -17329,733 +17230,13 @@
     <w:p>
       <w:pPr>
         <w:pStyle w:val="Figura"/>
-        <w:rPr>
-          <w:szCs w:val="24"/>
-        </w:rPr>
-      </w:pPr>
-      <w:bookmarkStart w:name="_Toc168898594" w:id="96"/>
-      <w:bookmarkStart w:name="_Toc169517817" w:id="97"/>
-      <w:bookmarkStart w:name="_Toc230779160" w:id="98"/>
-      <w:r>
-        <w:rPr>
-          <w:szCs w:val="24"/>
-        </w:rPr>
-        <w:t xml:space="preserve">Figura </w:t>
-      </w:r>
-      <w:r>
-        <w:rPr>
-          <w:szCs w:val="24"/>
-        </w:rPr>
-        <w:fldChar w:fldCharType="begin"/>
-      </w:r>
-      <w:r>
-        <w:rPr>
-          <w:szCs w:val="24"/>
-        </w:rPr>
-        <w:instrText xml:space="preserve"> SEQ Figura \* ARABIC </w:instrText>
-      </w:r>
-      <w:r>
-        <w:rPr>
-          <w:szCs w:val="24"/>
-        </w:rPr>
-        <w:fldChar w:fldCharType="separate"/>
-      </w:r>
-      <w:r>
-        <w:rPr>
-          <w:noProof/>
-          <w:szCs w:val="24"/>
-        </w:rPr>
-        <w:t>3</w:t>
-      </w:r>
-      <w:r>
-        <w:rPr>
-          <w:szCs w:val="24"/>
-        </w:rPr>
-        <w:fldChar w:fldCharType="end"/>
-      </w:r>
-      <w:r>
-        <w:rPr>
-          <w:szCs w:val="24"/>
-        </w:rPr>
-        <w:t xml:space="preserve"> - </w:t>
-      </w:r>
-      <w:bookmarkEnd w:id="96"/>
-      <w:bookmarkEnd w:id="97"/>
-      <w:r>
-        <w:rPr>
-          <w:szCs w:val="24"/>
-        </w:rPr>
-        <w:t>Fluxograma</w:t>
-      </w:r>
-      <w:bookmarkEnd w:id="98"/>
-    </w:p>
-    <w:p>
-      <w:pPr>
-        <w:pStyle w:val="Figura"/>
-      </w:pPr>
-      <w:r>
-        <w:rPr>
-          <w:noProof/>
-        </w:rPr>
-        <w:drawing>
-          <wp:inline distT="0" distB="0" distL="0" distR="0" wp14:anchorId="10887BDB" wp14:editId="7CFBDAC2">
-            <wp:extent cx="2708563" cy="3391353"/>
-            <wp:effectExtent l="0" t="0" r="0" b="0"/>
-            <wp:docPr id="1" name="drawing"/>
-            <wp:cNvGraphicFramePr>
-              <a:graphicFrameLocks xmlns:a="http://schemas.openxmlformats.org/drawingml/2006/main" noChangeAspect="1"/>
-            </wp:cNvGraphicFramePr>
-            <a:graphic xmlns:a="http://schemas.openxmlformats.org/drawingml/2006/main">
-              <a:graphicData uri="http://schemas.openxmlformats.org/drawingml/2006/picture">
-                <pic:pic xmlns:pic="http://schemas.openxmlformats.org/drawingml/2006/picture">
-                  <pic:nvPicPr>
-                    <pic:cNvPr id="953221992" name="Picture 953221992"/>
-                    <pic:cNvPicPr/>
-                  </pic:nvPicPr>
-                  <pic:blipFill>
-                    <a:blip r:embed="rId16" cstate="print">
-                      <a:extLst>
-                        <a:ext uri="{28A0092B-C50C-407E-A947-70E740481C1C}">
-                          <a14:useLocalDpi xmlns:a14="http://schemas.microsoft.com/office/drawing/2010/main" val="0"/>
-                        </a:ext>
-                      </a:extLst>
-                    </a:blip>
-                    <a:stretch>
-                      <a:fillRect/>
-                    </a:stretch>
-                  </pic:blipFill>
-                  <pic:spPr>
-                    <a:xfrm>
-                      <a:off x="0" y="0"/>
-                      <a:ext cx="2708563" cy="3391353"/>
-                    </a:xfrm>
-                    <a:prstGeom prst="rect">
-                      <a:avLst/>
-                    </a:prstGeom>
-                  </pic:spPr>
-                </pic:pic>
-              </a:graphicData>
-            </a:graphic>
-          </wp:inline>
-        </w:drawing>
-      </w:r>
-    </w:p>
-    <w:p>
-      <w:pPr>
-        <w:pStyle w:val="Figura"/>
-      </w:pPr>
-      <w:r>
-        <w:t>Fonte: Elaborado pelos autores (2026).</w:t>
-      </w:r>
+        <w:jc w:val="both"/>
+      </w:pPr>
     </w:p>
     <w:p>
       <w:pPr>
         <w:pStyle w:val="Figura"/>
         <w:jc w:val="both"/>
-      </w:pPr>
-    </w:p>
-    <w:p>
-      <w:pPr>
-        <w:pStyle w:val="Figura"/>
-        <w:jc w:val="both"/>
-      </w:pPr>
-    </w:p>
-    <w:p>
-      <w:pPr>
-        <w:pStyle w:val="Ttulo2"/>
-      </w:pPr>
-      <w:bookmarkStart w:name="_Toc230779133" w:id="99"/>
-      <w:r>
-        <w:t>SUBPROCESSOS</w:t>
-      </w:r>
-      <w:bookmarkEnd w:id="99"/>
-    </w:p>
-    <w:p>
-      <w:pPr>
-        <w:pStyle w:val="Ttulo3"/>
-      </w:pPr>
-      <w:bookmarkStart w:name="_Toc230779134" w:id="100"/>
-      <w:r>
-        <w:t>Agendamentos</w:t>
-      </w:r>
-      <w:bookmarkEnd w:id="100"/>
-    </w:p>
-    <w:p>
-      <w:pPr>
-        <w:pStyle w:val="Figura"/>
-        <w:rPr>
-          <w:szCs w:val="24"/>
-        </w:rPr>
-      </w:pPr>
-      <w:bookmarkStart w:name="_Toc168898595" w:id="101"/>
-      <w:bookmarkStart w:name="_Toc169517818" w:id="102"/>
-      <w:bookmarkStart w:name="_Toc230779161" w:id="103"/>
-      <w:r>
-        <w:rPr>
-          <w:szCs w:val="24"/>
-        </w:rPr>
-        <w:t xml:space="preserve">Figura </w:t>
-      </w:r>
-      <w:r>
-        <w:rPr>
-          <w:szCs w:val="24"/>
-        </w:rPr>
-        <w:fldChar w:fldCharType="begin"/>
-      </w:r>
-      <w:r>
-        <w:rPr>
-          <w:szCs w:val="24"/>
-        </w:rPr>
-        <w:instrText xml:space="preserve"> SEQ Figura \* ARABIC </w:instrText>
-      </w:r>
-      <w:r>
-        <w:rPr>
-          <w:szCs w:val="24"/>
-        </w:rPr>
-        <w:fldChar w:fldCharType="separate"/>
-      </w:r>
-      <w:r>
-        <w:rPr>
-          <w:noProof/>
-          <w:szCs w:val="24"/>
-        </w:rPr>
-        <w:t>4</w:t>
-      </w:r>
-      <w:r>
-        <w:rPr>
-          <w:szCs w:val="24"/>
-        </w:rPr>
-        <w:fldChar w:fldCharType="end"/>
-      </w:r>
-      <w:r>
-        <w:rPr>
-          <w:szCs w:val="24"/>
-        </w:rPr>
-        <w:t xml:space="preserve"> – </w:t>
-      </w:r>
-      <w:bookmarkEnd w:id="101"/>
-      <w:bookmarkEnd w:id="102"/>
-      <w:r>
-        <w:rPr>
-          <w:szCs w:val="24"/>
-        </w:rPr>
-        <w:t>Fluxograma Agendamentos</w:t>
-      </w:r>
-      <w:bookmarkEnd w:id="103"/>
-    </w:p>
-    <w:p>
-      <w:pPr>
-        <w:pStyle w:val="Figura"/>
-      </w:pPr>
-      <w:r>
-        <w:rPr>
-          <w:noProof/>
-        </w:rPr>
-        <w:drawing>
-          <wp:inline distT="0" distB="0" distL="0" distR="0" wp14:anchorId="1C4D90ED" wp14:editId="38F37A53">
-            <wp:extent cx="2708563" cy="2512343"/>
-            <wp:effectExtent l="0" t="0" r="0" b="0"/>
-            <wp:docPr id="2" name="drawing"/>
-            <wp:cNvGraphicFramePr>
-              <a:graphicFrameLocks xmlns:a="http://schemas.openxmlformats.org/drawingml/2006/main" noChangeAspect="1"/>
-            </wp:cNvGraphicFramePr>
-            <a:graphic xmlns:a="http://schemas.openxmlformats.org/drawingml/2006/main">
-              <a:graphicData uri="http://schemas.openxmlformats.org/drawingml/2006/picture">
-                <pic:pic xmlns:pic="http://schemas.openxmlformats.org/drawingml/2006/picture">
-                  <pic:nvPicPr>
-                    <pic:cNvPr id="953221992" name="Picture 953221992"/>
-                    <pic:cNvPicPr/>
-                  </pic:nvPicPr>
-                  <pic:blipFill>
-                    <a:blip r:embed="rId17" cstate="print">
-                      <a:extLst>
-                        <a:ext uri="{28A0092B-C50C-407E-A947-70E740481C1C}">
-                          <a14:useLocalDpi xmlns:a14="http://schemas.microsoft.com/office/drawing/2010/main" val="0"/>
-                        </a:ext>
-                      </a:extLst>
-                    </a:blip>
-                    <a:stretch>
-                      <a:fillRect/>
-                    </a:stretch>
-                  </pic:blipFill>
-                  <pic:spPr>
-                    <a:xfrm>
-                      <a:off x="0" y="0"/>
-                      <a:ext cx="2708563" cy="2512343"/>
-                    </a:xfrm>
-                    <a:prstGeom prst="rect">
-                      <a:avLst/>
-                    </a:prstGeom>
-                  </pic:spPr>
-                </pic:pic>
-              </a:graphicData>
-            </a:graphic>
-          </wp:inline>
-        </w:drawing>
-      </w:r>
-    </w:p>
-    <w:p>
-      <w:pPr>
-        <w:pStyle w:val="Figura"/>
-      </w:pPr>
-      <w:r>
-        <w:t>Fonte: Elaborado pelos autores (2026).</w:t>
-      </w:r>
-    </w:p>
-    <w:p/>
-    <w:p>
-      <w:pPr>
-        <w:pStyle w:val="Ttulo3"/>
-      </w:pPr>
-      <w:bookmarkStart w:name="_Toc230779135" w:id="104"/>
-      <w:r>
-        <w:lastRenderedPageBreak/>
-        <w:t>Clientes</w:t>
-      </w:r>
-      <w:bookmarkEnd w:id="104"/>
-    </w:p>
-    <w:p>
-      <w:pPr>
-        <w:pStyle w:val="Figura"/>
-        <w:rPr>
-          <w:szCs w:val="24"/>
-          <w:u w:val="single"/>
-          <w:lang w:val="en-US"/>
-        </w:rPr>
-      </w:pPr>
-      <w:bookmarkStart w:name="_Toc168898596" w:id="105"/>
-      <w:bookmarkStart w:name="_Toc169517819" w:id="106"/>
-      <w:bookmarkStart w:name="_Toc230779162" w:id="107"/>
-      <w:proofErr w:type="spellStart"/>
-      <w:r>
-        <w:rPr>
-          <w:szCs w:val="24"/>
-          <w:lang w:val="en-US"/>
-        </w:rPr>
-        <w:t>Figura</w:t>
-      </w:r>
-      <w:proofErr w:type="spellEnd"/>
-      <w:r>
-        <w:rPr>
-          <w:szCs w:val="24"/>
-          <w:lang w:val="en-US"/>
-        </w:rPr>
-        <w:t xml:space="preserve"> </w:t>
-      </w:r>
-      <w:r>
-        <w:rPr>
-          <w:szCs w:val="24"/>
-          <w:lang w:val="en-US"/>
-        </w:rPr>
-        <w:fldChar w:fldCharType="begin"/>
-      </w:r>
-      <w:r>
-        <w:rPr>
-          <w:szCs w:val="24"/>
-          <w:lang w:val="en-US"/>
-        </w:rPr>
-        <w:instrText xml:space="preserve"> SEQ Figura \* ARABIC </w:instrText>
-      </w:r>
-      <w:r>
-        <w:rPr>
-          <w:szCs w:val="24"/>
-          <w:lang w:val="en-US"/>
-        </w:rPr>
-        <w:fldChar w:fldCharType="separate"/>
-      </w:r>
-      <w:r>
-        <w:rPr>
-          <w:noProof/>
-          <w:szCs w:val="24"/>
-          <w:lang w:val="en-US"/>
-        </w:rPr>
-        <w:t>5</w:t>
-      </w:r>
-      <w:r>
-        <w:rPr>
-          <w:szCs w:val="24"/>
-          <w:lang w:val="en-US"/>
-        </w:rPr>
-        <w:fldChar w:fldCharType="end"/>
-      </w:r>
-      <w:r>
-        <w:rPr>
-          <w:szCs w:val="24"/>
-          <w:lang w:val="en-US"/>
-        </w:rPr>
-        <w:t xml:space="preserve"> – </w:t>
-      </w:r>
-      <w:bookmarkEnd w:id="105"/>
-      <w:bookmarkEnd w:id="106"/>
-      <w:proofErr w:type="spellStart"/>
-      <w:r>
-        <w:rPr>
-          <w:szCs w:val="24"/>
-          <w:lang w:val="en-US"/>
-        </w:rPr>
-        <w:t>Fluxograma</w:t>
-      </w:r>
-      <w:proofErr w:type="spellEnd"/>
-      <w:r>
-        <w:rPr>
-          <w:szCs w:val="24"/>
-          <w:lang w:val="en-US"/>
-        </w:rPr>
-        <w:t xml:space="preserve"> </w:t>
-      </w:r>
-      <w:proofErr w:type="spellStart"/>
-      <w:r>
-        <w:rPr>
-          <w:szCs w:val="24"/>
-          <w:lang w:val="en-US"/>
-        </w:rPr>
-        <w:t>Clientes</w:t>
-      </w:r>
-      <w:bookmarkEnd w:id="107"/>
-      <w:proofErr w:type="spellEnd"/>
-    </w:p>
-    <w:p>
-      <w:pPr>
-        <w:pStyle w:val="Figura"/>
-      </w:pPr>
-      <w:r>
-        <w:rPr>
-          <w:noProof/>
-        </w:rPr>
-        <w:drawing>
-          <wp:inline distT="0" distB="0" distL="0" distR="0" wp14:anchorId="153BF695" wp14:editId="1EBDA0E7">
-            <wp:extent cx="2708563" cy="1816146"/>
-            <wp:effectExtent l="0" t="0" r="0" b="0"/>
-            <wp:docPr id="4" name="drawing"/>
-            <wp:cNvGraphicFramePr>
-              <a:graphicFrameLocks xmlns:a="http://schemas.openxmlformats.org/drawingml/2006/main" noChangeAspect="1"/>
-            </wp:cNvGraphicFramePr>
-            <a:graphic xmlns:a="http://schemas.openxmlformats.org/drawingml/2006/main">
-              <a:graphicData uri="http://schemas.openxmlformats.org/drawingml/2006/picture">
-                <pic:pic xmlns:pic="http://schemas.openxmlformats.org/drawingml/2006/picture">
-                  <pic:nvPicPr>
-                    <pic:cNvPr id="953221992" name="Picture 953221992"/>
-                    <pic:cNvPicPr/>
-                  </pic:nvPicPr>
-                  <pic:blipFill>
-                    <a:blip r:embed="rId18" cstate="print">
-                      <a:extLst>
-                        <a:ext uri="{28A0092B-C50C-407E-A947-70E740481C1C}">
-                          <a14:useLocalDpi xmlns:a14="http://schemas.microsoft.com/office/drawing/2010/main" val="0"/>
-                        </a:ext>
-                      </a:extLst>
-                    </a:blip>
-                    <a:stretch>
-                      <a:fillRect/>
-                    </a:stretch>
-                  </pic:blipFill>
-                  <pic:spPr>
-                    <a:xfrm>
-                      <a:off x="0" y="0"/>
-                      <a:ext cx="2708563" cy="1816146"/>
-                    </a:xfrm>
-                    <a:prstGeom prst="rect">
-                      <a:avLst/>
-                    </a:prstGeom>
-                  </pic:spPr>
-                </pic:pic>
-              </a:graphicData>
-            </a:graphic>
-          </wp:inline>
-        </w:drawing>
-      </w:r>
-    </w:p>
-    <w:p>
-      <w:pPr>
-        <w:pStyle w:val="Figura"/>
-      </w:pPr>
-      <w:r>
-        <w:t>Fonte: Elaborado pelos autores (2026).</w:t>
-      </w:r>
-    </w:p>
-    <w:p>
-      <w:pPr>
-        <w:pStyle w:val="Figura"/>
-      </w:pPr>
-    </w:p>
-    <w:p>
-      <w:pPr>
-        <w:pStyle w:val="Ttulo3"/>
-      </w:pPr>
-      <w:bookmarkStart w:name="_Toc230779136" w:id="108"/>
-      <w:r>
-        <w:t>Financeiro</w:t>
-      </w:r>
-      <w:bookmarkEnd w:id="108"/>
-    </w:p>
-    <w:p>
-      <w:pPr>
-        <w:pStyle w:val="Figura"/>
-        <w:rPr>
-          <w:szCs w:val="24"/>
-        </w:rPr>
-      </w:pPr>
-      <w:bookmarkStart w:name="_Toc168898597" w:id="109"/>
-      <w:bookmarkStart w:name="_Toc169517820" w:id="110"/>
-      <w:bookmarkStart w:name="_Toc230779163" w:id="111"/>
-      <w:r>
-        <w:rPr>
-          <w:szCs w:val="24"/>
-        </w:rPr>
-        <w:t xml:space="preserve">Figura </w:t>
-      </w:r>
-      <w:r>
-        <w:rPr>
-          <w:szCs w:val="24"/>
-        </w:rPr>
-        <w:fldChar w:fldCharType="begin"/>
-      </w:r>
-      <w:r>
-        <w:rPr>
-          <w:szCs w:val="24"/>
-        </w:rPr>
-        <w:instrText xml:space="preserve"> SEQ Figura \* ARABIC </w:instrText>
-      </w:r>
-      <w:r>
-        <w:rPr>
-          <w:szCs w:val="24"/>
-        </w:rPr>
-        <w:fldChar w:fldCharType="separate"/>
-      </w:r>
-      <w:r>
-        <w:rPr>
-          <w:noProof/>
-          <w:szCs w:val="24"/>
-        </w:rPr>
-        <w:t>6</w:t>
-      </w:r>
-      <w:r>
-        <w:rPr>
-          <w:szCs w:val="24"/>
-        </w:rPr>
-        <w:fldChar w:fldCharType="end"/>
-      </w:r>
-      <w:r>
-        <w:rPr>
-          <w:szCs w:val="24"/>
-        </w:rPr>
-        <w:t xml:space="preserve"> – </w:t>
-      </w:r>
-      <w:bookmarkEnd w:id="109"/>
-      <w:bookmarkEnd w:id="110"/>
-      <w:r>
-        <w:rPr>
-          <w:szCs w:val="24"/>
-        </w:rPr>
-        <w:t xml:space="preserve">Fluxograma </w:t>
-      </w:r>
-      <w:r>
-        <w:rPr>
-          <w:szCs w:val="24"/>
-        </w:rPr>
-        <w:t>Financeiro</w:t>
-      </w:r>
-      <w:bookmarkEnd w:id="111"/>
-    </w:p>
-    <w:p>
-      <w:pPr>
-        <w:pStyle w:val="Figura"/>
-      </w:pPr>
-      <w:r>
-        <w:rPr>
-          <w:noProof/>
-        </w:rPr>
-        <w:drawing>
-          <wp:inline distT="0" distB="0" distL="0" distR="0" wp14:anchorId="5329D132" wp14:editId="074D18DC">
-            <wp:extent cx="1331901" cy="1816146"/>
-            <wp:effectExtent l="0" t="0" r="0" b="0"/>
-            <wp:docPr id="5" name="drawing"/>
-            <wp:cNvGraphicFramePr>
-              <a:graphicFrameLocks xmlns:a="http://schemas.openxmlformats.org/drawingml/2006/main" noChangeAspect="1"/>
-            </wp:cNvGraphicFramePr>
-            <a:graphic xmlns:a="http://schemas.openxmlformats.org/drawingml/2006/main">
-              <a:graphicData uri="http://schemas.openxmlformats.org/drawingml/2006/picture">
-                <pic:pic xmlns:pic="http://schemas.openxmlformats.org/drawingml/2006/picture">
-                  <pic:nvPicPr>
-                    <pic:cNvPr id="953221992" name="Picture 953221992"/>
-                    <pic:cNvPicPr/>
-                  </pic:nvPicPr>
-                  <pic:blipFill>
-                    <a:blip r:embed="rId19" cstate="print">
-                      <a:extLst>
-                        <a:ext uri="{28A0092B-C50C-407E-A947-70E740481C1C}">
-                          <a14:useLocalDpi xmlns:a14="http://schemas.microsoft.com/office/drawing/2010/main" val="0"/>
-                        </a:ext>
-                      </a:extLst>
-                    </a:blip>
-                    <a:stretch>
-                      <a:fillRect/>
-                    </a:stretch>
-                  </pic:blipFill>
-                  <pic:spPr>
-                    <a:xfrm>
-                      <a:off x="0" y="0"/>
-                      <a:ext cx="1331901" cy="1816146"/>
-                    </a:xfrm>
-                    <a:prstGeom prst="rect">
-                      <a:avLst/>
-                    </a:prstGeom>
-                  </pic:spPr>
-                </pic:pic>
-              </a:graphicData>
-            </a:graphic>
-          </wp:inline>
-        </w:drawing>
-      </w:r>
-    </w:p>
-    <w:p>
-      <w:pPr>
-        <w:pStyle w:val="Figura"/>
-      </w:pPr>
-      <w:r>
-        <w:t>Fonte: Elaborado pelos autores (2026).</w:t>
-      </w:r>
-    </w:p>
-    <w:p>
-      <w:pPr>
-        <w:pStyle w:val="Figura"/>
-      </w:pPr>
-    </w:p>
-    <w:p>
-      <w:pPr>
-        <w:pStyle w:val="Ttulo3"/>
-      </w:pPr>
-      <w:bookmarkStart w:name="_Toc230779137" w:id="112"/>
-      <w:r>
-        <w:t>Serviços</w:t>
-      </w:r>
-      <w:bookmarkEnd w:id="112"/>
-    </w:p>
-    <w:p>
-      <w:pPr>
-        <w:pStyle w:val="Figura"/>
-        <w:rPr>
-          <w:szCs w:val="24"/>
-        </w:rPr>
-      </w:pPr>
-      <w:bookmarkStart w:name="_Toc230779164" w:id="113"/>
-      <w:r>
-        <w:rPr>
-          <w:szCs w:val="24"/>
-        </w:rPr>
-        <w:t xml:space="preserve">Figura </w:t>
-      </w:r>
-      <w:r>
-        <w:rPr>
-          <w:szCs w:val="24"/>
-        </w:rPr>
-        <w:fldChar w:fldCharType="begin"/>
-      </w:r>
-      <w:r>
-        <w:rPr>
-          <w:szCs w:val="24"/>
-        </w:rPr>
-        <w:instrText xml:space="preserve"> SEQ Figura \* ARABIC </w:instrText>
-      </w:r>
-      <w:r>
-        <w:rPr>
-          <w:szCs w:val="24"/>
-        </w:rPr>
-        <w:fldChar w:fldCharType="separate"/>
-      </w:r>
-      <w:r>
-        <w:rPr>
-          <w:noProof/>
-          <w:szCs w:val="24"/>
-        </w:rPr>
-        <w:t>7</w:t>
-      </w:r>
-      <w:r>
-        <w:rPr>
-          <w:szCs w:val="24"/>
-        </w:rPr>
-        <w:fldChar w:fldCharType="end"/>
-      </w:r>
-      <w:r>
-        <w:rPr>
-          <w:szCs w:val="24"/>
-        </w:rPr>
-        <w:t xml:space="preserve"> – Fluxograma Serviços</w:t>
-      </w:r>
-      <w:bookmarkEnd w:id="113"/>
-    </w:p>
-    <w:p>
-      <w:pPr>
-        <w:pStyle w:val="Figura"/>
-      </w:pPr>
-      <w:r>
-        <w:rPr>
-          <w:noProof/>
-        </w:rPr>
-        <w:drawing>
-          <wp:inline distT="0" distB="0" distL="0" distR="0" wp14:anchorId="38ED2E67" wp14:editId="4CA6CE2A">
-            <wp:extent cx="1398432" cy="1816146"/>
-            <wp:effectExtent l="0" t="0" r="0" b="0"/>
-            <wp:docPr id="6" name="drawing"/>
-            <wp:cNvGraphicFramePr>
-              <a:graphicFrameLocks xmlns:a="http://schemas.openxmlformats.org/drawingml/2006/main" noChangeAspect="1"/>
-            </wp:cNvGraphicFramePr>
-            <a:graphic xmlns:a="http://schemas.openxmlformats.org/drawingml/2006/main">
-              <a:graphicData uri="http://schemas.openxmlformats.org/drawingml/2006/picture">
-                <pic:pic xmlns:pic="http://schemas.openxmlformats.org/drawingml/2006/picture">
-                  <pic:nvPicPr>
-                    <pic:cNvPr id="953221992" name="Picture 953221992"/>
-                    <pic:cNvPicPr/>
-                  </pic:nvPicPr>
-                  <pic:blipFill>
-                    <a:blip r:embed="rId20" cstate="print">
-                      <a:extLst>
-                        <a:ext uri="{28A0092B-C50C-407E-A947-70E740481C1C}">
-                          <a14:useLocalDpi xmlns:a14="http://schemas.microsoft.com/office/drawing/2010/main" val="0"/>
-                        </a:ext>
-                      </a:extLst>
-                    </a:blip>
-                    <a:stretch>
-                      <a:fillRect/>
-                    </a:stretch>
-                  </pic:blipFill>
-                  <pic:spPr>
-                    <a:xfrm>
-                      <a:off x="0" y="0"/>
-                      <a:ext cx="1398432" cy="1816146"/>
-                    </a:xfrm>
-                    <a:prstGeom prst="rect">
-                      <a:avLst/>
-                    </a:prstGeom>
-                  </pic:spPr>
-                </pic:pic>
-              </a:graphicData>
-            </a:graphic>
-          </wp:inline>
-        </w:drawing>
-      </w:r>
-    </w:p>
-    <w:p>
-      <w:pPr>
-        <w:pStyle w:val="Figura"/>
-      </w:pPr>
-      <w:r>
-        <w:t>Fonte: Elaborado pelos autores (2026).</w:t>
-      </w:r>
-    </w:p>
-    <w:p>
-      <w:pPr>
-        <w:pStyle w:val="Figura"/>
-      </w:pPr>
-    </w:p>
-    <w:p>
-      <w:pPr>
-        <w:pStyle w:val="Figura"/>
-      </w:pPr>
-    </w:p>
-    <w:p>
-      <w:pPr>
-        <w:ind w:firstLine="0"/>
       </w:pPr>
     </w:p>
     <w:p>
@@ -18065,171 +17246,6 @@
         <w:ind w:firstLine="0"/>
         <w:jc w:val="left"/>
         <w:rPr>
-          <w:rStyle w:val="FiguraChar"/>
-          <w:sz w:val="20"/>
-        </w:rPr>
-      </w:pPr>
-    </w:p>
-    <w:p>
-      <w:pPr>
-        <w:widowControl/>
-        <w:spacing w:line="240" w:lineRule="auto"/>
-        <w:ind w:firstLine="0"/>
-        <w:jc w:val="left"/>
-        <w:rPr>
-          <w:rStyle w:val="FiguraChar"/>
-          <w:b/>
-          <w:caps/>
-          <w:sz w:val="20"/>
-          <w:lang w:val="en-US"/>
-        </w:rPr>
-      </w:pPr>
-    </w:p>
-    <w:p>
-      <w:pPr>
-        <w:pStyle w:val="Ttulo1"/>
-        <w:rPr>
-          <w:rStyle w:val="FiguraChar"/>
-          <w:sz w:val="20"/>
-        </w:rPr>
-      </w:pPr>
-      <w:bookmarkStart w:name="_Toc230779138" w:id="114"/>
-      <w:r>
-        <w:rPr>
-          <w:rStyle w:val="FiguraChar"/>
-          <w:sz w:val="20"/>
-        </w:rPr>
-        <w:t>Persona</w:t>
-      </w:r>
-      <w:bookmarkEnd w:id="114"/>
-    </w:p>
-    <w:p>
-      <w:pPr>
-        <w:pStyle w:val="Figura"/>
-      </w:pPr>
-      <w:bookmarkStart w:name="_Toc230779165" w:id="115"/>
-      <w:r>
-        <w:rPr>
-          <w:szCs w:val="24"/>
-        </w:rPr>
-        <w:t xml:space="preserve">Figura </w:t>
-      </w:r>
-      <w:r>
-        <w:rPr>
-          <w:szCs w:val="24"/>
-        </w:rPr>
-        <w:fldChar w:fldCharType="begin"/>
-      </w:r>
-      <w:r>
-        <w:rPr>
-          <w:szCs w:val="24"/>
-        </w:rPr>
-        <w:instrText xml:space="preserve"> SEQ Figura \* ARABIC </w:instrText>
-      </w:r>
-      <w:r>
-        <w:rPr>
-          <w:szCs w:val="24"/>
-        </w:rPr>
-        <w:fldChar w:fldCharType="separate"/>
-      </w:r>
-      <w:r>
-        <w:rPr>
-          <w:noProof/>
-          <w:szCs w:val="24"/>
-        </w:rPr>
-        <w:t>8</w:t>
-      </w:r>
-      <w:r>
-        <w:rPr>
-          <w:szCs w:val="24"/>
-        </w:rPr>
-        <w:fldChar w:fldCharType="end"/>
-      </w:r>
-      <w:r>
-        <w:rPr>
-          <w:szCs w:val="24"/>
-        </w:rPr>
-        <w:t xml:space="preserve"> </w:t>
-      </w:r>
-      <w:r>
-        <w:t>- Persona</w:t>
-      </w:r>
-      <w:bookmarkEnd w:id="115"/>
-    </w:p>
-    <w:p>
-      <w:pPr>
-        <w:ind w:firstLine="0"/>
-        <w:jc w:val="center"/>
-      </w:pPr>
-      <w:r>
-        <w:rPr>
-          <w:noProof/>
-        </w:rPr>
-        <w:drawing>
-          <wp:inline distT="0" distB="0" distL="0" distR="0" wp14:anchorId="70C53DBF" wp14:editId="59BDE19B">
-            <wp:extent cx="5757333" cy="3238499"/>
-            <wp:effectExtent l="0" t="0" r="0" b="635"/>
-            <wp:docPr id="3" name="drawing"/>
-            <wp:cNvGraphicFramePr>
-              <a:graphicFrameLocks xmlns:a="http://schemas.openxmlformats.org/drawingml/2006/main" noChangeAspect="1"/>
-            </wp:cNvGraphicFramePr>
-            <a:graphic xmlns:a="http://schemas.openxmlformats.org/drawingml/2006/main">
-              <a:graphicData uri="http://schemas.openxmlformats.org/drawingml/2006/picture">
-                <pic:pic xmlns:pic="http://schemas.openxmlformats.org/drawingml/2006/picture">
-                  <pic:nvPicPr>
-                    <pic:cNvPr id="340932398" name=""/>
-                    <pic:cNvPicPr/>
-                  </pic:nvPicPr>
-                  <pic:blipFill>
-                    <a:blip r:embed="rId21" cstate="print">
-                      <a:extLst>
-                        <a:ext uri="{28A0092B-C50C-407E-A947-70E740481C1C}">
-                          <a14:useLocalDpi xmlns:a14="http://schemas.microsoft.com/office/drawing/2010/main" val="0"/>
-                        </a:ext>
-                      </a:extLst>
-                    </a:blip>
-                    <a:stretch>
-                      <a:fillRect/>
-                    </a:stretch>
-                  </pic:blipFill>
-                  <pic:spPr>
-                    <a:xfrm>
-                      <a:off x="0" y="0"/>
-                      <a:ext cx="5757333" cy="3238499"/>
-                    </a:xfrm>
-                    <a:prstGeom prst="rect">
-                      <a:avLst/>
-                    </a:prstGeom>
-                  </pic:spPr>
-                </pic:pic>
-              </a:graphicData>
-            </a:graphic>
-          </wp:inline>
-        </w:drawing>
-      </w:r>
-      <w:r>
-        <w:rPr>
-          <w:rStyle w:val="FiguraChar"/>
-          <w:sz w:val="20"/>
-        </w:rPr>
-        <w:t>Fonte: Elaborado pelos autores (2026)</w:t>
-      </w:r>
-      <w:r>
-        <w:rPr>
-          <w:rStyle w:val="FiguraChar"/>
-          <w:noProof/>
-          <w:sz w:val="20"/>
-        </w:rPr>
-        <w:t xml:space="preserve"> </w:t>
-      </w:r>
-    </w:p>
-    <w:p>
-      <w:pPr>
-        <w:widowControl/>
-        <w:spacing w:line="240" w:lineRule="auto"/>
-        <w:ind w:firstLine="0"/>
-        <w:jc w:val="left"/>
-        <w:rPr>
           <w:b/>
           <w:caps/>
           <w:lang w:val="en-US"/>
@@ -18316,22 +17332,34 @@
           <w:ilvl w:val="0"/>
           <w:numId w:val="22"/>
         </w:numPr>
-      </w:pPr>
-      <w:r>
-        <w:rPr>
-          <w:b/>
-          <w:bCs/>
+        <w:rPr/>
+      </w:pPr>
+      <w:r>
+        <w:rPr>
+          <w:b w:val="1"/>
+          <w:bCs w:val="1"/>
         </w:rPr>
         <w:t>Demanda Identificada</w:t>
       </w:r>
       <w:r>
+        <w:rPr/>
         <w:t>:</w:t>
       </w:r>
       <w:r>
+        <w:rPr/>
         <w:t xml:space="preserve"> </w:t>
       </w:r>
       <w:r>
-        <w:t>O crescimento do trabalho autônomo e informal no Brasil cresce cada vez mais e muitos profissionais não tem um controle total de todos seus serviços realizados por organizarem essas informações manualmente.</w:t>
+        <w:rPr/>
+        <w:t xml:space="preserve">O crescimento do trabalho autônomo e informal no Brasil cresce cada vez mais e muitos profissionais não </w:t>
+      </w:r>
+      <w:r>
+        <w:rPr/>
+        <w:t>têm</w:t>
+      </w:r>
+      <w:r>
+        <w:rPr/>
+        <w:t xml:space="preserve"> um controle total de todos seus serviços realizados por organizarem essas informações manualmente.</w:t>
       </w:r>
     </w:p>
     <w:p>
@@ -20706,74 +19734,241 @@
         <w:pStyle w:val="Figura"/>
       </w:pPr>
       <w:r>
+        <w:rPr/>
         <w:t xml:space="preserve">Fonte: Elaborado </w:t>
       </w:r>
       <w:r>
+        <w:rPr/>
         <w:t>pelos autores</w:t>
       </w:r>
       <w:r>
+        <w:rPr/>
         <w:t xml:space="preserve"> (202</w:t>
       </w:r>
       <w:r>
+        <w:rPr/>
         <w:t>6</w:t>
       </w:r>
       <w:r>
+        <w:rPr/>
         <w:t>)</w:t>
       </w:r>
       <w:r>
+        <w:rPr/>
         <w:t>.</w:t>
       </w:r>
     </w:p>
     <w:p>
       <w:pPr>
-        <w:widowControl/>
-        <w:spacing w:line="240" w:lineRule="auto"/>
+        <w:pStyle w:val="Figura"/>
+        <w:ind/>
+      </w:pPr>
+    </w:p>
+    <w:p>
+      <w:pPr>
+        <w:ind/>
+      </w:pPr>
+      <w:r>
+        <w:br w:type="page"/>
+      </w:r>
+    </w:p>
+    <w:p>
+      <w:pPr>
+        <w:pStyle w:val="Ttulo2"/>
+        <w:suppressLineNumbers w:val="0"/>
+        <w:bidi w:val="0"/>
+        <w:spacing w:before="0" w:beforeAutospacing="off" w:after="0" w:afterAutospacing="off" w:line="360" w:lineRule="auto"/>
+        <w:ind w:left="576" w:right="0" w:hanging="576"/>
+        <w:jc w:val="both"/>
+        <w:rPr>
+          <w:b w:val="0"/>
+          <w:bCs w:val="0"/>
+        </w:rPr>
+      </w:pPr>
+      <w:r>
+        <w:rPr>
+          <w:b w:val="0"/>
+          <w:bCs w:val="0"/>
+        </w:rPr>
+        <w:t>Wireframes</w:t>
+      </w:r>
+    </w:p>
+    <w:p>
+      <w:pPr>
+        <w:pStyle w:val="Normal"/>
+        <w:bidi w:val="0"/>
+      </w:pPr>
+    </w:p>
+    <w:p>
+      <w:pPr>
+        <w:pStyle w:val="Normal"/>
+        <w:ind/>
+      </w:pPr>
+      <w:r>
+        <w:rPr>
+          <w:rFonts w:ascii="Arial" w:hAnsi="Arial" w:eastAsia="Arial" w:cs="Arial"/>
+          <w:b w:val="0"/>
+          <w:bCs w:val="0"/>
+          <w:noProof w:val="0"/>
+          <w:sz w:val="24"/>
+          <w:szCs w:val="24"/>
+          <w:lang w:val="pt-BR"/>
+        </w:rPr>
+        <w:t xml:space="preserve">Os </w:t>
+      </w:r>
+      <w:r>
+        <w:rPr>
+          <w:rFonts w:ascii="Arial" w:hAnsi="Arial" w:eastAsia="Arial" w:cs="Arial"/>
+          <w:b w:val="0"/>
+          <w:bCs w:val="0"/>
+          <w:noProof w:val="0"/>
+          <w:sz w:val="24"/>
+          <w:szCs w:val="24"/>
+          <w:lang w:val="pt-BR"/>
+        </w:rPr>
+        <w:t>wireframes</w:t>
+      </w:r>
+      <w:r>
+        <w:rPr>
+          <w:rFonts w:ascii="Arial" w:hAnsi="Arial" w:eastAsia="Arial" w:cs="Arial"/>
+          <w:b w:val="0"/>
+          <w:bCs w:val="0"/>
+          <w:noProof w:val="0"/>
+          <w:sz w:val="24"/>
+          <w:szCs w:val="24"/>
+          <w:lang w:val="pt-BR"/>
+        </w:rPr>
+        <w:t xml:space="preserve"> foram desenvolvidos com o objetivo de definir a estrutura inicial das telas da aplicação, permitindo visualizar a disposição dos elementos e o fluxo de navegação antes da implementação visual definitiva. Essa etapa contribuiu para a organização das funcionalidades e para a validação da experiência do usuário, auxiliando na construção de interfaces mais intuitivas e alinhadas às necessidades dos profissionais autônomos.</w:t>
+      </w:r>
+    </w:p>
+    <w:p>
+      <w:pPr>
+        <w:pStyle w:val="Normal"/>
+        <w:ind/>
+        <w:rPr>
+          <w:rFonts w:ascii="Arial" w:hAnsi="Arial" w:eastAsia="Arial" w:cs="Arial"/>
+          <w:b w:val="0"/>
+          <w:bCs w:val="0"/>
+          <w:noProof w:val="0"/>
+          <w:sz w:val="24"/>
+          <w:szCs w:val="24"/>
+          <w:lang w:val="pt-BR"/>
+        </w:rPr>
+      </w:pPr>
+    </w:p>
+    <w:p>
+      <w:pPr>
+        <w:pStyle w:val="Normal"/>
+        <w:ind/>
+        <w:rPr>
+          <w:rFonts w:ascii="Arial" w:hAnsi="Arial" w:eastAsia="Arial" w:cs="Arial"/>
+          <w:b w:val="0"/>
+          <w:bCs w:val="0"/>
+          <w:noProof w:val="0"/>
+          <w:sz w:val="24"/>
+          <w:szCs w:val="24"/>
+          <w:lang w:val="pt-BR"/>
+        </w:rPr>
+      </w:pPr>
+    </w:p>
+    <w:p>
+      <w:pPr>
+        <w:pStyle w:val="Normal"/>
+        <w:ind/>
+        <w:rPr>
+          <w:rFonts w:ascii="Arial" w:hAnsi="Arial" w:eastAsia="Arial" w:cs="Arial"/>
+          <w:b w:val="0"/>
+          <w:bCs w:val="0"/>
+          <w:noProof w:val="0"/>
+          <w:sz w:val="24"/>
+          <w:szCs w:val="24"/>
+          <w:lang w:val="pt-BR"/>
+        </w:rPr>
+      </w:pPr>
+    </w:p>
+    <w:p>
+      <w:pPr>
+        <w:pStyle w:val="Ttulo2"/>
+        <w:suppressLineNumbers w:val="0"/>
+        <w:bidi w:val="0"/>
+        <w:spacing w:before="0" w:beforeAutospacing="off" w:after="0" w:afterAutospacing="off" w:line="360" w:lineRule="auto"/>
+        <w:ind w:left="576" w:right="0" w:hanging="576"/>
+        <w:jc w:val="both"/>
+        <w:rPr>
+          <w:b w:val="0"/>
+          <w:bCs w:val="0"/>
+        </w:rPr>
+      </w:pPr>
+      <w:r>
+        <w:rPr>
+          <w:b w:val="0"/>
+          <w:bCs w:val="0"/>
+        </w:rPr>
+        <w:t>Modelo de navegação</w:t>
+      </w:r>
+    </w:p>
+    <w:p>
+      <w:pPr>
+        <w:pStyle w:val="Normal"/>
+        <w:bidi w:val="0"/>
+      </w:pPr>
+    </w:p>
+    <w:p>
+      <w:pPr>
+        <w:pStyle w:val="Normal"/>
+        <w:ind/>
+      </w:pPr>
+      <w:r>
+        <w:rPr>
+          <w:rFonts w:ascii="Arial" w:hAnsi="Arial" w:eastAsia="Arial" w:cs="Arial"/>
+          <w:noProof w:val="0"/>
+          <w:sz w:val="24"/>
+          <w:szCs w:val="24"/>
+          <w:lang w:val="pt-BR"/>
+        </w:rPr>
+        <w:t>O modelo de navegação da plataforma DayPlannio foi projetado para proporcionar uma experiência intuitiva e organizada aos diferentes perfis de usuários do sistema. A navegação será estruturada de acordo com as funcionalidades disponíveis para cada tipo de acesso.</w:t>
+      </w:r>
+    </w:p>
+    <w:p>
+      <w:pPr>
+        <w:pStyle w:val="Normal"/>
         <w:ind w:firstLine="0"/>
-        <w:jc w:val="left"/>
-        <w:rPr>
-          <w:b/>
+        <w:rPr>
+          <w:rFonts w:ascii="Arial" w:hAnsi="Arial" w:eastAsia="Arial" w:cs="Arial"/>
+          <w:b w:val="0"/>
+          <w:bCs w:val="0"/>
+          <w:noProof w:val="0"/>
+          <w:sz w:val="24"/>
+          <w:szCs w:val="24"/>
+          <w:lang w:val="pt-BR"/>
         </w:rPr>
       </w:pPr>
     </w:p>
     <w:p>
       <w:pPr>
         <w:pStyle w:val="Figura"/>
+        <w:ind/>
         <w:jc w:val="both"/>
         <w:rPr>
           <w:sz w:val="24"/>
           <w:szCs w:val="24"/>
-          <w:lang w:val="en-US"/>
-        </w:rPr>
-      </w:pPr>
-    </w:p>
-    <w:p>
-      <w:pPr>
-        <w:pStyle w:val="Figura"/>
-      </w:pPr>
-    </w:p>
-    <w:p>
-      <w:pPr>
-        <w:pStyle w:val="Figura"/>
-      </w:pPr>
-      <w:bookmarkStart w:name="_Toc213311631" w:id="222"/>
-    </w:p>
-    <w:bookmarkEnd w:id="222"/>
-    <w:p>
-      <w:pPr>
-        <w:widowControl/>
-        <w:spacing w:line="240" w:lineRule="auto"/>
-        <w:jc w:val="left"/>
-        <w:rPr>
-          <w:b/>
-          <w:bCs/>
-          <w:sz w:val="32"/>
-          <w:szCs w:val="32"/>
-        </w:rPr>
-      </w:pPr>
-    </w:p>
-    <w:p>
-      <w:pPr>
-        <w:ind w:firstLine="0"/>
+        </w:rPr>
+      </w:pPr>
+    </w:p>
+    <w:p>
+      <w:pPr>
+        <w:pStyle w:val="Normal"/>
+        <w:ind/>
+      </w:pPr>
+    </w:p>
+    <w:p>
+      <w:r>
+        <w:br w:type="page"/>
+      </w:r>
+    </w:p>
+    <w:p>
+      <w:pPr>
+        <w:pStyle w:val="Normal"/>
       </w:pPr>
       <w:bookmarkStart w:name="_Toc165310890" w:id="223"/>
     </w:p>

</xml_diff>